<commit_message>
Explain utility workflows and numbered examples in the illustrated operator guide
</commit_message>
<xml_diff>
--- a/docs/BridGHe_Guida_operativa.docx
+++ b/docs/BridGHe_Guida_operativa.docx
@@ -647,6 +647,92 @@
           </w:p>
         </w:tc>
       </w:tr>
+      <w:tr>
+        <w:trPr>
+          <w:cantSplit/>
+        </w:trPr>
+        <w:tc>
+          <w:tcPr>
+            <w:tcW w:type="dxa" w:w="1440"/>
+            <w:vAlign w:val="center"/>
+            <w:tcMar>
+              <w:top w:w="75" w:type="dxa"/>
+              <w:bottom w:w="75" w:type="dxa"/>
+              <w:left w:w="100" w:type="dxa"/>
+              <w:right w:w="100" w:type="dxa"/>
+            </w:tcMar>
+            <w:shd w:fill="F2F5F7"/>
+          </w:tcPr>
+          <w:p>
+            <w:pPr>
+              <w:spacing w:after="0" w:line="247" w:lineRule="auto"/>
+              <w:jc w:val="center"/>
+            </w:pPr>
+            <w:r>
+              <w:rPr>
+                <w:b w:val="0"/>
+                <w:color w:val="000000"/>
+                <w:sz w:val="20"/>
+              </w:rPr>
+              <w:t>17–21</w:t>
+            </w:r>
+          </w:p>
+        </w:tc>
+        <w:tc>
+          <w:tcPr>
+            <w:tcW w:type="dxa" w:w="7416"/>
+            <w:vAlign w:val="center"/>
+            <w:tcMar>
+              <w:top w:w="75" w:type="dxa"/>
+              <w:bottom w:w="75" w:type="dxa"/>
+              <w:left w:w="100" w:type="dxa"/>
+              <w:right w:w="100" w:type="dxa"/>
+            </w:tcMar>
+            <w:shd w:fill="F2F5F7"/>
+          </w:tcPr>
+          <w:p>
+            <w:pPr>
+              <w:spacing w:after="0" w:line="247" w:lineRule="auto"/>
+              <w:jc w:val="left"/>
+            </w:pPr>
+            <w:r>
+              <w:rPr>
+                <w:b w:val="0"/>
+                <w:color w:val="000000"/>
+                <w:sz w:val="20"/>
+              </w:rPr>
+              <w:t>Nuovi strumenti operativi ed esempi 23–28</w:t>
+            </w:r>
+          </w:p>
+        </w:tc>
+        <w:tc>
+          <w:tcPr>
+            <w:tcW w:type="dxa" w:w="1138"/>
+            <w:vAlign w:val="center"/>
+            <w:tcMar>
+              <w:top w:w="75" w:type="dxa"/>
+              <w:bottom w:w="75" w:type="dxa"/>
+              <w:left w:w="100" w:type="dxa"/>
+              <w:right w:w="100" w:type="dxa"/>
+            </w:tcMar>
+            <w:shd w:fill="F2F5F7"/>
+          </w:tcPr>
+          <w:p>
+            <w:pPr>
+              <w:spacing w:after="0" w:line="247" w:lineRule="auto"/>
+              <w:jc w:val="center"/>
+            </w:pPr>
+            <w:r>
+              <w:rPr>
+                <w:b w:val="0"/>
+                <w:color w:val="000000"/>
+                <w:sz w:val="20"/>
+              </w:rPr>
+              <w:t>18–22</w:t>
+            </w:r>
+          </w:p>
+        </w:tc>
+      </w:tr>
     </w:tbl>
     <w:p>
       <w:pPr>
@@ -668,13 +754,13 @@
         <w:rPr>
           <w:b/>
         </w:rPr>
-        <w:t>Versione documentata:</w:t>
+        <w:t>Edizione aggiornata:</w:t>
       </w:r>
       <w:r>
         <w:rPr>
           <w:b w:val="0"/>
         </w:rPr>
-        <w:t xml:space="preserve"> codice df39615, 19 ottobre 2026. Le interfacce precedenti di Build BridGHe Model non sono compatibili con il workflow corrente. La guida distingue i controlli già eseguiti dalle nuove analisi Straus ancora da eseguire.</w:t>
+        <w:t xml:space="preserve"> 19 ottobre 2026, workflow REV003 e strumenti operativi 23–28. Le interfacce precedenti di Build BridGHe Model non sono compatibili con il workflow corrente. La guida distingue i controlli già eseguiti dalle nuove analisi Straus ancora da eseguire.</w:t>
       </w:r>
     </w:p>
     <w:p>
@@ -1329,7 +1415,7 @@
         <w:rPr>
           <w:b w:val="0"/>
         </w:rPr>
-        <w:t>Conservare nella cartella di lavoro definizione GHX, tabella delle combinazioni, modelli .st7 e risultati. Usare nomi diversi per ogni fase. La cartella bin/Release contiene il plugin installabile; obj contiene gli intermedi di compilazione e artifacts i risultati dei test.</w:t>
+        <w:t>Ogni esempio è in example, in una cartella numerata con README e, quando prevista, definizione GHX. La sottocartella calcoli contiene modelli .st7 e risultati; archivio conserva le revisioni precedenti. Usare file diversi per ogni fase. L’indice completo è example/README.md; bin/Release contiene il plugin installabile.</w:t>
       </w:r>
     </w:p>
     <w:p>
@@ -9719,13 +9805,13 @@
         <w:rPr>
           <w:b/>
         </w:rPr>
-        <w:t>examples/19-flusso-acciaio-misto/19-flusso-acciaio-misto_REV003.ghx</w:t>
+        <w:t>example/19-flusso-acciaio-misto/19-flusso-acciaio-misto_REV003.ghx</w:t>
       </w:r>
       <w:r>
         <w:rPr>
           <w:b w:val="0"/>
         </w:rPr>
-        <w:t>. Il file senza suffisso contiene la stessa definizione corrente. La nuova geometria non usa i risultati della precedente trave singola.</w:t>
+        <w:t>. Le revisioni precedenti e i relativi fogli Excel sono in archivio; i nuovi modelli Straus sono in calcoli. La nuova geometria non usa i risultati della precedente trave singola.</w:t>
       </w:r>
     </w:p>
     <w:tbl>
@@ -11361,7 +11447,7 @@
         <w:rPr>
           <w:b w:val="0"/>
         </w:rPr>
-        <w:t>La guida descrive il comportamento del codice e i risultati già registrati. La generazione del documento non esegue nuove analisi Straus. Lo stato seguente è riferito alla revisione df39615.</w:t>
+        <w:t>La Release con gli strumenti operativi 23–28 è stata compilata e sottoposta alle regressioni. Per i ponti 11–18 si riportano i replay già registrati; nessuna nuova analisi Straus è stata eseguita per questo aggiornamento.</w:t>
       </w:r>
     </w:p>
     <w:tbl>
@@ -11611,7 +11697,7 @@
                 <w:color w:val="000000"/>
                 <w:sz w:val="20"/>
               </w:rPr>
-              <w:t>190 controlli e 38 gruppi di regressione</w:t>
+              <w:t>202 controlli; 38 gruppi principali e 2 grafici</w:t>
             </w:r>
           </w:p>
         </w:tc>
@@ -12217,7 +12303,7 @@
         <w:rPr>
           <w:b w:val="0"/>
         </w:rPr>
-        <w:t xml:space="preserve"> examples/19-flusso-acciaio-misto/README.md e validation-REV003.json nella stessa cartella.</w:t>
+        <w:t xml:space="preserve"> example/19-flusso-acciaio-misto/README.md e validation-REV003.json nella stessa cartella.</w:t>
         <w:br/>
       </w:r>
       <w:r>
@@ -12230,7 +12316,7 @@
         <w:rPr>
           <w:b w:val="0"/>
         </w:rPr>
-        <w:t xml:space="preserve"> examples/validation/numbered-phases.json.</w:t>
+        <w:t xml:space="preserve"> example/00-documentazione/validazioni/numbered-phases.json.</w:t>
         <w:br/>
       </w:r>
       <w:r>
@@ -12252,6 +12338,2347 @@
           <w:b w:val="0"/>
         </w:rPr>
         <w:t>Per ricostruire i dettagli implementativi: BridgeWorkflowComponents.cs e BuildBridgeModel.cs in src/BridGHe.Grasshopper/Components/BridgeChecks. Questa guida non seleziona prescrizioni normative o coefficienti di progetto: documenta il trasferimento dei dati e i limiti del calcolo disponibile.</w:t>
+      </w:r>
+    </w:p>
+    <w:p>
+      <w:r>
+        <w:br w:type="page"/>
+      </w:r>
+    </w:p>
+    <w:p>
+      <w:pPr>
+        <w:pStyle w:val="Heading1"/>
+      </w:pPr>
+      <w:r>
+        <w:t>17  Controllare il modello e preparare una fase</w:t>
+      </w:r>
+    </w:p>
+    <w:p>
+      <w:r>
+        <w:rPr>
+          <w:b w:val="0"/>
+        </w:rPr>
+        <w:t xml:space="preserve">L’esempio </w:t>
+      </w:r>
+      <w:r>
+        <w:rPr>
+          <w:b/>
+        </w:rPr>
+        <w:t>23 audit modello fase</w:t>
+      </w:r>
+      <w:r>
+        <w:rPr>
+          <w:b w:val="0"/>
+        </w:rPr>
+        <w:t xml:space="preserve"> introduce Bridge Model Audit e Bridge Phase Model. I due componenti si collocano tra Build Model e l’analisi Straus. Il primo rende leggibili alcuni errori di input; il secondo crea una copia indipendente per il nuovo incremento.</w:t>
+      </w:r>
+    </w:p>
+    <w:p>
+      <w:pPr>
+        <w:pStyle w:val="Heading2"/>
+      </w:pPr>
+      <w:r>
+        <w:t>Bridge Model Audit</w:t>
+      </w:r>
+    </w:p>
+    <w:p>
+      <w:pPr>
+        <w:ind w:left="259" w:hanging="259"/>
+      </w:pPr>
+      <w:r>
+        <w:rPr>
+          <w:b w:val="0"/>
+        </w:rPr>
+      </w:r>
+      <w:r>
+        <w:rPr>
+          <w:b/>
+        </w:rPr>
+        <w:t>1.</w:t>
+      </w:r>
+      <w:r>
+        <w:rPr>
+          <w:b w:val="0"/>
+        </w:rPr>
+        <w:t xml:space="preserve"> Collegare il modello FEM a Model. Impostare Tolerance nelle unità di lunghezza del modello: in N–mm il valore è in mm. La tolleranza serve a riconoscere vertici coincidenti, non a correggere automaticamente la geometria.</w:t>
+      </w:r>
+    </w:p>
+    <w:p>
+      <w:pPr>
+        <w:ind w:left="259" w:hanging="259"/>
+      </w:pPr>
+      <w:r>
+        <w:rPr>
+          <w:b w:val="0"/>
+        </w:rPr>
+      </w:r>
+      <w:r>
+        <w:rPr>
+          <w:b/>
+        </w:rPr>
+        <w:t>2.</w:t>
+      </w:r>
+      <w:r>
+        <w:rPr>
+          <w:b w:val="0"/>
+        </w:rPr>
+        <w:t xml:space="preserve"> Leggere Severity, Code, Element e Description come colonne della stessa tabella. Gli errori comprendono identificativi vuoti o duplicati, beam con proprietà/geometria non valide e lunghezze inferiori alla tolleranza. I warning comprendono parti geometricamente disconnesse e nodi isolati.</w:t>
+      </w:r>
+    </w:p>
+    <w:p>
+      <w:pPr>
+        <w:ind w:left="259" w:hanging="259"/>
+      </w:pPr>
+      <w:r>
+        <w:rPr>
+          <w:b w:val="0"/>
+        </w:rPr>
+      </w:r>
+      <w:r>
+        <w:rPr>
+          <w:b/>
+        </w:rPr>
+        <w:t>3.</w:t>
+      </w:r>
+      <w:r>
+        <w:rPr>
+          <w:b w:val="0"/>
+        </w:rPr>
+        <w:t xml:space="preserve"> Usare No input errors come esito dei soli controlli elencati. Un modello con warning può restituire true. La stabilità, i rilasci, il rango della rigidezza, la qualità della mesh e la completezza delle azioni richiedono controlli distinti.</w:t>
+      </w:r>
+    </w:p>
+    <w:p>
+      <w:r>
+        <w:rPr>
+          <w:b w:val="0"/>
+        </w:rPr>
+        <w:t>La connessione geometrica usa estremi delle beam e vertici delle plate. Due aste che si incrociano internamente senza un nodo comune non risultano connesse. La presenza di un attributo di vincolo non dimostra che tutti i moti rigidi siano impediti.</w:t>
+      </w:r>
+    </w:p>
+    <w:p>
+      <w:pPr>
+        <w:pStyle w:val="Heading2"/>
+      </w:pPr>
+      <w:r>
+        <w:t>Bridge Phase Model</w:t>
+      </w:r>
+    </w:p>
+    <w:tbl>
+      <w:tblPr>
+        <w:tblW w:type="auto" w:w="0"/>
+        <w:jc w:val="center"/>
+        <w:tblLayout w:type="fixed"/>
+        <w:tblLook w:firstColumn="1" w:firstRow="1" w:lastColumn="0" w:lastRow="0" w:noHBand="0" w:noVBand="1" w:val="04A0"/>
+        <w:tblBorders>
+          <w:top w:val="single" w:sz="4" w:color="D9D9D9"/>
+          <w:left w:val="single" w:sz="4" w:color="D9D9D9"/>
+          <w:bottom w:val="single" w:sz="4" w:color="D9D9D9"/>
+          <w:right w:val="single" w:sz="4" w:color="D9D9D9"/>
+          <w:insideH w:val="single" w:sz="4" w:color="D9D9D9"/>
+          <w:insideV w:val="single" w:sz="4" w:color="D9D9D9"/>
+        </w:tblBorders>
+      </w:tblPr>
+      <w:tblGrid>
+        <w:gridCol w:w="2016"/>
+        <w:gridCol w:w="7978"/>
+      </w:tblGrid>
+      <w:tr>
+        <w:trPr>
+          <w:tblHeader/>
+          <w:cantSplit/>
+        </w:trPr>
+        <w:tc>
+          <w:tcPr>
+            <w:tcW w:type="dxa" w:w="2016"/>
+            <w:vAlign w:val="center"/>
+            <w:tcMar>
+              <w:top w:w="75" w:type="dxa"/>
+              <w:bottom w:w="75" w:type="dxa"/>
+              <w:left w:w="100" w:type="dxa"/>
+              <w:right w:w="100" w:type="dxa"/>
+            </w:tcMar>
+            <w:shd w:fill="24465F"/>
+          </w:tcPr>
+          <w:p>
+            <w:pPr>
+              <w:spacing w:after="0" w:line="247" w:lineRule="auto"/>
+              <w:jc w:val="left"/>
+            </w:pPr>
+            <w:r>
+              <w:rPr>
+                <w:b/>
+                <w:color w:val="FFFFFF"/>
+                <w:sz w:val="20"/>
+              </w:rPr>
+              <w:t>Ingresso</w:t>
+            </w:r>
+          </w:p>
+        </w:tc>
+        <w:tc>
+          <w:tcPr>
+            <w:tcW w:type="dxa" w:w="7978"/>
+            <w:vAlign w:val="center"/>
+            <w:tcMar>
+              <w:top w:w="75" w:type="dxa"/>
+              <w:bottom w:w="75" w:type="dxa"/>
+              <w:left w:w="100" w:type="dxa"/>
+              <w:right w:w="100" w:type="dxa"/>
+            </w:tcMar>
+            <w:shd w:fill="24465F"/>
+          </w:tcPr>
+          <w:p>
+            <w:pPr>
+              <w:spacing w:after="0" w:line="247" w:lineRule="auto"/>
+              <w:jc w:val="left"/>
+            </w:pPr>
+            <w:r>
+              <w:rPr>
+                <w:b/>
+                <w:color w:val="FFFFFF"/>
+                <w:sz w:val="20"/>
+              </w:rPr>
+              <w:t>Uso operativo</w:t>
+            </w:r>
+          </w:p>
+        </w:tc>
+      </w:tr>
+      <w:tr>
+        <w:trPr>
+          <w:cantSplit/>
+        </w:trPr>
+        <w:tc>
+          <w:tcPr>
+            <w:tcW w:type="dxa" w:w="2016"/>
+            <w:vAlign w:val="center"/>
+            <w:tcMar>
+              <w:top w:w="75" w:type="dxa"/>
+              <w:bottom w:w="75" w:type="dxa"/>
+              <w:left w:w="100" w:type="dxa"/>
+              <w:right w:w="100" w:type="dxa"/>
+            </w:tcMar>
+            <w:shd w:fill="FFFFFF"/>
+          </w:tcPr>
+          <w:p>
+            <w:pPr>
+              <w:spacing w:after="0" w:line="247" w:lineRule="auto"/>
+              <w:jc w:val="left"/>
+            </w:pPr>
+            <w:r>
+              <w:rPr>
+                <w:b w:val="0"/>
+                <w:color w:val="000000"/>
+                <w:sz w:val="20"/>
+              </w:rPr>
+              <w:t>Model e Name</w:t>
+            </w:r>
+          </w:p>
+        </w:tc>
+        <w:tc>
+          <w:tcPr>
+            <w:tcW w:type="dxa" w:w="7978"/>
+            <w:vAlign w:val="center"/>
+            <w:tcMar>
+              <w:top w:w="75" w:type="dxa"/>
+              <w:bottom w:w="75" w:type="dxa"/>
+              <w:left w:w="100" w:type="dxa"/>
+              <w:right w:w="100" w:type="dxa"/>
+            </w:tcMar>
+            <w:shd w:fill="FFFFFF"/>
+          </w:tcPr>
+          <w:p>
+            <w:pPr>
+              <w:spacing w:after="0" w:line="247" w:lineRule="auto"/>
+              <w:jc w:val="left"/>
+            </w:pPr>
+            <w:r>
+              <w:rPr>
+                <w:b w:val="0"/>
+                <w:color w:val="000000"/>
+                <w:sz w:val="20"/>
+              </w:rPr>
+              <w:t>Modello comune in acciaio e nome della nuova analisi</w:t>
+            </w:r>
+          </w:p>
+        </w:tc>
+      </w:tr>
+      <w:tr>
+        <w:trPr>
+          <w:cantSplit/>
+        </w:trPr>
+        <w:tc>
+          <w:tcPr>
+            <w:tcW w:type="dxa" w:w="2016"/>
+            <w:vAlign w:val="center"/>
+            <w:tcMar>
+              <w:top w:w="75" w:type="dxa"/>
+              <w:bottom w:w="75" w:type="dxa"/>
+              <w:left w:w="100" w:type="dxa"/>
+              <w:right w:w="100" w:type="dxa"/>
+            </w:tcMar>
+            <w:shd w:fill="F2F5F7"/>
+          </w:tcPr>
+          <w:p>
+            <w:pPr>
+              <w:spacing w:after="0" w:line="247" w:lineRule="auto"/>
+              <w:jc w:val="left"/>
+            </w:pPr>
+            <w:r>
+              <w:rPr>
+                <w:b w:val="0"/>
+                <w:color w:val="000000"/>
+                <w:sz w:val="20"/>
+              </w:rPr>
+              <w:t>Beam IDs</w:t>
+            </w:r>
+          </w:p>
+        </w:tc>
+        <w:tc>
+          <w:tcPr>
+            <w:tcW w:type="dxa" w:w="7978"/>
+            <w:vAlign w:val="center"/>
+            <w:tcMar>
+              <w:top w:w="75" w:type="dxa"/>
+              <w:bottom w:w="75" w:type="dxa"/>
+              <w:left w:w="100" w:type="dxa"/>
+              <w:right w:w="100" w:type="dxa"/>
+            </w:tcMar>
+            <w:shd w:fill="F2F5F7"/>
+          </w:tcPr>
+          <w:p>
+            <w:pPr>
+              <w:spacing w:after="0" w:line="247" w:lineRule="auto"/>
+              <w:jc w:val="left"/>
+            </w:pPr>
+            <w:r>
+              <w:rPr>
+                <w:b w:val="0"/>
+                <w:color w:val="000000"/>
+                <w:sz w:val="20"/>
+              </w:rPr>
+              <w:t>Selezione esplicita delle travi da rendere miste; non è ammessa una lista vuota</w:t>
+            </w:r>
+          </w:p>
+        </w:tc>
+      </w:tr>
+      <w:tr>
+        <w:trPr>
+          <w:cantSplit/>
+        </w:trPr>
+        <w:tc>
+          <w:tcPr>
+            <w:tcW w:type="dxa" w:w="2016"/>
+            <w:vAlign w:val="center"/>
+            <w:tcMar>
+              <w:top w:w="75" w:type="dxa"/>
+              <w:bottom w:w="75" w:type="dxa"/>
+              <w:left w:w="100" w:type="dxa"/>
+              <w:right w:w="100" w:type="dxa"/>
+            </w:tcMar>
+            <w:shd w:fill="FFFFFF"/>
+          </w:tcPr>
+          <w:p>
+            <w:pPr>
+              <w:spacing w:after="0" w:line="247" w:lineRule="auto"/>
+              <w:jc w:val="left"/>
+            </w:pPr>
+            <w:r>
+              <w:rPr>
+                <w:b w:val="0"/>
+                <w:color w:val="000000"/>
+                <w:sz w:val="20"/>
+              </w:rPr>
+              <w:t>Property</w:t>
+            </w:r>
+          </w:p>
+        </w:tc>
+        <w:tc>
+          <w:tcPr>
+            <w:tcW w:type="dxa" w:w="7978"/>
+            <w:vAlign w:val="center"/>
+            <w:tcMar>
+              <w:top w:w="75" w:type="dxa"/>
+              <w:bottom w:w="75" w:type="dxa"/>
+              <w:left w:w="100" w:type="dxa"/>
+              <w:right w:w="100" w:type="dxa"/>
+            </w:tcMar>
+            <w:shd w:fill="FFFFFF"/>
+          </w:tcPr>
+          <w:p>
+            <w:pPr>
+              <w:spacing w:after="0" w:line="247" w:lineRule="auto"/>
+              <w:jc w:val="left"/>
+            </w:pPr>
+            <w:r>
+              <w:rPr>
+                <w:b w:val="0"/>
+                <w:color w:val="000000"/>
+                <w:sz w:val="20"/>
+              </w:rPr>
+              <w:t>Beam Property della risposta n0, n infinito o n ritiro; unità coerenti con Model</w:t>
+            </w:r>
+          </w:p>
+        </w:tc>
+      </w:tr>
+      <w:tr>
+        <w:trPr>
+          <w:cantSplit/>
+        </w:trPr>
+        <w:tc>
+          <w:tcPr>
+            <w:tcW w:type="dxa" w:w="2016"/>
+            <w:vAlign w:val="center"/>
+            <w:tcMar>
+              <w:top w:w="75" w:type="dxa"/>
+              <w:bottom w:w="75" w:type="dxa"/>
+              <w:left w:w="100" w:type="dxa"/>
+              <w:right w:w="100" w:type="dxa"/>
+            </w:tcMar>
+            <w:shd w:fill="F2F5F7"/>
+          </w:tcPr>
+          <w:p>
+            <w:pPr>
+              <w:spacing w:after="0" w:line="247" w:lineRule="auto"/>
+              <w:jc w:val="left"/>
+            </w:pPr>
+            <w:r>
+              <w:rPr>
+                <w:b w:val="0"/>
+                <w:color w:val="000000"/>
+                <w:sz w:val="20"/>
+              </w:rPr>
+              <w:t>Clear loads</w:t>
+            </w:r>
+          </w:p>
+        </w:tc>
+        <w:tc>
+          <w:tcPr>
+            <w:tcW w:type="dxa" w:w="7978"/>
+            <w:vAlign w:val="center"/>
+            <w:tcMar>
+              <w:top w:w="75" w:type="dxa"/>
+              <w:bottom w:w="75" w:type="dxa"/>
+              <w:left w:w="100" w:type="dxa"/>
+              <w:right w:w="100" w:type="dxa"/>
+            </w:tcMar>
+            <w:shd w:fill="F2F5F7"/>
+          </w:tcPr>
+          <w:p>
+            <w:pPr>
+              <w:spacing w:after="0" w:line="247" w:lineRule="auto"/>
+              <w:jc w:val="left"/>
+            </w:pPr>
+            <w:r>
+              <w:rPr>
+                <w:b w:val="0"/>
+                <w:color w:val="000000"/>
+                <w:sz w:val="20"/>
+              </w:rPr>
+              <w:t>True: azzera carichi, casi e percorsi mobili. False: conserva i carichi del modello sorgente</w:t>
+            </w:r>
+          </w:p>
+        </w:tc>
+      </w:tr>
+    </w:tbl>
+    <w:p>
+      <w:pPr>
+        <w:spacing w:after="20" w:before="0" w:line="240" w:lineRule="auto"/>
+      </w:pPr>
+      <w:r>
+        <w:rPr>
+          <w:sz w:val="4"/>
+        </w:rPr>
+      </w:r>
+    </w:p>
+    <w:p>
+      <w:r>
+        <w:rPr>
+          <w:b w:val="0"/>
+        </w:rPr>
+        <w:t>La copia mantiene geometria, ID, vincoli e altri attributi. I risultati precedenti, le combinazioni e le ricette di fase vengono sempre cancellati perché riferiti all’analisi originaria. Solo le proprietà delle beam selezionate sono sostituite. La preview usa il nuovo modello e la relativa sezione fisica quando disponibile.</w:t>
+      </w:r>
+    </w:p>
+    <w:p>
+      <w:r>
+        <w:rPr>
+          <w:b w:val="0"/>
+        </w:rPr>
+      </w:r>
+      <w:r>
+        <w:rPr>
+          <w:b/>
+        </w:rPr>
+        <w:t>Sequenza:</w:t>
+      </w:r>
+      <w:r>
+        <w:rPr>
+          <w:b w:val="0"/>
+        </w:rPr>
+        <w:t xml:space="preserve"> acciaio → Audit → Phase Model → nuovi carichi incrementali → Straus → Bridge Action. Phase Model non trasferisce uno stato di deformazione da un’analisi all’altra e non esegue una costruzione per fasi globale. Nell’esempio 23 le due travi sono volutamente disconnesse: DISCONNECTED è atteso.</w:t>
+      </w:r>
+    </w:p>
+    <w:p>
+      <w:r>
+        <w:br w:type="page"/>
+      </w:r>
+    </w:p>
+    <w:p>
+      <w:pPr>
+        <w:pStyle w:val="Heading1"/>
+      </w:pPr>
+      <w:r>
+        <w:t>18  Leggere inviluppi e valori concomitanti</w:t>
+      </w:r>
+    </w:p>
+    <w:p>
+      <w:r>
+        <w:rPr>
+          <w:b w:val="0"/>
+        </w:rPr>
+        <w:t xml:space="preserve">L’esempio </w:t>
+      </w:r>
+      <w:r>
+        <w:rPr>
+          <w:b/>
+        </w:rPr>
+        <w:t>24 inviluppi concomitanti</w:t>
+      </w:r>
+      <w:r>
+        <w:rPr>
+          <w:b w:val="0"/>
+        </w:rPr>
+        <w:t xml:space="preserve"> mostra Bridge Result Cases e i tre inviluppi: Bridge Beam Envelope, Bridge Bearing Envelope e Bridge Displacement Envelope. Operano sui risultati già memorizzati nel modello; non lanciano Straus e non generano nuove combinazioni.</w:t>
+      </w:r>
+    </w:p>
+    <w:p>
+      <w:pPr>
+        <w:pStyle w:val="Heading2"/>
+      </w:pPr>
+      <w:r>
+        <w:t>Selezionare casi e grandezza</w:t>
+      </w:r>
+    </w:p>
+    <w:p>
+      <w:pPr>
+        <w:ind w:left="259" w:hanging="259"/>
+      </w:pPr>
+      <w:r>
+        <w:rPr>
+          <w:b w:val="0"/>
+        </w:rPr>
+      </w:r>
+      <w:r>
+        <w:rPr>
+          <w:b/>
+        </w:rPr>
+        <w:t>1.</w:t>
+      </w:r>
+      <w:r>
+        <w:rPr>
+          <w:b w:val="0"/>
+        </w:rPr>
+        <w:t xml:space="preserve"> Collegare il modello analizzato a Bridge Result Cases. Cases elenca i nomi effettivamente presenti nei risultati; le altre colonne riportano caso, passo, tipo e numero dei record. Un caso definito ma non analizzato non compare.</w:t>
+      </w:r>
+    </w:p>
+    <w:p>
+      <w:pPr>
+        <w:ind w:left="259" w:hanging="259"/>
+      </w:pPr>
+      <w:r>
+        <w:rPr>
+          <w:b w:val="0"/>
+        </w:rPr>
+      </w:r>
+      <w:r>
+        <w:rPr>
+          <w:b/>
+        </w:rPr>
+        <w:t>2.</w:t>
+      </w:r>
+      <w:r>
+        <w:rPr>
+          <w:b w:val="0"/>
+        </w:rPr>
+        <w:t xml:space="preserve"> Collegare Model all’inviluppo richiesto. Element IDs e Cases sono opzionali: vuoti selezionano tutti gli elementi del tipo richiesto e tutti i relativi casi disponibili. Selezionare gli appoggi esplicitamente per le reazioni. Ogni elemento selezionato deve avere risultati.</w:t>
+      </w:r>
+    </w:p>
+    <w:p>
+      <w:pPr>
+        <w:ind w:left="259" w:hanging="259"/>
+      </w:pPr>
+      <w:r>
+        <w:rPr>
+          <w:b w:val="0"/>
+        </w:rPr>
+      </w:r>
+      <w:r>
+        <w:rPr>
+          <w:b/>
+        </w:rPr>
+        <w:t>3.</w:t>
+      </w:r>
+      <w:r>
+        <w:rPr>
+          <w:b w:val="0"/>
+        </w:rPr>
+        <w:t xml:space="preserve"> Impostare Component secondo la tabella e Mode: 0 minimo, 1 massimo, 2 massimo valore assoluto. Mode=2 mantiene il segno del valore governante.</w:t>
+      </w:r>
+    </w:p>
+    <w:p>
+      <w:pPr>
+        <w:ind w:left="259" w:hanging="259"/>
+      </w:pPr>
+      <w:r>
+        <w:rPr>
+          <w:b w:val="0"/>
+        </w:rPr>
+      </w:r>
+      <w:r>
+        <w:rPr>
+          <w:b/>
+        </w:rPr>
+        <w:t>4.</w:t>
+      </w:r>
+      <w:r>
+        <w:rPr>
+          <w:b w:val="0"/>
+        </w:rPr>
+        <w:t xml:space="preserve"> Associare ciascuna riga di Value a Element ID, Station, Case, Step e Step type. Il ramo Concomitant con lo stesso indice contiene le sei componenti del medesimo campione governante.</w:t>
+      </w:r>
+    </w:p>
+    <w:tbl>
+      <w:tblPr>
+        <w:tblW w:type="auto" w:w="0"/>
+        <w:jc w:val="center"/>
+        <w:tblLayout w:type="fixed"/>
+        <w:tblLook w:firstColumn="1" w:firstRow="1" w:lastColumn="0" w:lastRow="0" w:noHBand="0" w:noVBand="1" w:val="04A0"/>
+        <w:tblBorders>
+          <w:top w:val="single" w:sz="4" w:color="D9D9D9"/>
+          <w:left w:val="single" w:sz="4" w:color="D9D9D9"/>
+          <w:bottom w:val="single" w:sz="4" w:color="D9D9D9"/>
+          <w:right w:val="single" w:sz="4" w:color="D9D9D9"/>
+          <w:insideH w:val="single" w:sz="4" w:color="D9D9D9"/>
+          <w:insideV w:val="single" w:sz="4" w:color="D9D9D9"/>
+        </w:tblBorders>
+      </w:tblPr>
+      <w:tblGrid>
+        <w:gridCol w:w="2664"/>
+        <w:gridCol w:w="3888"/>
+        <w:gridCol w:w="3442"/>
+      </w:tblGrid>
+      <w:tr>
+        <w:trPr>
+          <w:tblHeader/>
+          <w:cantSplit/>
+        </w:trPr>
+        <w:tc>
+          <w:tcPr>
+            <w:tcW w:type="dxa" w:w="2664"/>
+            <w:vAlign w:val="center"/>
+            <w:tcMar>
+              <w:top w:w="75" w:type="dxa"/>
+              <w:bottom w:w="75" w:type="dxa"/>
+              <w:left w:w="100" w:type="dxa"/>
+              <w:right w:w="100" w:type="dxa"/>
+            </w:tcMar>
+            <w:shd w:fill="24465F"/>
+          </w:tcPr>
+          <w:p>
+            <w:pPr>
+              <w:spacing w:after="0" w:line="247" w:lineRule="auto"/>
+              <w:jc w:val="left"/>
+            </w:pPr>
+            <w:r>
+              <w:rPr>
+                <w:b/>
+                <w:color w:val="FFFFFF"/>
+                <w:sz w:val="20"/>
+              </w:rPr>
+              <w:t>Componente</w:t>
+            </w:r>
+          </w:p>
+        </w:tc>
+        <w:tc>
+          <w:tcPr>
+            <w:tcW w:type="dxa" w:w="3888"/>
+            <w:vAlign w:val="center"/>
+            <w:tcMar>
+              <w:top w:w="75" w:type="dxa"/>
+              <w:bottom w:w="75" w:type="dxa"/>
+              <w:left w:w="100" w:type="dxa"/>
+              <w:right w:w="100" w:type="dxa"/>
+            </w:tcMar>
+            <w:shd w:fill="24465F"/>
+          </w:tcPr>
+          <w:p>
+            <w:pPr>
+              <w:spacing w:after="0" w:line="247" w:lineRule="auto"/>
+              <w:jc w:val="left"/>
+            </w:pPr>
+            <w:r>
+              <w:rPr>
+                <w:b/>
+                <w:color w:val="FFFFFF"/>
+                <w:sz w:val="20"/>
+              </w:rPr>
+              <w:t>Indici 0 1 2 3 4 5</w:t>
+            </w:r>
+          </w:p>
+        </w:tc>
+        <w:tc>
+          <w:tcPr>
+            <w:tcW w:type="dxa" w:w="3442"/>
+            <w:vAlign w:val="center"/>
+            <w:tcMar>
+              <w:top w:w="75" w:type="dxa"/>
+              <w:bottom w:w="75" w:type="dxa"/>
+              <w:left w:w="100" w:type="dxa"/>
+              <w:right w:w="100" w:type="dxa"/>
+            </w:tcMar>
+            <w:shd w:fill="24465F"/>
+          </w:tcPr>
+          <w:p>
+            <w:pPr>
+              <w:spacing w:after="0" w:line="247" w:lineRule="auto"/>
+              <w:jc w:val="left"/>
+            </w:pPr>
+            <w:r>
+              <w:rPr>
+                <w:b/>
+                <w:color w:val="FFFFFF"/>
+                <w:sz w:val="20"/>
+              </w:rPr>
+              <w:t>Riferimento</w:t>
+            </w:r>
+          </w:p>
+        </w:tc>
+      </w:tr>
+      <w:tr>
+        <w:trPr>
+          <w:cantSplit/>
+        </w:trPr>
+        <w:tc>
+          <w:tcPr>
+            <w:tcW w:type="dxa" w:w="2664"/>
+            <w:vAlign w:val="center"/>
+            <w:tcMar>
+              <w:top w:w="75" w:type="dxa"/>
+              <w:bottom w:w="75" w:type="dxa"/>
+              <w:left w:w="100" w:type="dxa"/>
+              <w:right w:w="100" w:type="dxa"/>
+            </w:tcMar>
+            <w:shd w:fill="FFFFFF"/>
+          </w:tcPr>
+          <w:p>
+            <w:pPr>
+              <w:spacing w:after="0" w:line="247" w:lineRule="auto"/>
+              <w:jc w:val="left"/>
+            </w:pPr>
+            <w:r>
+              <w:rPr>
+                <w:b w:val="0"/>
+                <w:color w:val="000000"/>
+                <w:sz w:val="20"/>
+              </w:rPr>
+              <w:t>Beam Envelope</w:t>
+            </w:r>
+          </w:p>
+        </w:tc>
+        <w:tc>
+          <w:tcPr>
+            <w:tcW w:type="dxa" w:w="3888"/>
+            <w:vAlign w:val="center"/>
+            <w:tcMar>
+              <w:top w:w="75" w:type="dxa"/>
+              <w:bottom w:w="75" w:type="dxa"/>
+              <w:left w:w="100" w:type="dxa"/>
+              <w:right w:w="100" w:type="dxa"/>
+            </w:tcMar>
+            <w:shd w:fill="FFFFFF"/>
+          </w:tcPr>
+          <w:p>
+            <w:pPr>
+              <w:spacing w:after="0" w:line="247" w:lineRule="auto"/>
+              <w:jc w:val="left"/>
+            </w:pPr>
+            <w:r>
+              <w:rPr>
+                <w:b w:val="0"/>
+                <w:color w:val="000000"/>
+                <w:sz w:val="20"/>
+              </w:rPr>
+              <w:t>N  V2  V3  T  M2  M3</w:t>
+            </w:r>
+          </w:p>
+        </w:tc>
+        <w:tc>
+          <w:tcPr>
+            <w:tcW w:type="dxa" w:w="3442"/>
+            <w:vAlign w:val="center"/>
+            <w:tcMar>
+              <w:top w:w="75" w:type="dxa"/>
+              <w:bottom w:w="75" w:type="dxa"/>
+              <w:left w:w="100" w:type="dxa"/>
+              <w:right w:w="100" w:type="dxa"/>
+            </w:tcMar>
+            <w:shd w:fill="FFFFFF"/>
+          </w:tcPr>
+          <w:p>
+            <w:pPr>
+              <w:spacing w:after="0" w:line="247" w:lineRule="auto"/>
+              <w:jc w:val="left"/>
+            </w:pPr>
+            <w:r>
+              <w:rPr>
+                <w:b w:val="0"/>
+                <w:color w:val="000000"/>
+                <w:sz w:val="20"/>
+              </w:rPr>
+              <w:t>Assi locali Straus</w:t>
+            </w:r>
+          </w:p>
+        </w:tc>
+      </w:tr>
+      <w:tr>
+        <w:trPr>
+          <w:cantSplit/>
+        </w:trPr>
+        <w:tc>
+          <w:tcPr>
+            <w:tcW w:type="dxa" w:w="2664"/>
+            <w:vAlign w:val="center"/>
+            <w:tcMar>
+              <w:top w:w="75" w:type="dxa"/>
+              <w:bottom w:w="75" w:type="dxa"/>
+              <w:left w:w="100" w:type="dxa"/>
+              <w:right w:w="100" w:type="dxa"/>
+            </w:tcMar>
+            <w:shd w:fill="F2F5F7"/>
+          </w:tcPr>
+          <w:p>
+            <w:pPr>
+              <w:spacing w:after="0" w:line="247" w:lineRule="auto"/>
+              <w:jc w:val="left"/>
+            </w:pPr>
+            <w:r>
+              <w:rPr>
+                <w:b w:val="0"/>
+                <w:color w:val="000000"/>
+                <w:sz w:val="20"/>
+              </w:rPr>
+              <w:t>Bearing Envelope</w:t>
+            </w:r>
+          </w:p>
+        </w:tc>
+        <w:tc>
+          <w:tcPr>
+            <w:tcW w:type="dxa" w:w="3888"/>
+            <w:vAlign w:val="center"/>
+            <w:tcMar>
+              <w:top w:w="75" w:type="dxa"/>
+              <w:bottom w:w="75" w:type="dxa"/>
+              <w:left w:w="100" w:type="dxa"/>
+              <w:right w:w="100" w:type="dxa"/>
+            </w:tcMar>
+            <w:shd w:fill="F2F5F7"/>
+          </w:tcPr>
+          <w:p>
+            <w:pPr>
+              <w:spacing w:after="0" w:line="247" w:lineRule="auto"/>
+              <w:jc w:val="left"/>
+            </w:pPr>
+            <w:r>
+              <w:rPr>
+                <w:b w:val="0"/>
+                <w:color w:val="000000"/>
+                <w:sz w:val="20"/>
+              </w:rPr>
+              <w:t>Fx  Fy  Fz  Mx  My  Mz</w:t>
+            </w:r>
+          </w:p>
+        </w:tc>
+        <w:tc>
+          <w:tcPr>
+            <w:tcW w:type="dxa" w:w="3442"/>
+            <w:vAlign w:val="center"/>
+            <w:tcMar>
+              <w:top w:w="75" w:type="dxa"/>
+              <w:bottom w:w="75" w:type="dxa"/>
+              <w:left w:w="100" w:type="dxa"/>
+              <w:right w:w="100" w:type="dxa"/>
+            </w:tcMar>
+            <w:shd w:fill="F2F5F7"/>
+          </w:tcPr>
+          <w:p>
+            <w:pPr>
+              <w:spacing w:after="0" w:line="247" w:lineRule="auto"/>
+              <w:jc w:val="left"/>
+            </w:pPr>
+            <w:r>
+              <w:rPr>
+                <w:b w:val="0"/>
+                <w:color w:val="000000"/>
+                <w:sz w:val="20"/>
+              </w:rPr>
+              <w:t>Assi globali</w:t>
+            </w:r>
+          </w:p>
+        </w:tc>
+      </w:tr>
+      <w:tr>
+        <w:trPr>
+          <w:cantSplit/>
+        </w:trPr>
+        <w:tc>
+          <w:tcPr>
+            <w:tcW w:type="dxa" w:w="2664"/>
+            <w:vAlign w:val="center"/>
+            <w:tcMar>
+              <w:top w:w="75" w:type="dxa"/>
+              <w:bottom w:w="75" w:type="dxa"/>
+              <w:left w:w="100" w:type="dxa"/>
+              <w:right w:w="100" w:type="dxa"/>
+            </w:tcMar>
+            <w:shd w:fill="FFFFFF"/>
+          </w:tcPr>
+          <w:p>
+            <w:pPr>
+              <w:spacing w:after="0" w:line="247" w:lineRule="auto"/>
+              <w:jc w:val="left"/>
+            </w:pPr>
+            <w:r>
+              <w:rPr>
+                <w:b w:val="0"/>
+                <w:color w:val="000000"/>
+                <w:sz w:val="20"/>
+              </w:rPr>
+              <w:t>Displacement Envelope</w:t>
+            </w:r>
+          </w:p>
+        </w:tc>
+        <w:tc>
+          <w:tcPr>
+            <w:tcW w:type="dxa" w:w="3888"/>
+            <w:vAlign w:val="center"/>
+            <w:tcMar>
+              <w:top w:w="75" w:type="dxa"/>
+              <w:bottom w:w="75" w:type="dxa"/>
+              <w:left w:w="100" w:type="dxa"/>
+              <w:right w:w="100" w:type="dxa"/>
+            </w:tcMar>
+            <w:shd w:fill="FFFFFF"/>
+          </w:tcPr>
+          <w:p>
+            <w:pPr>
+              <w:spacing w:after="0" w:line="247" w:lineRule="auto"/>
+              <w:jc w:val="left"/>
+            </w:pPr>
+            <w:r>
+              <w:rPr>
+                <w:b w:val="0"/>
+                <w:color w:val="000000"/>
+                <w:sz w:val="20"/>
+              </w:rPr>
+              <w:t>Ux  Uy  Uz  Rx  Ry  Rz</w:t>
+            </w:r>
+          </w:p>
+        </w:tc>
+        <w:tc>
+          <w:tcPr>
+            <w:tcW w:type="dxa" w:w="3442"/>
+            <w:vAlign w:val="center"/>
+            <w:tcMar>
+              <w:top w:w="75" w:type="dxa"/>
+              <w:bottom w:w="75" w:type="dxa"/>
+              <w:left w:w="100" w:type="dxa"/>
+              <w:right w:w="100" w:type="dxa"/>
+            </w:tcMar>
+            <w:shd w:fill="FFFFFF"/>
+          </w:tcPr>
+          <w:p>
+            <w:pPr>
+              <w:spacing w:after="0" w:line="247" w:lineRule="auto"/>
+              <w:jc w:val="left"/>
+            </w:pPr>
+            <w:r>
+              <w:rPr>
+                <w:b w:val="0"/>
+                <w:color w:val="000000"/>
+                <w:sz w:val="20"/>
+              </w:rPr>
+              <w:t>Assi globali; rotazioni rad</w:t>
+            </w:r>
+          </w:p>
+        </w:tc>
+      </w:tr>
+    </w:tbl>
+    <w:p>
+      <w:pPr>
+        <w:spacing w:after="20" w:before="0" w:line="240" w:lineRule="auto"/>
+      </w:pPr>
+      <w:r>
+        <w:rPr>
+          <w:sz w:val="4"/>
+        </w:rPr>
+      </w:r>
+    </w:p>
+    <w:p>
+      <w:r>
+        <w:rPr>
+          <w:b w:val="0"/>
+        </w:rPr>
+        <w:t>Le unità restano quelle del modello. In N–mm, forze e reazioni sono in N, momenti in Nmm e spostamenti in mm. Station è una distanza dal primo estremo della beam; eventuali stazioni normalizzate sono convertite usando la lunghezza dell’elemento. Per i nodi Station vale zero.</w:t>
+      </w:r>
+    </w:p>
+    <w:p>
+      <w:pPr>
+        <w:pStyle w:val="Heading2"/>
+      </w:pPr>
+      <w:r>
+        <w:t>Concomitanza e copertura</w:t>
+      </w:r>
+    </w:p>
+    <w:p>
+      <w:r>
+        <w:rPr>
+          <w:b w:val="0"/>
+        </w:rPr>
+        <w:t>Se governa M3 del caso Q, tutti gli altri valori di Concomitant provengono da Q allo stesso passo e alla stessa stazione. Non sono assemblati i massimi indipendenti di N, V e M. Step conserva l’identificatore disponibile: non è automaticamente una coordinata del veicolo.</w:t>
+      </w:r>
+    </w:p>
+    <w:p>
+      <w:r>
+        <w:rPr>
+          <w:b w:val="0"/>
+        </w:rPr>
+        <w:t>Coverage segnala i casi mancanti a una stazione. Non sono eseguite interpolazioni tra griglie di stazioni o passi diversi. Campioni duplicati, valori non finiti e selezioni inesistenti causano errore. L’esempio usa dati numerici controllati: Fz governante = −120 N e Uz governante = −10 mm; non rappresenta una nuova analisi strutturale.</w:t>
+      </w:r>
+    </w:p>
+    <w:p>
+      <w:r>
+        <w:br w:type="page"/>
+      </w:r>
+    </w:p>
+    <w:p>
+      <w:pPr>
+        <w:pStyle w:val="Heading1"/>
+      </w:pPr>
+      <w:r>
+        <w:t>19  Costruire combinazioni e incrementi di ritiro</w:t>
+      </w:r>
+    </w:p>
+    <w:p>
+      <w:pPr>
+        <w:pStyle w:val="Heading2"/>
+      </w:pPr>
+      <w:r>
+        <w:t>Bridge Phase Table</w:t>
+      </w:r>
+    </w:p>
+    <w:p>
+      <w:r>
+        <w:rPr>
+          <w:b w:val="0"/>
+        </w:rPr>
+        <w:t>Collegare la lista delle Bridge Phase a Phases. L’uscita Phases restituisce gli oggetti ordinati per Number. Le colonne mostrano numero, nome, giorno, stato della sezione, Action ID, comportamento, modello sorgente, caso e strain. Una fase di sola attivazione rimane visibile con Action ID vuoto.</w:t>
+      </w:r>
+    </w:p>
+    <w:p>
+      <w:r>
+        <w:rPr>
+          <w:b w:val="0"/>
+        </w:rPr>
+        <w:t>Il componente controlla unicità di numeri e identità, Action ID non duplicati e giorni non decrescenti quando assegnati. La corrispondenza effettiva di casi, geometrie e risultati resta verificata da Build BridGHe Model. Il giorno è un dato di sequenza, non un’integrazione automatica della viscosità.</w:t>
+      </w:r>
+    </w:p>
+    <w:p>
+      <w:pPr>
+        <w:pStyle w:val="Heading2"/>
+      </w:pPr>
+      <w:r>
+        <w:t>Bridge Action Combinations</w:t>
+      </w:r>
+    </w:p>
+    <w:p>
+      <w:pPr>
+        <w:ind w:left="259" w:hanging="259"/>
+      </w:pPr>
+      <w:r>
+        <w:rPr>
+          <w:b w:val="0"/>
+        </w:rPr>
+      </w:r>
+      <w:r>
+        <w:rPr>
+          <w:b/>
+        </w:rPr>
+        <w:t>1.</w:t>
+      </w:r>
+      <w:r>
+        <w:rPr>
+          <w:b w:val="0"/>
+        </w:rPr>
+        <w:t xml:space="preserve"> Collegare le fasi ordinate a Phases. Scrivere in Action IDs gli identificativi delle colonne che si vogliono assegnare, nell’ordine scelto.</w:t>
+      </w:r>
+    </w:p>
+    <w:p>
+      <w:pPr>
+        <w:ind w:left="259" w:hanging="259"/>
+      </w:pPr>
+      <w:r>
+        <w:rPr>
+          <w:b w:val="0"/>
+        </w:rPr>
+      </w:r>
+      <w:r>
+        <w:rPr>
+          <w:b/>
+        </w:rPr>
+        <w:t>2.</w:t>
+      </w:r>
+      <w:r>
+        <w:rPr>
+          <w:b w:val="0"/>
+        </w:rPr>
+        <w:t xml:space="preserve"> Fornire una lista Names e un albero Coefficients: un ramo per combinazione, un numero per Action ID. L’ordine dei nomi corrisponde all’ordine dei percorsi dei rami in Grasshopper.</w:t>
+      </w:r>
+    </w:p>
+    <w:p>
+      <w:pPr>
+        <w:ind w:left="259" w:hanging="259"/>
+      </w:pPr>
+      <w:r>
+        <w:rPr>
+          <w:b w:val="0"/>
+        </w:rPr>
+      </w:r>
+      <w:r>
+        <w:rPr>
+          <w:b/>
+        </w:rPr>
+        <w:t>3.</w:t>
+      </w:r>
+      <w:r>
+        <w:rPr>
+          <w:b w:val="0"/>
+        </w:rPr>
+        <w:t xml:space="preserve"> Collegare Table direttamente all’ingresso Combinations del Build. La prima riga contiene gli Action ID; le successive nomi e fattori. Non appiattire questo albero.</w:t>
+      </w:r>
+    </w:p>
+    <w:p>
+      <w:r>
+        <w:rPr>
+          <w:b w:val="0"/>
+        </w:rPr>
+        <w:t>Le azioni omesse ricevono zero e sono elencate in Omitted actions. I fattori devono essere finiti; nomi duplicati, ID sconosciuti e rami di lunghezza errata vengono rifiutati. La scelta normativa dei coefficienti e delle simultaneità rimane esplicita a carico dell’utente.</w:t>
+      </w:r>
+    </w:p>
+    <w:p>
+      <w:r>
+        <w:rPr>
+          <w:b w:val="0"/>
+        </w:rPr>
+        <w:t>Nell’</w:t>
+      </w:r>
+      <w:r>
+        <w:rPr>
+          <w:b/>
+        </w:rPr>
+        <w:t>esempio 25</w:t>
+      </w:r>
+      <w:r>
+        <w:rPr>
+          <w:b w:val="0"/>
+        </w:rPr>
+        <w:t>, le colonne CS,G1 e i valori 0.7,1 diventano una tabella ordinata G1,CS con 1,0.7. Il fattore CS scala l’intera azione di ritiro. L’esempio attiva Primary Only e quindi non comprende le forze secondarie da vincolo.</w:t>
+      </w:r>
+    </w:p>
+    <w:p>
+      <w:pPr>
+        <w:pStyle w:val="Heading2"/>
+      </w:pPr>
+      <w:r>
+        <w:t>Bridge Shrinkage Increments</w:t>
+      </w:r>
+    </w:p>
+    <w:p>
+      <w:r>
+        <w:rPr>
+          <w:b w:val="0"/>
+        </w:rPr>
+        <w:t>Nell’</w:t>
+      </w:r>
+      <w:r>
+        <w:rPr>
+          <w:b/>
+        </w:rPr>
+        <w:t>esempio 27</w:t>
+      </w:r>
+      <w:r>
+        <w:rPr>
+          <w:b w:val="0"/>
+        </w:rPr>
+        <w:t>, Days = 7,28,100 e Cumulative strain = −0.0001,−0.0002,−0.00025 producono Increment = −0.0001,−0.0001,−0.00005, con Initial strain = 0. Ogni valore va alla Bridge Shrinkage Action della stessa posizione temporale.</w:t>
+      </w:r>
+    </w:p>
+    <w:p>
+      <w:r>
+        <w:rPr>
+          <w:b w:val="0"/>
+        </w:rPr>
+        <w:t>La regola è Δεᵢ = εᵢ − εᵢ₋₁; per il primo valore si usa Initial strain. La somma deve coincidere con l’ultimo valore cumulativo meno quello iniziale. I giorni devono crescere strettamente; il ritiro cumulativo deve essere finito, negativo o nullo e non crescente. Un recupero di deformazione richiede un diverso modello di azione.</w:t>
+      </w:r>
+    </w:p>
+    <w:p>
+      <w:r>
+        <w:rPr>
+          <w:b w:val="0"/>
+        </w:rPr>
+        <w:t>Gli strain sono adimensionali: −200 µε corrispondono a −0.0002. Il componente converte una storia fornita dall’utente; non calcola una legge normativa di ritiro o viscosità e non modifica i risultati FEM.</w:t>
+      </w:r>
+    </w:p>
+    <w:p>
+      <w:r>
+        <w:br w:type="page"/>
+      </w:r>
+    </w:p>
+    <w:p>
+      <w:pPr>
+        <w:pStyle w:val="Heading1"/>
+      </w:pPr>
+      <w:r>
+        <w:t>20  Riepilogare le verifiche e confrontare analisi</w:t>
+      </w:r>
+    </w:p>
+    <w:p>
+      <w:pPr>
+        <w:pStyle w:val="Heading2"/>
+      </w:pPr>
+      <w:r>
+        <w:t>Bridge Check Summary</w:t>
+      </w:r>
+    </w:p>
+    <w:p>
+      <w:r>
+        <w:rPr>
+          <w:b w:val="0"/>
+        </w:rPr>
+        <w:t>L’</w:t>
+      </w:r>
+      <w:r>
+        <w:rPr>
+          <w:b/>
+        </w:rPr>
+        <w:t>esempio 26</w:t>
+      </w:r>
+      <w:r>
+        <w:rPr>
+          <w:b w:val="0"/>
+        </w:rPr>
+        <w:t xml:space="preserve"> collega Bridge Section Check al nuovo riepilogo. Results accetta i BridgeStressResult prodotti da Section Check, Super Element Check e Detail Check. Labels richiede una voce per risultato, per esempio G2/x=15000/SLS, in modo da mantenere tracciabili sezione e combinazione.</w:t>
+      </w:r>
+    </w:p>
+    <w:tbl>
+      <w:tblPr>
+        <w:tblW w:type="auto" w:w="0"/>
+        <w:jc w:val="center"/>
+        <w:tblLayout w:type="fixed"/>
+        <w:tblLook w:firstColumn="1" w:firstRow="1" w:lastColumn="0" w:lastRow="0" w:noHBand="0" w:noVBand="1" w:val="04A0"/>
+        <w:tblBorders>
+          <w:top w:val="single" w:sz="4" w:color="D9D9D9"/>
+          <w:left w:val="single" w:sz="4" w:color="D9D9D9"/>
+          <w:bottom w:val="single" w:sz="4" w:color="D9D9D9"/>
+          <w:right w:val="single" w:sz="4" w:color="D9D9D9"/>
+          <w:insideH w:val="single" w:sz="4" w:color="D9D9D9"/>
+          <w:insideV w:val="single" w:sz="4" w:color="D9D9D9"/>
+        </w:tblBorders>
+      </w:tblPr>
+      <w:tblGrid>
+        <w:gridCol w:w="3024"/>
+        <w:gridCol w:w="6970"/>
+      </w:tblGrid>
+      <w:tr>
+        <w:trPr>
+          <w:tblHeader/>
+          <w:cantSplit/>
+        </w:trPr>
+        <w:tc>
+          <w:tcPr>
+            <w:tcW w:type="dxa" w:w="3024"/>
+            <w:vAlign w:val="center"/>
+            <w:tcMar>
+              <w:top w:w="75" w:type="dxa"/>
+              <w:bottom w:w="75" w:type="dxa"/>
+              <w:left w:w="100" w:type="dxa"/>
+              <w:right w:w="100" w:type="dxa"/>
+            </w:tcMar>
+            <w:shd w:fill="24465F"/>
+          </w:tcPr>
+          <w:p>
+            <w:pPr>
+              <w:spacing w:after="0" w:line="247" w:lineRule="auto"/>
+              <w:jc w:val="left"/>
+            </w:pPr>
+            <w:r>
+              <w:rPr>
+                <w:b/>
+                <w:color w:val="FFFFFF"/>
+                <w:sz w:val="20"/>
+              </w:rPr>
+              <w:t>Uscita</w:t>
+            </w:r>
+          </w:p>
+        </w:tc>
+        <w:tc>
+          <w:tcPr>
+            <w:tcW w:type="dxa" w:w="6970"/>
+            <w:vAlign w:val="center"/>
+            <w:tcMar>
+              <w:top w:w="75" w:type="dxa"/>
+              <w:bottom w:w="75" w:type="dxa"/>
+              <w:left w:w="100" w:type="dxa"/>
+              <w:right w:w="100" w:type="dxa"/>
+            </w:tcMar>
+            <w:shd w:fill="24465F"/>
+          </w:tcPr>
+          <w:p>
+            <w:pPr>
+              <w:spacing w:after="0" w:line="247" w:lineRule="auto"/>
+              <w:jc w:val="left"/>
+            </w:pPr>
+            <w:r>
+              <w:rPr>
+                <w:b/>
+                <w:color w:val="FFFFFF"/>
+                <w:sz w:val="20"/>
+              </w:rPr>
+              <w:t>Interpretazione</w:t>
+            </w:r>
+          </w:p>
+        </w:tc>
+      </w:tr>
+      <w:tr>
+        <w:trPr>
+          <w:cantSplit/>
+        </w:trPr>
+        <w:tc>
+          <w:tcPr>
+            <w:tcW w:type="dxa" w:w="3024"/>
+            <w:vAlign w:val="center"/>
+            <w:tcMar>
+              <w:top w:w="75" w:type="dxa"/>
+              <w:bottom w:w="75" w:type="dxa"/>
+              <w:left w:w="100" w:type="dxa"/>
+              <w:right w:w="100" w:type="dxa"/>
+            </w:tcMar>
+            <w:shd w:fill="FFFFFF"/>
+          </w:tcPr>
+          <w:p>
+            <w:pPr>
+              <w:spacing w:after="0" w:line="247" w:lineRule="auto"/>
+              <w:jc w:val="left"/>
+            </w:pPr>
+            <w:r>
+              <w:rPr>
+                <w:b w:val="0"/>
+                <w:color w:val="000000"/>
+                <w:sz w:val="20"/>
+              </w:rPr>
+              <w:t>Label Phase Check</w:t>
+            </w:r>
+          </w:p>
+        </w:tc>
+        <w:tc>
+          <w:tcPr>
+            <w:tcW w:type="dxa" w:w="6970"/>
+            <w:vAlign w:val="center"/>
+            <w:tcMar>
+              <w:top w:w="75" w:type="dxa"/>
+              <w:bottom w:w="75" w:type="dxa"/>
+              <w:left w:w="100" w:type="dxa"/>
+              <w:right w:w="100" w:type="dxa"/>
+            </w:tcMar>
+            <w:shd w:fill="FFFFFF"/>
+          </w:tcPr>
+          <w:p>
+            <w:pPr>
+              <w:spacing w:after="0" w:line="247" w:lineRule="auto"/>
+              <w:jc w:val="left"/>
+            </w:pPr>
+            <w:r>
+              <w:rPr>
+                <w:b w:val="0"/>
+                <w:color w:val="000000"/>
+                <w:sz w:val="20"/>
+              </w:rPr>
+              <w:t>Identificano ogni controllo locale estratto dai risultati GPC</w:t>
+            </w:r>
+          </w:p>
+        </w:tc>
+      </w:tr>
+      <w:tr>
+        <w:trPr>
+          <w:cantSplit/>
+        </w:trPr>
+        <w:tc>
+          <w:tcPr>
+            <w:tcW w:type="dxa" w:w="3024"/>
+            <w:vAlign w:val="center"/>
+            <w:tcMar>
+              <w:top w:w="75" w:type="dxa"/>
+              <w:bottom w:w="75" w:type="dxa"/>
+              <w:left w:w="100" w:type="dxa"/>
+              <w:right w:w="100" w:type="dxa"/>
+            </w:tcMar>
+            <w:shd w:fill="F2F5F7"/>
+          </w:tcPr>
+          <w:p>
+            <w:pPr>
+              <w:spacing w:after="0" w:line="247" w:lineRule="auto"/>
+              <w:jc w:val="left"/>
+            </w:pPr>
+            <w:r>
+              <w:rPr>
+                <w:b w:val="0"/>
+                <w:color w:val="000000"/>
+                <w:sz w:val="20"/>
+              </w:rPr>
+              <w:t>Ratio Status Units Notes</w:t>
+            </w:r>
+          </w:p>
+        </w:tc>
+        <w:tc>
+          <w:tcPr>
+            <w:tcW w:type="dxa" w:w="6970"/>
+            <w:vAlign w:val="center"/>
+            <w:tcMar>
+              <w:top w:w="75" w:type="dxa"/>
+              <w:bottom w:w="75" w:type="dxa"/>
+              <w:left w:w="100" w:type="dxa"/>
+              <w:right w:w="100" w:type="dxa"/>
+            </w:tcMar>
+            <w:shd w:fill="F2F5F7"/>
+          </w:tcPr>
+          <w:p>
+            <w:pPr>
+              <w:spacing w:after="0" w:line="247" w:lineRule="auto"/>
+              <w:jc w:val="left"/>
+            </w:pPr>
+            <w:r>
+              <w:rPr>
+                <w:b w:val="0"/>
+                <w:color w:val="000000"/>
+                <w:sz w:val="20"/>
+              </w:rPr>
+              <w:t>Rapporto, stato, unità e note originali; le grandezze non vengono ricalcolate</w:t>
+            </w:r>
+          </w:p>
+        </w:tc>
+      </w:tr>
+      <w:tr>
+        <w:trPr>
+          <w:cantSplit/>
+        </w:trPr>
+        <w:tc>
+          <w:tcPr>
+            <w:tcW w:type="dxa" w:w="3024"/>
+            <w:vAlign w:val="center"/>
+            <w:tcMar>
+              <w:top w:w="75" w:type="dxa"/>
+              <w:bottom w:w="75" w:type="dxa"/>
+              <w:left w:w="100" w:type="dxa"/>
+              <w:right w:w="100" w:type="dxa"/>
+            </w:tcMar>
+            <w:shd w:fill="FFFFFF"/>
+          </w:tcPr>
+          <w:p>
+            <w:pPr>
+              <w:spacing w:after="0" w:line="247" w:lineRule="auto"/>
+              <w:jc w:val="left"/>
+            </w:pPr>
+            <w:r>
+              <w:rPr>
+                <w:b w:val="0"/>
+                <w:color w:val="000000"/>
+                <w:sz w:val="20"/>
+              </w:rPr>
+              <w:t>Maximum finite ratio</w:t>
+            </w:r>
+          </w:p>
+        </w:tc>
+        <w:tc>
+          <w:tcPr>
+            <w:tcW w:type="dxa" w:w="6970"/>
+            <w:vAlign w:val="center"/>
+            <w:tcMar>
+              <w:top w:w="75" w:type="dxa"/>
+              <w:bottom w:w="75" w:type="dxa"/>
+              <w:left w:w="100" w:type="dxa"/>
+              <w:right w:w="100" w:type="dxa"/>
+            </w:tcMar>
+            <w:shd w:fill="FFFFFF"/>
+          </w:tcPr>
+          <w:p>
+            <w:pPr>
+              <w:spacing w:after="0" w:line="247" w:lineRule="auto"/>
+              <w:jc w:val="left"/>
+            </w:pPr>
+            <w:r>
+              <w:rPr>
+                <w:b w:val="0"/>
+                <w:color w:val="000000"/>
+                <w:sz w:val="20"/>
+              </w:rPr>
+              <w:t>Massimo tra i rapporti numerici presenti; NaN se non ne esistono</w:t>
+            </w:r>
+          </w:p>
+        </w:tc>
+      </w:tr>
+      <w:tr>
+        <w:trPr>
+          <w:cantSplit/>
+        </w:trPr>
+        <w:tc>
+          <w:tcPr>
+            <w:tcW w:type="dxa" w:w="3024"/>
+            <w:vAlign w:val="center"/>
+            <w:tcMar>
+              <w:top w:w="75" w:type="dxa"/>
+              <w:bottom w:w="75" w:type="dxa"/>
+              <w:left w:w="100" w:type="dxa"/>
+              <w:right w:w="100" w:type="dxa"/>
+            </w:tcMar>
+            <w:shd w:fill="F2F5F7"/>
+          </w:tcPr>
+          <w:p>
+            <w:pPr>
+              <w:spacing w:after="0" w:line="247" w:lineRule="auto"/>
+              <w:jc w:val="left"/>
+            </w:pPr>
+            <w:r>
+              <w:rPr>
+                <w:b w:val="0"/>
+                <w:color w:val="000000"/>
+                <w:sz w:val="20"/>
+              </w:rPr>
+              <w:t>Unavailable ratios</w:t>
+            </w:r>
+          </w:p>
+        </w:tc>
+        <w:tc>
+          <w:tcPr>
+            <w:tcW w:type="dxa" w:w="6970"/>
+            <w:vAlign w:val="center"/>
+            <w:tcMar>
+              <w:top w:w="75" w:type="dxa"/>
+              <w:bottom w:w="75" w:type="dxa"/>
+              <w:left w:w="100" w:type="dxa"/>
+              <w:right w:w="100" w:type="dxa"/>
+            </w:tcMar>
+            <w:shd w:fill="F2F5F7"/>
+          </w:tcPr>
+          <w:p>
+            <w:pPr>
+              <w:spacing w:after="0" w:line="247" w:lineRule="auto"/>
+              <w:jc w:val="left"/>
+            </w:pPr>
+            <w:r>
+              <w:rPr>
+                <w:b w:val="0"/>
+                <w:color w:val="000000"/>
+                <w:sz w:val="20"/>
+              </w:rPr>
+              <w:t>Numero dei rapporti mancanti o non finiti da interpretare tramite stato e note</w:t>
+            </w:r>
+          </w:p>
+        </w:tc>
+      </w:tr>
+      <w:tr>
+        <w:trPr>
+          <w:cantSplit/>
+        </w:trPr>
+        <w:tc>
+          <w:tcPr>
+            <w:tcW w:type="dxa" w:w="3024"/>
+            <w:vAlign w:val="center"/>
+            <w:tcMar>
+              <w:top w:w="75" w:type="dxa"/>
+              <w:bottom w:w="75" w:type="dxa"/>
+              <w:left w:w="100" w:type="dxa"/>
+              <w:right w:w="100" w:type="dxa"/>
+            </w:tcMar>
+            <w:shd w:fill="FFFFFF"/>
+          </w:tcPr>
+          <w:p>
+            <w:pPr>
+              <w:spacing w:after="0" w:line="247" w:lineRule="auto"/>
+              <w:jc w:val="left"/>
+            </w:pPr>
+            <w:r>
+              <w:rPr>
+                <w:b w:val="0"/>
+                <w:color w:val="000000"/>
+                <w:sz w:val="20"/>
+              </w:rPr>
+              <w:t>Governing labels</w:t>
+            </w:r>
+          </w:p>
+        </w:tc>
+        <w:tc>
+          <w:tcPr>
+            <w:tcW w:type="dxa" w:w="6970"/>
+            <w:vAlign w:val="center"/>
+            <w:tcMar>
+              <w:top w:w="75" w:type="dxa"/>
+              <w:bottom w:w="75" w:type="dxa"/>
+              <w:left w:w="100" w:type="dxa"/>
+              <w:right w:w="100" w:type="dxa"/>
+            </w:tcMar>
+            <w:shd w:fill="FFFFFF"/>
+          </w:tcPr>
+          <w:p>
+            <w:pPr>
+              <w:spacing w:after="0" w:line="247" w:lineRule="auto"/>
+              <w:jc w:val="left"/>
+            </w:pPr>
+            <w:r>
+              <w:rPr>
+                <w:b w:val="0"/>
+                <w:color w:val="000000"/>
+                <w:sz w:val="20"/>
+              </w:rPr>
+              <w:t>Tutte le righe che raggiungono il massimo rapporto finito</w:t>
+            </w:r>
+          </w:p>
+        </w:tc>
+      </w:tr>
+    </w:tbl>
+    <w:p>
+      <w:pPr>
+        <w:spacing w:after="20" w:before="0" w:line="240" w:lineRule="auto"/>
+      </w:pPr>
+      <w:r>
+        <w:rPr>
+          <w:sz w:val="4"/>
+        </w:rPr>
+      </w:r>
+    </w:p>
+    <w:p>
+      <w:r>
+        <w:rPr>
+          <w:b w:val="0"/>
+        </w:rPr>
+        <w:t>Una verifica non eseguita non vale zero. Anche con Maximum finite ratio inferiore a uno possono esistere controlli mancanti, fuori campo o da svolgere separatamente. Il riepilogo espone i controlli locali disponibili di taglio, connessione e torsione; non produce da solo un giudizio complessivo sul ponte.</w:t>
+      </w:r>
+    </w:p>
+    <w:p>
+      <w:pPr>
+        <w:pStyle w:val="Heading2"/>
+      </w:pPr>
+      <w:r>
+        <w:t>Bridge Result Comparison</w:t>
+      </w:r>
+    </w:p>
+    <w:p>
+      <w:r>
+        <w:rPr>
+          <w:b w:val="0"/>
+        </w:rPr>
+        <w:t>Per confrontare revisioni o discretizzazioni, campionare prima le stesse grandezze nelle stesse posizioni fisiche. Reference keys e Candidate keys devono contenere chiavi univoche uguali, anche in ordine diverso; i due elenchi Values devono avere le stesse unità.</w:t>
+      </w:r>
+    </w:p>
+    <w:p>
+      <w:r>
+        <w:rPr>
+          <w:b w:val="0"/>
+        </w:rPr>
+        <w:t xml:space="preserve">Il criterio applicato a ogni chiave è </w:t>
+      </w:r>
+      <w:r>
+        <w:rPr>
+          <w:b/>
+        </w:rPr>
+        <w:t>|c − r| ≤ Abs + Rel · |r|</w:t>
+      </w:r>
+      <w:r>
+        <w:rPr>
+          <w:b w:val="0"/>
+        </w:rPr>
+        <w:t>, con r riferimento e c candidato. Abs ha le unità della grandezza; Rel è adimensionale. Per grandezze con unità diverse usare componenti separati o tolleranze opportunamente normalizzate.</w:t>
+      </w:r>
+    </w:p>
+    <w:p>
+      <w:r>
+        <w:rPr>
+          <w:b w:val="0"/>
+        </w:rPr>
+        <w:t>Difference = c − r. Relative difference = (c − r)/|r|; se r = 0 e la differenza non è nulla, l’uscita relativa è NaN e il confronto usa la tolleranza assoluta. Chiavi mancanti, duplicati e numeri non finiti causano errore.</w:t>
+      </w:r>
+    </w:p>
+    <w:p>
+      <w:r>
+        <w:rPr>
+          <w:b w:val="0"/>
+        </w:rPr>
+        <w:t>Nell’</w:t>
+      </w:r>
+      <w:r>
+        <w:rPr>
+          <w:b/>
+        </w:rPr>
+        <w:t>esempio 27</w:t>
+      </w:r>
+      <w:r>
+        <w:rPr>
+          <w:b w:val="0"/>
+        </w:rPr>
+        <w:t>, gli spostamenti −10 e −20 mm vengono confrontati con −10.02 e −20.1 mm, presentati in ordine invertito. Entrambi passano con Rel = 0.01 e Abs = 0.000001 mm. Questo controllo non genera mesh né dimostra da solo la convergenza: per uno studio occorrono più raffinamenti e grandezze fisiche confrontabili.</w:t>
+      </w:r>
+    </w:p>
+    <w:p>
+      <w:r>
+        <w:br w:type="page"/>
+      </w:r>
+    </w:p>
+    <w:p>
+      <w:pPr>
+        <w:pStyle w:val="Heading1"/>
+      </w:pPr>
+      <w:r>
+        <w:t>21  Preparare le corsie e riprodurre gli esempi</w:t>
+      </w:r>
+    </w:p>
+    <w:p>
+      <w:pPr>
+        <w:pStyle w:val="Heading2"/>
+      </w:pPr>
+      <w:r>
+        <w:t>Bridge Moving Lanes</w:t>
+      </w:r>
+    </w:p>
+    <w:p>
+      <w:r>
+        <w:rPr>
+          <w:b w:val="0"/>
+        </w:rPr>
+        <w:t>L’</w:t>
+      </w:r>
+      <w:r>
+        <w:rPr>
+          <w:b/>
+        </w:rPr>
+        <w:t>esempio 28</w:t>
+      </w:r>
+      <w:r>
+        <w:rPr>
+          <w:b w:val="0"/>
+        </w:rPr>
+        <w:t xml:space="preserve"> prepara tre percorsi rettilinei a partire da un unico Moving Load Path. Collegare il prototipo a Prototype, gli scostamenti trasversali a Offsets e un nome di caso univoco per ogni percorso a Cases.</w:t>
+      </w:r>
+    </w:p>
+    <w:p>
+      <w:pPr>
+        <w:ind w:left="259" w:hanging="259"/>
+      </w:pPr>
+      <w:r>
+        <w:rPr>
+          <w:b w:val="0"/>
+        </w:rPr>
+      </w:r>
+      <w:r>
+        <w:rPr>
+          <w:b/>
+        </w:rPr>
+        <w:t>1.</w:t>
+      </w:r>
+      <w:r>
+        <w:rPr>
+          <w:b w:val="0"/>
+        </w:rPr>
+        <w:t xml:space="preserve"> Impostare nel prototipo veicolo, template, target, numero di divisioni e conversione in casi statici. Questi dati vengono copiati indipendentemente in ciascun percorso.</w:t>
+      </w:r>
+    </w:p>
+    <w:p>
+      <w:pPr>
+        <w:ind w:left="259" w:hanging="259"/>
+      </w:pPr>
+      <w:r>
+        <w:rPr>
+          <w:b w:val="0"/>
+        </w:rPr>
+      </w:r>
+      <w:r>
+        <w:rPr>
+          <w:b/>
+        </w:rPr>
+        <w:t>2.</w:t>
+      </w:r>
+      <w:r>
+        <w:rPr>
+          <w:b w:val="0"/>
+        </w:rPr>
+        <w:t xml:space="preserve"> Fornire offsets distinti e finiti nelle unità del modello. Il verso positivo è quello del terzo punto del prototipo, proiettato perpendicolarmente all’asse rettilineo.</w:t>
+      </w:r>
+    </w:p>
+    <w:p>
+      <w:pPr>
+        <w:ind w:left="259" w:hanging="259"/>
+      </w:pPr>
+      <w:r>
+        <w:rPr>
+          <w:b w:val="0"/>
+        </w:rPr>
+      </w:r>
+      <w:r>
+        <w:rPr>
+          <w:b/>
+        </w:rPr>
+        <w:t>3.</w:t>
+      </w:r>
+      <w:r>
+        <w:rPr>
+          <w:b w:val="0"/>
+        </w:rPr>
+        <w:t xml:space="preserve"> Collegare Paths ad Attach Moving Paths e controllare la preview. Procedere con Moving Static Analysis sul modello desiderato; la creazione dei percorsi non avvia il solutore.</w:t>
+      </w:r>
+    </w:p>
+    <w:p>
+      <w:r>
+        <w:rPr>
+          <w:b w:val="0"/>
+        </w:rPr>
+        <w:t>Il componente genera percorsi indipendenti, non coefficienti di corsia o simultaneità normative. Per percorsi curvi usare le definizioni individuali di Moving Load Path: una semplice traslazione non crea automaticamente corsie concentriche. L’esempio assegna un veicolo dimostrativo da 100 kN su 20 m, con offsets −3, 0 e +3 m.</w:t>
+      </w:r>
+    </w:p>
+    <w:p>
+      <w:pPr>
+        <w:pStyle w:val="Heading2"/>
+      </w:pPr>
+      <w:r>
+        <w:t>Cartelle e verifiche riproducibili</w:t>
+      </w:r>
+    </w:p>
+    <w:tbl>
+      <w:tblPr>
+        <w:tblW w:type="auto" w:w="0"/>
+        <w:jc w:val="center"/>
+        <w:tblLayout w:type="fixed"/>
+        <w:tblLook w:firstColumn="1" w:firstRow="1" w:lastColumn="0" w:lastRow="0" w:noHBand="0" w:noVBand="1" w:val="04A0"/>
+        <w:tblBorders>
+          <w:top w:val="single" w:sz="4" w:color="D9D9D9"/>
+          <w:left w:val="single" w:sz="4" w:color="D9D9D9"/>
+          <w:bottom w:val="single" w:sz="4" w:color="D9D9D9"/>
+          <w:right w:val="single" w:sz="4" w:color="D9D9D9"/>
+          <w:insideH w:val="single" w:sz="4" w:color="D9D9D9"/>
+          <w:insideV w:val="single" w:sz="4" w:color="D9D9D9"/>
+        </w:tblBorders>
+      </w:tblPr>
+      <w:tblGrid>
+        <w:gridCol w:w="2995"/>
+        <w:gridCol w:w="6998"/>
+      </w:tblGrid>
+      <w:tr>
+        <w:trPr>
+          <w:tblHeader/>
+          <w:cantSplit/>
+        </w:trPr>
+        <w:tc>
+          <w:tcPr>
+            <w:tcW w:type="dxa" w:w="2995"/>
+            <w:vAlign w:val="center"/>
+            <w:tcMar>
+              <w:top w:w="75" w:type="dxa"/>
+              <w:bottom w:w="75" w:type="dxa"/>
+              <w:left w:w="100" w:type="dxa"/>
+              <w:right w:w="100" w:type="dxa"/>
+            </w:tcMar>
+            <w:shd w:fill="24465F"/>
+          </w:tcPr>
+          <w:p>
+            <w:pPr>
+              <w:spacing w:after="0" w:line="247" w:lineRule="auto"/>
+              <w:jc w:val="left"/>
+            </w:pPr>
+            <w:r>
+              <w:rPr>
+                <w:b/>
+                <w:color w:val="FFFFFF"/>
+                <w:sz w:val="20"/>
+              </w:rPr>
+              <w:t>Esempio</w:t>
+            </w:r>
+          </w:p>
+        </w:tc>
+        <w:tc>
+          <w:tcPr>
+            <w:tcW w:type="dxa" w:w="6998"/>
+            <w:vAlign w:val="center"/>
+            <w:tcMar>
+              <w:top w:w="75" w:type="dxa"/>
+              <w:bottom w:w="75" w:type="dxa"/>
+              <w:left w:w="100" w:type="dxa"/>
+              <w:right w:w="100" w:type="dxa"/>
+            </w:tcMar>
+            <w:shd w:fill="24465F"/>
+          </w:tcPr>
+          <w:p>
+            <w:pPr>
+              <w:spacing w:after="0" w:line="247" w:lineRule="auto"/>
+              <w:jc w:val="left"/>
+            </w:pPr>
+            <w:r>
+              <w:rPr>
+                <w:b/>
+                <w:color w:val="FFFFFF"/>
+                <w:sz w:val="20"/>
+              </w:rPr>
+              <w:t>Componenti e controlli</w:t>
+            </w:r>
+          </w:p>
+        </w:tc>
+      </w:tr>
+      <w:tr>
+        <w:trPr>
+          <w:cantSplit/>
+        </w:trPr>
+        <w:tc>
+          <w:tcPr>
+            <w:tcW w:type="dxa" w:w="2995"/>
+            <w:vAlign w:val="center"/>
+            <w:tcMar>
+              <w:top w:w="75" w:type="dxa"/>
+              <w:bottom w:w="75" w:type="dxa"/>
+              <w:left w:w="100" w:type="dxa"/>
+              <w:right w:w="100" w:type="dxa"/>
+            </w:tcMar>
+            <w:shd w:fill="FFFFFF"/>
+          </w:tcPr>
+          <w:p>
+            <w:pPr>
+              <w:spacing w:after="0" w:line="247" w:lineRule="auto"/>
+              <w:jc w:val="left"/>
+            </w:pPr>
+            <w:r>
+              <w:rPr>
+                <w:b w:val="0"/>
+                <w:color w:val="000000"/>
+                <w:sz w:val="20"/>
+              </w:rPr>
+              <w:t>23 audit modello fase</w:t>
+            </w:r>
+          </w:p>
+        </w:tc>
+        <w:tc>
+          <w:tcPr>
+            <w:tcW w:type="dxa" w:w="6998"/>
+            <w:vAlign w:val="center"/>
+            <w:tcMar>
+              <w:top w:w="75" w:type="dxa"/>
+              <w:bottom w:w="75" w:type="dxa"/>
+              <w:left w:w="100" w:type="dxa"/>
+              <w:right w:w="100" w:type="dxa"/>
+            </w:tcMar>
+            <w:shd w:fill="FFFFFF"/>
+          </w:tcPr>
+          <w:p>
+            <w:pPr>
+              <w:spacing w:after="0" w:line="247" w:lineRule="auto"/>
+              <w:jc w:val="left"/>
+            </w:pPr>
+            <w:r>
+              <w:rPr>
+                <w:b w:val="0"/>
+                <w:color w:val="000000"/>
+                <w:sz w:val="20"/>
+              </w:rPr>
+              <w:t>Diagnostica e copia con invalidazione dei risultati</w:t>
+            </w:r>
+          </w:p>
+        </w:tc>
+      </w:tr>
+      <w:tr>
+        <w:trPr>
+          <w:cantSplit/>
+        </w:trPr>
+        <w:tc>
+          <w:tcPr>
+            <w:tcW w:type="dxa" w:w="2995"/>
+            <w:vAlign w:val="center"/>
+            <w:tcMar>
+              <w:top w:w="75" w:type="dxa"/>
+              <w:bottom w:w="75" w:type="dxa"/>
+              <w:left w:w="100" w:type="dxa"/>
+              <w:right w:w="100" w:type="dxa"/>
+            </w:tcMar>
+            <w:shd w:fill="F2F5F7"/>
+          </w:tcPr>
+          <w:p>
+            <w:pPr>
+              <w:spacing w:after="0" w:line="247" w:lineRule="auto"/>
+              <w:jc w:val="left"/>
+            </w:pPr>
+            <w:r>
+              <w:rPr>
+                <w:b w:val="0"/>
+                <w:color w:val="000000"/>
+                <w:sz w:val="20"/>
+              </w:rPr>
+              <w:t>24 inviluppi concomitanti</w:t>
+            </w:r>
+          </w:p>
+        </w:tc>
+        <w:tc>
+          <w:tcPr>
+            <w:tcW w:type="dxa" w:w="6998"/>
+            <w:vAlign w:val="center"/>
+            <w:tcMar>
+              <w:top w:w="75" w:type="dxa"/>
+              <w:bottom w:w="75" w:type="dxa"/>
+              <w:left w:w="100" w:type="dxa"/>
+              <w:right w:w="100" w:type="dxa"/>
+            </w:tcMar>
+            <w:shd w:fill="F2F5F7"/>
+          </w:tcPr>
+          <w:p>
+            <w:pPr>
+              <w:spacing w:after="0" w:line="247" w:lineRule="auto"/>
+              <w:jc w:val="left"/>
+            </w:pPr>
+            <w:r>
+              <w:rPr>
+                <w:b w:val="0"/>
+                <w:color w:val="000000"/>
+                <w:sz w:val="20"/>
+              </w:rPr>
+              <w:t>Catalogo casi, forze, reazioni e spostamenti</w:t>
+            </w:r>
+          </w:p>
+        </w:tc>
+      </w:tr>
+      <w:tr>
+        <w:trPr>
+          <w:cantSplit/>
+        </w:trPr>
+        <w:tc>
+          <w:tcPr>
+            <w:tcW w:type="dxa" w:w="2995"/>
+            <w:vAlign w:val="center"/>
+            <w:tcMar>
+              <w:top w:w="75" w:type="dxa"/>
+              <w:bottom w:w="75" w:type="dxa"/>
+              <w:left w:w="100" w:type="dxa"/>
+              <w:right w:w="100" w:type="dxa"/>
+            </w:tcMar>
+            <w:shd w:fill="FFFFFF"/>
+          </w:tcPr>
+          <w:p>
+            <w:pPr>
+              <w:spacing w:after="0" w:line="247" w:lineRule="auto"/>
+              <w:jc w:val="left"/>
+            </w:pPr>
+            <w:r>
+              <w:rPr>
+                <w:b w:val="0"/>
+                <w:color w:val="000000"/>
+                <w:sz w:val="20"/>
+              </w:rPr>
+              <w:t>25 fasi combinazioni</w:t>
+            </w:r>
+          </w:p>
+        </w:tc>
+        <w:tc>
+          <w:tcPr>
+            <w:tcW w:type="dxa" w:w="6998"/>
+            <w:vAlign w:val="center"/>
+            <w:tcMar>
+              <w:top w:w="75" w:type="dxa"/>
+              <w:bottom w:w="75" w:type="dxa"/>
+              <w:left w:w="100" w:type="dxa"/>
+              <w:right w:w="100" w:type="dxa"/>
+            </w:tcMar>
+            <w:shd w:fill="FFFFFF"/>
+          </w:tcPr>
+          <w:p>
+            <w:pPr>
+              <w:spacing w:after="0" w:line="247" w:lineRule="auto"/>
+              <w:jc w:val="left"/>
+            </w:pPr>
+            <w:r>
+              <w:rPr>
+                <w:b w:val="0"/>
+                <w:color w:val="000000"/>
+                <w:sz w:val="20"/>
+              </w:rPr>
+              <w:t>Ordine esplicito e matrice per Action ID</w:t>
+            </w:r>
+          </w:p>
+        </w:tc>
+      </w:tr>
+      <w:tr>
+        <w:trPr>
+          <w:cantSplit/>
+        </w:trPr>
+        <w:tc>
+          <w:tcPr>
+            <w:tcW w:type="dxa" w:w="2995"/>
+            <w:vAlign w:val="center"/>
+            <w:tcMar>
+              <w:top w:w="75" w:type="dxa"/>
+              <w:bottom w:w="75" w:type="dxa"/>
+              <w:left w:w="100" w:type="dxa"/>
+              <w:right w:w="100" w:type="dxa"/>
+            </w:tcMar>
+            <w:shd w:fill="F2F5F7"/>
+          </w:tcPr>
+          <w:p>
+            <w:pPr>
+              <w:spacing w:after="0" w:line="247" w:lineRule="auto"/>
+              <w:jc w:val="left"/>
+            </w:pPr>
+            <w:r>
+              <w:rPr>
+                <w:b w:val="0"/>
+                <w:color w:val="000000"/>
+                <w:sz w:val="20"/>
+              </w:rPr>
+              <w:t>26 riepilogo verifiche gpc</w:t>
+            </w:r>
+          </w:p>
+        </w:tc>
+        <w:tc>
+          <w:tcPr>
+            <w:tcW w:type="dxa" w:w="6998"/>
+            <w:vAlign w:val="center"/>
+            <w:tcMar>
+              <w:top w:w="75" w:type="dxa"/>
+              <w:bottom w:w="75" w:type="dxa"/>
+              <w:left w:w="100" w:type="dxa"/>
+              <w:right w:w="100" w:type="dxa"/>
+            </w:tcMar>
+            <w:shd w:fill="F2F5F7"/>
+          </w:tcPr>
+          <w:p>
+            <w:pPr>
+              <w:spacing w:after="0" w:line="247" w:lineRule="auto"/>
+              <w:jc w:val="left"/>
+            </w:pPr>
+            <w:r>
+              <w:rPr>
+                <w:b w:val="0"/>
+                <w:color w:val="000000"/>
+                <w:sz w:val="20"/>
+              </w:rPr>
+              <w:t>Rapporti e stati ricavati dal calcolo GPC</w:t>
+            </w:r>
+          </w:p>
+        </w:tc>
+      </w:tr>
+      <w:tr>
+        <w:trPr>
+          <w:cantSplit/>
+        </w:trPr>
+        <w:tc>
+          <w:tcPr>
+            <w:tcW w:type="dxa" w:w="2995"/>
+            <w:vAlign w:val="center"/>
+            <w:tcMar>
+              <w:top w:w="75" w:type="dxa"/>
+              <w:bottom w:w="75" w:type="dxa"/>
+              <w:left w:w="100" w:type="dxa"/>
+              <w:right w:w="100" w:type="dxa"/>
+            </w:tcMar>
+            <w:shd w:fill="FFFFFF"/>
+          </w:tcPr>
+          <w:p>
+            <w:pPr>
+              <w:spacing w:after="0" w:line="247" w:lineRule="auto"/>
+              <w:jc w:val="left"/>
+            </w:pPr>
+            <w:r>
+              <w:rPr>
+                <w:b w:val="0"/>
+                <w:color w:val="000000"/>
+                <w:sz w:val="20"/>
+              </w:rPr>
+              <w:t>27 ritiro confronti</w:t>
+            </w:r>
+          </w:p>
+        </w:tc>
+        <w:tc>
+          <w:tcPr>
+            <w:tcW w:type="dxa" w:w="6998"/>
+            <w:vAlign w:val="center"/>
+            <w:tcMar>
+              <w:top w:w="75" w:type="dxa"/>
+              <w:bottom w:w="75" w:type="dxa"/>
+              <w:left w:w="100" w:type="dxa"/>
+              <w:right w:w="100" w:type="dxa"/>
+            </w:tcMar>
+            <w:shd w:fill="FFFFFF"/>
+          </w:tcPr>
+          <w:p>
+            <w:pPr>
+              <w:spacing w:after="0" w:line="247" w:lineRule="auto"/>
+              <w:jc w:val="left"/>
+            </w:pPr>
+            <w:r>
+              <w:rPr>
+                <w:b w:val="0"/>
+                <w:color w:val="000000"/>
+                <w:sz w:val="20"/>
+              </w:rPr>
+              <w:t>Bilancio degli incrementi e confronto per chiavi fisiche</w:t>
+            </w:r>
+          </w:p>
+        </w:tc>
+      </w:tr>
+      <w:tr>
+        <w:trPr>
+          <w:cantSplit/>
+        </w:trPr>
+        <w:tc>
+          <w:tcPr>
+            <w:tcW w:type="dxa" w:w="2995"/>
+            <w:vAlign w:val="center"/>
+            <w:tcMar>
+              <w:top w:w="75" w:type="dxa"/>
+              <w:bottom w:w="75" w:type="dxa"/>
+              <w:left w:w="100" w:type="dxa"/>
+              <w:right w:w="100" w:type="dxa"/>
+            </w:tcMar>
+            <w:shd w:fill="F2F5F7"/>
+          </w:tcPr>
+          <w:p>
+            <w:pPr>
+              <w:spacing w:after="0" w:line="247" w:lineRule="auto"/>
+              <w:jc w:val="left"/>
+            </w:pPr>
+            <w:r>
+              <w:rPr>
+                <w:b w:val="0"/>
+                <w:color w:val="000000"/>
+                <w:sz w:val="20"/>
+              </w:rPr>
+              <w:t>28 corsie mobili</w:t>
+            </w:r>
+          </w:p>
+        </w:tc>
+        <w:tc>
+          <w:tcPr>
+            <w:tcW w:type="dxa" w:w="6998"/>
+            <w:vAlign w:val="center"/>
+            <w:tcMar>
+              <w:top w:w="75" w:type="dxa"/>
+              <w:bottom w:w="75" w:type="dxa"/>
+              <w:left w:w="100" w:type="dxa"/>
+              <w:right w:w="100" w:type="dxa"/>
+            </w:tcMar>
+            <w:shd w:fill="F2F5F7"/>
+          </w:tcPr>
+          <w:p>
+            <w:pPr>
+              <w:spacing w:after="0" w:line="247" w:lineRule="auto"/>
+              <w:jc w:val="left"/>
+            </w:pPr>
+            <w:r>
+              <w:rPr>
+                <w:b w:val="0"/>
+                <w:color w:val="000000"/>
+                <w:sz w:val="20"/>
+              </w:rPr>
+              <w:t>Copie indipendenti dei percorsi e preview</w:t>
+            </w:r>
+          </w:p>
+        </w:tc>
+      </w:tr>
+    </w:tbl>
+    <w:p>
+      <w:pPr>
+        <w:spacing w:after="20" w:before="0" w:line="240" w:lineRule="auto"/>
+      </w:pPr>
+      <w:r>
+        <w:rPr>
+          <w:sz w:val="4"/>
+        </w:rPr>
+      </w:r>
+    </w:p>
+    <w:p>
+      <w:pPr>
+        <w:spacing w:after="40" w:line="240" w:lineRule="auto"/>
+      </w:pPr>
+      <w:r>
+        <w:rPr>
+          <w:rFonts w:ascii="Consolas" w:hAnsi="Consolas"/>
+          <w:sz w:val="18"/>
+        </w:rPr>
+        <w:t># Controlli dei servizi</w:t>
+      </w:r>
+    </w:p>
+    <w:p>
+      <w:pPr>
+        <w:spacing w:after="40" w:line="240" w:lineRule="auto"/>
+      </w:pPr>
+      <w:r>
+        <w:rPr>
+          <w:rFonts w:ascii="Consolas" w:hAnsi="Consolas"/>
+          <w:sz w:val="18"/>
+        </w:rPr>
+        <w:t>dotnet run --project tests/BridGHe.Smoke -c Release --no-build -- `</w:t>
+      </w:r>
+    </w:p>
+    <w:p>
+      <w:pPr>
+        <w:spacing w:after="40" w:line="240" w:lineRule="auto"/>
+      </w:pPr>
+      <w:r>
+        <w:rPr>
+          <w:rFonts w:ascii="Consolas" w:hAnsi="Consolas"/>
+          <w:sz w:val="18"/>
+        </w:rPr>
+        <w:t xml:space="preserve">  --regression bridge-utilities</w:t>
+      </w:r>
+    </w:p>
+    <w:p>
+      <w:pPr>
+        <w:spacing w:after="40" w:line="240" w:lineRule="auto"/>
+      </w:pPr>
+      <w:r>
+        <w:rPr>
+          <w:rFonts w:ascii="Consolas" w:hAnsi="Consolas"/>
+          <w:sz w:val="18"/>
+        </w:rPr>
+        <w:t># Rigenera gli esempi 23–28 e ne verifica salvataggio/riapertura</w:t>
+      </w:r>
+    </w:p>
+    <w:p>
+      <w:pPr>
+        <w:spacing w:after="40" w:line="240" w:lineRule="auto"/>
+      </w:pPr>
+      <w:r>
+        <w:rPr>
+          <w:rFonts w:ascii="Consolas" w:hAnsi="Consolas"/>
+          <w:sz w:val="18"/>
+        </w:rPr>
+        <w:t>dotnet run --project tests/BridGHe.Smoke -c Release --no-build -- `</w:t>
+      </w:r>
+    </w:p>
+    <w:p>
+      <w:pPr>
+        <w:spacing w:after="40" w:line="240" w:lineRule="auto"/>
+      </w:pPr>
+      <w:r>
+        <w:rPr>
+          <w:rFonts w:ascii="Consolas" w:hAnsi="Consolas"/>
+          <w:sz w:val="18"/>
+        </w:rPr>
+        <w:t xml:space="preserve">  --utility-examples</w:t>
+      </w:r>
+    </w:p>
+    <w:p>
+      <w:r>
+        <w:rPr>
+          <w:b w:val="0"/>
+        </w:rPr>
+        <w:t>Le prove dei nuovi strumenti comprendono 44 controlli di servizio e sei grafi calcolati e riaperti con i 12 nuovi componenti. Non richiedono una nuova analisi Straus. Gli esempi di inviluppo usano campioni controllati, mentre il riepilogo ricalcola la sezione con GPC. Salvare una copia prima di rigenerare esempi modificati manualmente.</w:t>
       </w:r>
     </w:p>
     <w:sectPr>

</xml_diff>

<commit_message>
Extend the operator guide with bridge modelling workflows and verified test scope
</commit_message>
<xml_diff>
--- a/docs/BridGHe_Guida_operativa.docx
+++ b/docs/BridGHe_Guida_operativa.docx
@@ -733,6 +733,92 @@
           </w:p>
         </w:tc>
       </w:tr>
+      <w:tr>
+        <w:trPr>
+          <w:cantSplit/>
+        </w:trPr>
+        <w:tc>
+          <w:tcPr>
+            <w:tcW w:type="dxa" w:w="1440"/>
+            <w:vAlign w:val="center"/>
+            <w:tcMar>
+              <w:top w:w="75" w:type="dxa"/>
+              <w:bottom w:w="75" w:type="dxa"/>
+              <w:left w:w="100" w:type="dxa"/>
+              <w:right w:w="100" w:type="dxa"/>
+            </w:tcMar>
+            <w:shd w:fill="FFFFFF"/>
+          </w:tcPr>
+          <w:p>
+            <w:pPr>
+              <w:spacing w:after="0" w:line="247" w:lineRule="auto"/>
+              <w:jc w:val="center"/>
+            </w:pPr>
+            <w:r>
+              <w:rPr>
+                <w:b w:val="0"/>
+                <w:color w:val="000000"/>
+                <w:sz w:val="20"/>
+              </w:rPr>
+              <w:t>22–27</w:t>
+            </w:r>
+          </w:p>
+        </w:tc>
+        <w:tc>
+          <w:tcPr>
+            <w:tcW w:type="dxa" w:w="7416"/>
+            <w:vAlign w:val="center"/>
+            <w:tcMar>
+              <w:top w:w="75" w:type="dxa"/>
+              <w:bottom w:w="75" w:type="dxa"/>
+              <w:left w:w="100" w:type="dxa"/>
+              <w:right w:w="100" w:type="dxa"/>
+            </w:tcMar>
+            <w:shd w:fill="FFFFFF"/>
+          </w:tcPr>
+          <w:p>
+            <w:pPr>
+              <w:spacing w:after="0" w:line="247" w:lineRule="auto"/>
+              <w:jc w:val="left"/>
+            </w:pPr>
+            <w:r>
+              <w:rPr>
+                <w:b w:val="0"/>
+                <w:color w:val="000000"/>
+                <w:sz w:val="20"/>
+              </w:rPr>
+              <w:t>Dal tracciato al modello ed esempi 29–45</w:t>
+            </w:r>
+          </w:p>
+        </w:tc>
+        <w:tc>
+          <w:tcPr>
+            <w:tcW w:type="dxa" w:w="1138"/>
+            <w:vAlign w:val="center"/>
+            <w:tcMar>
+              <w:top w:w="75" w:type="dxa"/>
+              <w:bottom w:w="75" w:type="dxa"/>
+              <w:left w:w="100" w:type="dxa"/>
+              <w:right w:w="100" w:type="dxa"/>
+            </w:tcMar>
+            <w:shd w:fill="FFFFFF"/>
+          </w:tcPr>
+          <w:p>
+            <w:pPr>
+              <w:spacing w:after="0" w:line="247" w:lineRule="auto"/>
+              <w:jc w:val="center"/>
+            </w:pPr>
+            <w:r>
+              <w:rPr>
+                <w:b w:val="0"/>
+                <w:color w:val="000000"/>
+                <w:sz w:val="20"/>
+              </w:rPr>
+              <w:t>23–28</w:t>
+            </w:r>
+          </w:p>
+        </w:tc>
+      </w:tr>
     </w:tbl>
     <w:p>
       <w:pPr>
@@ -760,7 +846,7 @@
         <w:rPr>
           <w:b w:val="0"/>
         </w:rPr>
-        <w:t xml:space="preserve"> 19 ottobre 2026, workflow REV003 e strumenti operativi 23–28. Le interfacce precedenti di Build BridGHe Model non sono compatibili con il workflow corrente. La guida distingue i controlli già eseguiti dalle nuove analisi Straus ancora da eseguire.</w:t>
+        <w:t xml:space="preserve"> 20 ottobre 2026, workflow REV003, Simple Bridge e strumenti di modellazione 33–45. Le interfacce precedenti di Build BridGHe Model non sono compatibili con il workflow corrente. La guida distingue controlli offline e analisi Straus.</w:t>
       </w:r>
     </w:p>
     <w:p>
@@ -11447,7 +11533,7 @@
         <w:rPr>
           <w:b w:val="0"/>
         </w:rPr>
-        <w:t>La Release con gli strumenti operativi 23–28 è stata compilata e sottoposta alle regressioni. Per i ponti 11–18 si riportano i replay già registrati; nessuna nuova analisi Straus è stata eseguita per questo aggiornamento.</w:t>
+        <w:t>La Release con gli esempi 33–45 supera i controlli offline. Per i ponti 11–18 si riportano replay già registrati. Questo aggiornamento non include nuove analisi Straus.</w:t>
       </w:r>
     </w:p>
     <w:tbl>
@@ -11697,7 +11783,7 @@
                 <w:color w:val="000000"/>
                 <w:sz w:val="20"/>
               </w:rPr>
-              <w:t>202 controlli; 38 gruppi principali e 2 grafici</w:t>
+              <w:t>218 controlli; 54 gruppi principali e 2 grafici</w:t>
             </w:r>
           </w:p>
         </w:tc>
@@ -14681,6 +14767,1788 @@
         <w:t>Le prove dei nuovi strumenti comprendono 44 controlli di servizio e sei grafi calcolati e riaperti con i 12 nuovi componenti. Non richiedono una nuova analisi Straus. Gli esempi di inviluppo usano campioni controllati, mentre il riepilogo ricalcola la sezione con GPC. Salvare una copia prima di rigenerare esempi modificati manualmente.</w:t>
       </w:r>
     </w:p>
+    <w:p>
+      <w:r>
+        <w:br w:type="page"/>
+      </w:r>
+    </w:p>
+    <w:p>
+      <w:pPr>
+        <w:pStyle w:val="Heading1"/>
+      </w:pPr>
+      <w:r>
+        <w:t>22  Scegliere le campate e generare il ponte</w:t>
+      </w:r>
+    </w:p>
+    <w:p>
+      <w:r>
+        <w:rPr>
+          <w:b w:val="0"/>
+        </w:rPr>
+      </w:r>
+      <w:r>
+        <w:rPr>
+          <w:b/>
+        </w:rPr>
+        <w:t>Bridge Span Advisor</w:t>
+      </w:r>
+      <w:r>
+        <w:rPr>
+          <w:b w:val="0"/>
+        </w:rPr>
+        <w:t xml:space="preserve"> propone distribuzioni geometriche degli appoggi lungo un tracciato 3D. Le zone vietate sono curve chiuse orizzontali: viene considerata la loro proiezione XY. Il progettista assegna le luci minime, massime e obiettivo; il componente non verifica sezioni, pile o fondazioni.</w:t>
+      </w:r>
+    </w:p>
+    <w:p>
+      <w:pPr>
+        <w:ind w:left="259" w:hanging="259"/>
+      </w:pPr>
+      <w:r>
+        <w:rPr>
+          <w:b w:val="0"/>
+        </w:rPr>
+      </w:r>
+      <w:r>
+        <w:rPr>
+          <w:b/>
+        </w:rPr>
+        <w:t>1.</w:t>
+      </w:r>
+      <w:r>
+        <w:rPr>
+          <w:b w:val="0"/>
+        </w:rPr>
+        <w:t xml:space="preserve"> Aprire l’esempio 33. Il tracciato è lungo 100 m; la zona vietata occupa x=40–60 m. Il franco di 2 m esclude il punto di appoggio nell’intervallo 38–62 m.</w:t>
+      </w:r>
+    </w:p>
+    <w:p>
+      <w:pPr>
+        <w:ind w:left="259" w:hanging="259"/>
+      </w:pPr>
+      <w:r>
+        <w:rPr>
+          <w:b w:val="0"/>
+        </w:rPr>
+      </w:r>
+      <w:r>
+        <w:rPr>
+          <w:b/>
+        </w:rPr>
+        <w:t>2.</w:t>
+      </w:r>
+      <w:r>
+        <w:rPr>
+          <w:b w:val="0"/>
+        </w:rPr>
+        <w:t xml:space="preserve"> Impostare Candidate Grid in mm. La griglia e le progressive obbligatorie definiscono i candidati. Gli estremi del tracciato sono sempre appoggi obbligatori.</w:t>
+      </w:r>
+    </w:p>
+    <w:p>
+      <w:pPr>
+        <w:ind w:left="259" w:hanging="259"/>
+      </w:pPr>
+      <w:r>
+        <w:rPr>
+          <w:b w:val="0"/>
+        </w:rPr>
+      </w:r>
+      <w:r>
+        <w:rPr>
+          <w:b/>
+        </w:rPr>
+        <w:t>3.</w:t>
+      </w:r>
+      <w:r>
+        <w:rPr>
+          <w:b w:val="0"/>
+        </w:rPr>
+        <w:t xml:space="preserve"> Leggere un ramo per alternativa in Support Stations. Il costo è la somma degli scarti quadratici normalizzati dalla luce obiettivo, più Pier Penalty per ogni pila interna. End Span Ratio modifica l’obiettivo delle sole campate terminali.</w:t>
+      </w:r>
+    </w:p>
+    <w:p>
+      <w:pPr>
+        <w:ind w:left="259" w:hanging="259"/>
+      </w:pPr>
+      <w:r>
+        <w:rPr>
+          <w:b w:val="0"/>
+        </w:rPr>
+      </w:r>
+      <w:r>
+        <w:rPr>
+          <w:b/>
+        </w:rPr>
+        <w:t>4.</w:t>
+      </w:r>
+      <w:r>
+        <w:rPr>
+          <w:b w:val="0"/>
+        </w:rPr>
+        <w:t xml:space="preserve"> Selezionare un solo ramo e collegarlo a Support Stations di Simple Bridge Solid o Truss. Aumentare il franco per includere l’ingombro delle fondazioni.</w:t>
+      </w:r>
+    </w:p>
+    <w:p>
+      <w:r>
+        <w:rPr>
+          <w:b w:val="0"/>
+        </w:rPr>
+        <w:t>Un risultato vuoto significa nessuna soluzione sulla griglia attuale. Raffinare la griglia può trovare altre posizioni, con un costo di ricerca maggiore. Il test automatico confronta le prime dieci alternative con una ricerca esaustiva su un caso piccolo.</w:t>
+      </w:r>
+    </w:p>
+    <w:p>
+      <w:pPr>
+        <w:pStyle w:val="Heading2"/>
+      </w:pPr>
+      <w:r>
+        <w:t>Simple Bridge e conci</w:t>
+      </w:r>
+    </w:p>
+    <w:p>
+      <w:r>
+        <w:rPr>
+          <w:b w:val="0"/>
+        </w:rPr>
+        <w:t>Gli esempi 29–32 mostrano traversi pieni o reticolari su ponti rettilinei e curvi. Definire tracciato alla quota superiore dell’impalcato, offsets trasversali, quote degli assi, larghezza, spessore e pendenza trasversale. Le unità sono mm. Bridge Segments definisce giunti comuni o diversi per trave, indipendenti dalle pile.</w:t>
+      </w:r>
+    </w:p>
+    <w:p>
+      <w:r>
+        <w:rPr>
+          <w:b w:val="0"/>
+        </w:rPr>
+        <w:t xml:space="preserve">Usare l’uscita tipizzata </w:t>
+      </w:r>
+      <w:r>
+        <w:rPr>
+          <w:b/>
+        </w:rPr>
+        <w:t>Bridge Geometry</w:t>
+      </w:r>
+      <w:r>
+        <w:rPr>
+          <w:b w:val="0"/>
+        </w:rPr>
+        <w:t>, che conserva topologia, progressive, appoggi e identità dei conci. Una suddivisione non crea una cerniera FEM. Le quote degli assi non vengono dedotte dalle proprietà di sezione.</w:t>
+      </w:r>
+    </w:p>
+    <w:p>
+      <w:r>
+        <w:br w:type="page"/>
+      </w:r>
+    </w:p>
+    <w:p>
+      <w:pPr>
+        <w:pStyle w:val="Heading1"/>
+      </w:pPr>
+      <w:r>
+        <w:t>23  Assegnare sezioni controventi e appoggi</w:t>
+      </w:r>
+    </w:p>
+    <w:p>
+      <w:pPr>
+        <w:pStyle w:val="Heading2"/>
+      </w:pPr>
+      <w:r>
+        <w:t>Proprietà e regole per progressiva</w:t>
+      </w:r>
+    </w:p>
+    <w:p>
+      <w:r>
+        <w:rPr>
+          <w:b w:val="0"/>
+        </w:rPr>
+        <w:t xml:space="preserve">Nell’esempio 35, </w:t>
+      </w:r>
+      <w:r>
+        <w:rPr>
+          <w:b/>
+        </w:rPr>
+        <w:t>Bridge Member Assignment</w:t>
+      </w:r>
+      <w:r>
+        <w:rPr>
+          <w:b w:val="0"/>
+        </w:rPr>
+        <w:t xml:space="preserve"> trasforma la geometria in aste con proprietà, assi locali e gruppi. Le proprietà sono abbinate a Families: −1 vale per tutte; 0 trave longitudinale, 1 traverso pieno, 2/3 correnti, 4/5 montanti e diagonali dei traversi, 6 controventi longitudinali, 7 montanti dei controventi.</w:t>
+      </w:r>
+    </w:p>
+    <w:p>
+      <w:r>
+        <w:rPr>
+          <w:b w:val="0"/>
+        </w:rPr>
+        <w:t xml:space="preserve">Nell’esempio 34, </w:t>
+      </w:r>
+      <w:r>
+        <w:rPr>
+          <w:b/>
+        </w:rPr>
+        <w:t>Bridge Section Schedule</w:t>
+      </w:r>
+      <w:r>
+        <w:rPr>
+          <w:b w:val="0"/>
+        </w:rPr>
+        <w:t xml:space="preserve"> assegna una proprietà a G2 fra 12.345 e 45 m, con scala verticale da 1 a 1.2. Le aste vengono divise alle estremità della regola. Regole sovrapposte sulla stessa selezione sono respinte. La rastremazione dimensionale non è disponibile per sezioni generiche/omogeneizzate.</w:t>
+      </w:r>
+    </w:p>
+    <w:p>
+      <w:r>
+        <w:rPr>
+          <w:b w:val="0"/>
+        </w:rPr>
+        <w:t>Gli ID FEM sono numerici. Physical IDs, ad esempio Girder:2:1, identificano il concio anche cambiando la mesh. Unassigned deve essere vuoto prima dell’esportazione. Le sezioni degli esempi sono dimostrative.</w:t>
+      </w:r>
+    </w:p>
+    <w:p>
+      <w:pPr>
+        <w:pStyle w:val="Heading2"/>
+      </w:pPr>
+      <w:r>
+        <w:t>Controventi</w:t>
+      </w:r>
+    </w:p>
+    <w:p>
+      <w:r>
+        <w:rPr>
+          <w:b w:val="0"/>
+        </w:rPr>
+        <w:t xml:space="preserve">Inserire </w:t>
+      </w:r>
+      <w:r>
+        <w:rPr>
+          <w:b/>
+        </w:rPr>
+        <w:t>Bridge Longitudinal Bracing</w:t>
+      </w:r>
+      <w:r>
+        <w:rPr>
+          <w:b w:val="0"/>
+        </w:rPr>
+        <w:t xml:space="preserve"> prima dell’assegnazione. Nell’esempio 38, due pannelli fra 0, 12.345 e 30 m generano otto diagonali X nelle due maglie trasversali. Pattern sceglie X, V o Warren. Un offset non nullo genera montanti fisici. Connect X richiede un’intersezione reale in 3D e divide i membri nell’incrocio.</w:t>
+      </w:r>
+    </w:p>
+    <w:p>
+      <w:pPr>
+        <w:pStyle w:val="Heading2"/>
+      </w:pPr>
+      <w:r>
+        <w:t>Vincoli orientati</w:t>
+      </w:r>
+    </w:p>
+    <w:p>
+      <w:r>
+        <w:rPr>
+          <w:b w:val="0"/>
+        </w:rPr>
+      </w:r>
+      <w:r>
+        <w:rPr>
+          <w:b/>
+        </w:rPr>
+        <w:t>Bridge Bearings</w:t>
+      </w:r>
+      <w:r>
+        <w:rPr>
+          <w:b w:val="0"/>
+        </w:rPr>
+        <w:t>, esempio 36, restituisce nodi e riferimenti dei vincoli. X segue la tangente orizzontale, Y punta a sinistra e Z è verticale. Guide Angle ruota il piano; Orientation permette un riferimento esplicito.</w:t>
+      </w:r>
+    </w:p>
+    <w:tbl>
+      <w:tblPr>
+        <w:tblW w:type="auto" w:w="0"/>
+        <w:jc w:val="center"/>
+        <w:tblLayout w:type="fixed"/>
+        <w:tblLook w:firstColumn="1" w:firstRow="1" w:lastColumn="0" w:lastRow="0" w:noHBand="0" w:noVBand="1" w:val="04A0"/>
+        <w:tblBorders>
+          <w:top w:val="single" w:sz="4" w:color="D9D9D9"/>
+          <w:left w:val="single" w:sz="4" w:color="D9D9D9"/>
+          <w:bottom w:val="single" w:sz="4" w:color="D9D9D9"/>
+          <w:right w:val="single" w:sz="4" w:color="D9D9D9"/>
+          <w:insideH w:val="single" w:sz="4" w:color="D9D9D9"/>
+          <w:insideV w:val="single" w:sz="4" w:color="D9D9D9"/>
+        </w:tblBorders>
+      </w:tblPr>
+      <w:tblGrid>
+        <w:gridCol w:w="936"/>
+        <w:gridCol w:w="9058"/>
+      </w:tblGrid>
+      <w:tr>
+        <w:trPr>
+          <w:tblHeader/>
+          <w:cantSplit/>
+        </w:trPr>
+        <w:tc>
+          <w:tcPr>
+            <w:tcW w:type="dxa" w:w="936"/>
+            <w:vAlign w:val="center"/>
+            <w:tcMar>
+              <w:top w:w="75" w:type="dxa"/>
+              <w:bottom w:w="75" w:type="dxa"/>
+              <w:left w:w="100" w:type="dxa"/>
+              <w:right w:w="100" w:type="dxa"/>
+            </w:tcMar>
+            <w:shd w:fill="24465F"/>
+          </w:tcPr>
+          <w:p>
+            <w:pPr>
+              <w:spacing w:after="0" w:line="247" w:lineRule="auto"/>
+              <w:jc w:val="left"/>
+            </w:pPr>
+            <w:r>
+              <w:rPr>
+                <w:b/>
+                <w:color w:val="FFFFFF"/>
+                <w:sz w:val="20"/>
+              </w:rPr>
+              <w:t>Tipo</w:t>
+            </w:r>
+          </w:p>
+        </w:tc>
+        <w:tc>
+          <w:tcPr>
+            <w:tcW w:type="dxa" w:w="9058"/>
+            <w:vAlign w:val="center"/>
+            <w:tcMar>
+              <w:top w:w="75" w:type="dxa"/>
+              <w:bottom w:w="75" w:type="dxa"/>
+              <w:left w:w="100" w:type="dxa"/>
+              <w:right w:w="100" w:type="dxa"/>
+            </w:tcMar>
+            <w:shd w:fill="24465F"/>
+          </w:tcPr>
+          <w:p>
+            <w:pPr>
+              <w:spacing w:after="0" w:line="247" w:lineRule="auto"/>
+              <w:jc w:val="left"/>
+            </w:pPr>
+            <w:r>
+              <w:rPr>
+                <w:b/>
+                <w:color w:val="FFFFFF"/>
+                <w:sz w:val="20"/>
+              </w:rPr>
+              <w:t>Comportamento</w:t>
+            </w:r>
+          </w:p>
+        </w:tc>
+      </w:tr>
+      <w:tr>
+        <w:trPr>
+          <w:cantSplit/>
+        </w:trPr>
+        <w:tc>
+          <w:tcPr>
+            <w:tcW w:type="dxa" w:w="936"/>
+            <w:vAlign w:val="center"/>
+            <w:tcMar>
+              <w:top w:w="75" w:type="dxa"/>
+              <w:bottom w:w="75" w:type="dxa"/>
+              <w:left w:w="100" w:type="dxa"/>
+              <w:right w:w="100" w:type="dxa"/>
+            </w:tcMar>
+            <w:shd w:fill="FFFFFF"/>
+          </w:tcPr>
+          <w:p>
+            <w:pPr>
+              <w:spacing w:after="0" w:line="247" w:lineRule="auto"/>
+              <w:jc w:val="left"/>
+            </w:pPr>
+            <w:r>
+              <w:rPr>
+                <w:b w:val="0"/>
+                <w:color w:val="000000"/>
+                <w:sz w:val="20"/>
+              </w:rPr>
+              <w:t>0</w:t>
+            </w:r>
+          </w:p>
+        </w:tc>
+        <w:tc>
+          <w:tcPr>
+            <w:tcW w:type="dxa" w:w="9058"/>
+            <w:vAlign w:val="center"/>
+            <w:tcMar>
+              <w:top w:w="75" w:type="dxa"/>
+              <w:bottom w:w="75" w:type="dxa"/>
+              <w:left w:w="100" w:type="dxa"/>
+              <w:right w:w="100" w:type="dxa"/>
+            </w:tcMar>
+            <w:shd w:fill="FFFFFF"/>
+          </w:tcPr>
+          <w:p>
+            <w:pPr>
+              <w:spacing w:after="0" w:line="247" w:lineRule="auto"/>
+              <w:jc w:val="left"/>
+            </w:pPr>
+            <w:r>
+              <w:rPr>
+                <w:b w:val="0"/>
+                <w:color w:val="000000"/>
+                <w:sz w:val="20"/>
+              </w:rPr>
+              <w:t>Traslazioni bloccate, rotazioni libere</w:t>
+            </w:r>
+          </w:p>
+        </w:tc>
+      </w:tr>
+      <w:tr>
+        <w:trPr>
+          <w:cantSplit/>
+        </w:trPr>
+        <w:tc>
+          <w:tcPr>
+            <w:tcW w:type="dxa" w:w="936"/>
+            <w:vAlign w:val="center"/>
+            <w:tcMar>
+              <w:top w:w="75" w:type="dxa"/>
+              <w:bottom w:w="75" w:type="dxa"/>
+              <w:left w:w="100" w:type="dxa"/>
+              <w:right w:w="100" w:type="dxa"/>
+            </w:tcMar>
+            <w:shd w:fill="F2F5F7"/>
+          </w:tcPr>
+          <w:p>
+            <w:pPr>
+              <w:spacing w:after="0" w:line="247" w:lineRule="auto"/>
+              <w:jc w:val="left"/>
+            </w:pPr>
+            <w:r>
+              <w:rPr>
+                <w:b w:val="0"/>
+                <w:color w:val="000000"/>
+                <w:sz w:val="20"/>
+              </w:rPr>
+              <w:t>1</w:t>
+            </w:r>
+          </w:p>
+        </w:tc>
+        <w:tc>
+          <w:tcPr>
+            <w:tcW w:type="dxa" w:w="9058"/>
+            <w:vAlign w:val="center"/>
+            <w:tcMar>
+              <w:top w:w="75" w:type="dxa"/>
+              <w:bottom w:w="75" w:type="dxa"/>
+              <w:left w:w="100" w:type="dxa"/>
+              <w:right w:w="100" w:type="dxa"/>
+            </w:tcMar>
+            <w:shd w:fill="F2F5F7"/>
+          </w:tcPr>
+          <w:p>
+            <w:pPr>
+              <w:spacing w:after="0" w:line="247" w:lineRule="auto"/>
+              <w:jc w:val="left"/>
+            </w:pPr>
+            <w:r>
+              <w:rPr>
+                <w:b w:val="0"/>
+                <w:color w:val="000000"/>
+                <w:sz w:val="20"/>
+              </w:rPr>
+              <w:t>Guida longitudinale: X libera, Y/Z bloccate</w:t>
+            </w:r>
+          </w:p>
+        </w:tc>
+      </w:tr>
+      <w:tr>
+        <w:trPr>
+          <w:cantSplit/>
+        </w:trPr>
+        <w:tc>
+          <w:tcPr>
+            <w:tcW w:type="dxa" w:w="936"/>
+            <w:vAlign w:val="center"/>
+            <w:tcMar>
+              <w:top w:w="75" w:type="dxa"/>
+              <w:bottom w:w="75" w:type="dxa"/>
+              <w:left w:w="100" w:type="dxa"/>
+              <w:right w:w="100" w:type="dxa"/>
+            </w:tcMar>
+            <w:shd w:fill="FFFFFF"/>
+          </w:tcPr>
+          <w:p>
+            <w:pPr>
+              <w:spacing w:after="0" w:line="247" w:lineRule="auto"/>
+              <w:jc w:val="left"/>
+            </w:pPr>
+            <w:r>
+              <w:rPr>
+                <w:b w:val="0"/>
+                <w:color w:val="000000"/>
+                <w:sz w:val="20"/>
+              </w:rPr>
+              <w:t>2</w:t>
+            </w:r>
+          </w:p>
+        </w:tc>
+        <w:tc>
+          <w:tcPr>
+            <w:tcW w:type="dxa" w:w="9058"/>
+            <w:vAlign w:val="center"/>
+            <w:tcMar>
+              <w:top w:w="75" w:type="dxa"/>
+              <w:bottom w:w="75" w:type="dxa"/>
+              <w:left w:w="100" w:type="dxa"/>
+              <w:right w:w="100" w:type="dxa"/>
+            </w:tcMar>
+            <w:shd w:fill="FFFFFF"/>
+          </w:tcPr>
+          <w:p>
+            <w:pPr>
+              <w:spacing w:after="0" w:line="247" w:lineRule="auto"/>
+              <w:jc w:val="left"/>
+            </w:pPr>
+            <w:r>
+              <w:rPr>
+                <w:b w:val="0"/>
+                <w:color w:val="000000"/>
+                <w:sz w:val="20"/>
+              </w:rPr>
+              <w:t>Multidirezionale: X/Y libere, Z bloccata</w:t>
+            </w:r>
+          </w:p>
+        </w:tc>
+      </w:tr>
+      <w:tr>
+        <w:trPr>
+          <w:cantSplit/>
+        </w:trPr>
+        <w:tc>
+          <w:tcPr>
+            <w:tcW w:type="dxa" w:w="936"/>
+            <w:vAlign w:val="center"/>
+            <w:tcMar>
+              <w:top w:w="75" w:type="dxa"/>
+              <w:bottom w:w="75" w:type="dxa"/>
+              <w:left w:w="100" w:type="dxa"/>
+              <w:right w:w="100" w:type="dxa"/>
+            </w:tcMar>
+            <w:shd w:fill="F2F5F7"/>
+          </w:tcPr>
+          <w:p>
+            <w:pPr>
+              <w:spacing w:after="0" w:line="247" w:lineRule="auto"/>
+              <w:jc w:val="left"/>
+            </w:pPr>
+            <w:r>
+              <w:rPr>
+                <w:b w:val="0"/>
+                <w:color w:val="000000"/>
+                <w:sz w:val="20"/>
+              </w:rPr>
+              <w:t>3</w:t>
+            </w:r>
+          </w:p>
+        </w:tc>
+        <w:tc>
+          <w:tcPr>
+            <w:tcW w:type="dxa" w:w="9058"/>
+            <w:vAlign w:val="center"/>
+            <w:tcMar>
+              <w:top w:w="75" w:type="dxa"/>
+              <w:bottom w:w="75" w:type="dxa"/>
+              <w:left w:w="100" w:type="dxa"/>
+              <w:right w:w="100" w:type="dxa"/>
+            </w:tcMar>
+            <w:shd w:fill="F2F5F7"/>
+          </w:tcPr>
+          <w:p>
+            <w:pPr>
+              <w:spacing w:after="0" w:line="247" w:lineRule="auto"/>
+              <w:jc w:val="left"/>
+            </w:pPr>
+            <w:r>
+              <w:rPr>
+                <w:b w:val="0"/>
+                <w:color w:val="000000"/>
+                <w:sz w:val="20"/>
+              </w:rPr>
+              <w:t>Molle Kt in N/mm e Kr in N mm/rad</w:t>
+            </w:r>
+          </w:p>
+        </w:tc>
+      </w:tr>
+    </w:tbl>
+    <w:p>
+      <w:pPr>
+        <w:spacing w:after="20" w:before="0" w:line="240" w:lineRule="auto"/>
+      </w:pPr>
+      <w:r>
+        <w:rPr>
+          <w:sz w:val="4"/>
+        </w:rPr>
+      </w:r>
+    </w:p>
+    <w:p>
+      <w:r>
+        <w:rPr>
+          <w:b w:val="0"/>
+        </w:rPr>
+        <w:t>Il tipo 0 non è un incastro rotazionale. I dodici appoggi dell’esempio seguono l’ordine supporto/trave indicato da Labels. Non sovrapporre altri vincoli globali involontariamente.</w:t>
+      </w:r>
+    </w:p>
+    <w:p>
+      <w:r>
+        <w:br w:type="page"/>
+      </w:r>
+    </w:p>
+    <w:p>
+      <w:pPr>
+        <w:pStyle w:val="Heading1"/>
+      </w:pPr>
+      <w:r>
+        <w:t>24  Collegare travi e soletta strutturale</w:t>
+      </w:r>
+    </w:p>
+    <w:p>
+      <w:pPr>
+        <w:pStyle w:val="Heading2"/>
+      </w:pPr>
+      <w:r>
+        <w:t>Tre rappresentazioni di connessione</w:t>
+      </w:r>
+    </w:p>
+    <w:p>
+      <w:r>
+        <w:rPr>
+          <w:b w:val="0"/>
+        </w:rPr>
+        <w:t xml:space="preserve">Nell’esempio 37, </w:t>
+      </w:r>
+      <w:r>
+        <w:rPr>
+          <w:b/>
+        </w:rPr>
+        <w:t>Bridge Connections</w:t>
+      </w:r>
+      <w:r>
+        <w:rPr>
+          <w:b w:val="0"/>
+        </w:rPr>
+        <w:t xml:space="preserve"> mostra i tre modi disponibili. Mode 0 produce link rigidi spaziali nativi Straus; Mode 1 aste deformabili con proprietà Beam/Truss esplicita; Mode 2 copie di travi con offset locali X/Y. In quest’ultimo caso i risultati precedenti vengono cancellati.</w:t>
+      </w:r>
+    </w:p>
+    <w:p>
+      <w:r>
+        <w:rPr>
+          <w:b w:val="0"/>
+        </w:rPr>
+        <w:t>Collegare a Build Model gli elementi del modo scelto. Non sommare le tre rappresentazioni sulla stessa connessione. I link richiedono estremi univoci coincidenti con i vertici FEM previsti; duplicati, link collassati e target ambigui sono respinti.</w:t>
+      </w:r>
+    </w:p>
+    <w:p>
+      <w:pPr>
+        <w:pStyle w:val="Heading2"/>
+      </w:pPr>
+      <w:r>
+        <w:t>Mesh della soletta</w:t>
+      </w:r>
+    </w:p>
+    <w:p>
+      <w:pPr>
+        <w:ind w:left="259" w:hanging="259"/>
+      </w:pPr>
+      <w:r>
+        <w:rPr>
+          <w:b w:val="0"/>
+        </w:rPr>
+      </w:r>
+      <w:r>
+        <w:rPr>
+          <w:b/>
+        </w:rPr>
+        <w:t>1.</w:t>
+      </w:r>
+      <w:r>
+        <w:rPr>
+          <w:b w:val="0"/>
+        </w:rPr>
+        <w:t xml:space="preserve"> Aprire l’esempio 39. Collegare Bridge Geometry a Bridge Deck Mesh e assegnare una proprietà plate con spessore coerente con la soletta.</w:t>
+      </w:r>
+    </w:p>
+    <w:p>
+      <w:pPr>
+        <w:ind w:left="259" w:hanging="259"/>
+      </w:pPr>
+      <w:r>
+        <w:rPr>
+          <w:b w:val="0"/>
+        </w:rPr>
+      </w:r>
+      <w:r>
+        <w:rPr>
+          <w:b/>
+        </w:rPr>
+        <w:t>2.</w:t>
+      </w:r>
+      <w:r>
+        <w:rPr>
+          <w:b w:val="0"/>
+        </w:rPr>
+        <w:t xml:space="preserve"> Impostare dimensioni massime longitudinali e trasversali. Le progressive già presenti nella geometria vengono mantenute. Le colonne comprendono gli attacchi delle travi.</w:t>
+      </w:r>
+    </w:p>
+    <w:p>
+      <w:pPr>
+        <w:ind w:left="259" w:hanging="259"/>
+      </w:pPr>
+      <w:r>
+        <w:rPr>
+          <w:b w:val="0"/>
+        </w:rPr>
+      </w:r>
+      <w:r>
+        <w:rPr>
+          <w:b/>
+        </w:rPr>
+        <w:t>3.</w:t>
+      </w:r>
+      <w:r>
+        <w:rPr>
+          <w:b w:val="0"/>
+        </w:rPr>
+        <w:t xml:space="preserve"> Aggiungere Pour Boundaries: 30 e 70 m nell’esempio. Si ottengono i gruppi Deck\Pour1, Deck\Pour2 e Deck\Pour3.</w:t>
+      </w:r>
+    </w:p>
+    <w:p>
+      <w:pPr>
+        <w:ind w:left="259" w:hanging="259"/>
+      </w:pPr>
+      <w:r>
+        <w:rPr>
+          <w:b w:val="0"/>
+        </w:rPr>
+      </w:r>
+      <w:r>
+        <w:rPr>
+          <w:b/>
+        </w:rPr>
+        <w:t>4.</w:t>
+      </w:r>
+      <w:r>
+        <w:rPr>
+          <w:b w:val="0"/>
+        </w:rPr>
+        <w:t xml:space="preserve"> Usare la nuova uscita BG per Member Assignment. Collegare Plates a Build Model e Connection Lines a Bridge Connections scegliendo la meccanica del collegamento.</w:t>
+      </w:r>
+    </w:p>
+    <w:p>
+      <w:r>
+        <w:rPr>
+          <w:b w:val="0"/>
+        </w:rPr>
+        <w:t>I plate giacciono sulla superficie media. Le linee di connessione uniscono gli assi delle travi ai vertici plate. Le mesh triangolari evitano quadrilateri sghembi; la convergenza FEM richiede comunque analisi successive.</w:t>
+      </w:r>
+    </w:p>
+    <w:p>
+      <w:pPr>
+        <w:pStyle w:val="Heading2"/>
+      </w:pPr>
+      <w:r>
+        <w:t>Evitare il doppio conteggio del calcestruzzo</w:t>
+      </w:r>
+    </w:p>
+    <w:p>
+      <w:r>
+        <w:rPr>
+          <w:b w:val="0"/>
+        </w:rPr>
+        <w:t xml:space="preserve">Con </w:t>
+      </w:r>
+      <w:r>
+        <w:rPr>
+          <w:b/>
+        </w:rPr>
+        <w:t>shell strutturali della soletta</w:t>
+      </w:r>
+      <w:r>
+        <w:rPr>
+          <w:b w:val="0"/>
+        </w:rPr>
+        <w:t xml:space="preserve">, usare proprietà di </w:t>
+      </w:r>
+      <w:r>
+        <w:rPr>
+          <w:b/>
+        </w:rPr>
+        <w:t>solo acciaio</w:t>
+      </w:r>
+      <w:r>
+        <w:rPr>
+          <w:b w:val="0"/>
+        </w:rPr>
+        <w:t xml:space="preserve"> per le travi. Nel flusso con sezioni omogeneizzate, la rigidezza del calcestruzzo è già inclusa nelle travi: aggiungere la soletta strutturale può contarla due volte. Bridge Model Audit segnala questa possibile sovrapposizione.</w:t>
+      </w:r>
+    </w:p>
+    <w:p>
+      <w:r>
+        <w:rPr>
+          <w:b w:val="0"/>
+        </w:rPr>
+        <w:t>Le due schematizzazioni hanno ipotesi diverse. L’esempio 45 usa shell e travi di acciaio; l’esempio 19 usa il flusso di override delle sezioni omogeneizzate. Nessuna conversione automatica rende i due modelli equivalenti.</w:t>
+      </w:r>
+    </w:p>
+    <w:p>
+      <w:r>
+        <w:br w:type="page"/>
+      </w:r>
+    </w:p>
+    <w:p>
+      <w:pPr>
+        <w:pStyle w:val="Heading1"/>
+      </w:pPr>
+      <w:r>
+        <w:t>25  Preparare snapshot e fasi di costruzione</w:t>
+      </w:r>
+    </w:p>
+    <w:p>
+      <w:r>
+        <w:rPr>
+          <w:b w:val="0"/>
+        </w:rPr>
+      </w:r>
+      <w:r>
+        <w:rPr>
+          <w:b/>
+        </w:rPr>
+        <w:t>Bridge Construction Sequence</w:t>
+      </w:r>
+      <w:r>
+        <w:rPr>
+          <w:b w:val="0"/>
+        </w:rPr>
+        <w:t xml:space="preserve"> riceve un modello completo e una Bridge Phase numerata. Produce uno snapshot indipendente con gli elementi selezionati e senza risultati FEM. Number, Name e Day rendono riconoscibile la fase; non trasferiscono automaticamente la storia.</w:t>
+      </w:r>
+    </w:p>
+    <w:p>
+      <w:pPr>
+        <w:ind w:left="259" w:hanging="259"/>
+      </w:pPr>
+      <w:r>
+        <w:rPr>
+          <w:b w:val="0"/>
+        </w:rPr>
+      </w:r>
+      <w:r>
+        <w:rPr>
+          <w:b/>
+        </w:rPr>
+        <w:t>1.</w:t>
+      </w:r>
+      <w:r>
+        <w:rPr>
+          <w:b w:val="0"/>
+        </w:rPr>
+        <w:t xml:space="preserve"> Aprire l’esempio 40: fase 10 concio iniziale G2, fase 20 intera G2, fase 30 struttura completa, ai giorni 0/7/28.</w:t>
+      </w:r>
+    </w:p>
+    <w:p>
+      <w:pPr>
+        <w:ind w:left="259" w:hanging="259"/>
+      </w:pPr>
+      <w:r>
+        <w:rPr>
+          <w:b w:val="0"/>
+        </w:rPr>
+      </w:r>
+      <w:r>
+        <w:rPr>
+          <w:b/>
+        </w:rPr>
+        <w:t>2.</w:t>
+      </w:r>
+      <w:r>
+        <w:rPr>
+          <w:b w:val="0"/>
+        </w:rPr>
+        <w:t xml:space="preserve"> Usare Active Groups per gruppi e discendenti, Physical IDs per conci. Le due selezioni si sommano; entrambe vuote selezionano tutta la struttura.</w:t>
+      </w:r>
+    </w:p>
+    <w:p>
+      <w:pPr>
+        <w:ind w:left="259" w:hanging="259"/>
+      </w:pPr>
+      <w:r>
+        <w:rPr>
+          <w:b w:val="0"/>
+        </w:rPr>
+      </w:r>
+      <w:r>
+        <w:rPr>
+          <w:b/>
+        </w:rPr>
+        <w:t>3.</w:t>
+      </w:r>
+      <w:r>
+        <w:rPr>
+          <w:b w:val="0"/>
+        </w:rPr>
+        <w:t xml:space="preserve"> Usare gli ID nodali del modello in Active Bearing IDs, oppure * per mantenerli tutti. Enable Bearings=false elimina vincoli e molle nodali.</w:t>
+      </w:r>
+    </w:p>
+    <w:p>
+      <w:pPr>
+        <w:ind w:left="259" w:hanging="259"/>
+      </w:pPr>
+      <w:r>
+        <w:rPr>
+          <w:b w:val="0"/>
+        </w:rPr>
+      </w:r>
+      <w:r>
+        <w:rPr>
+          <w:b/>
+        </w:rPr>
+        <w:t>4.</w:t>
+      </w:r>
+      <w:r>
+        <w:rPr>
+          <w:b w:val="0"/>
+        </w:rPr>
+        <w:t xml:space="preserve"> Collegare Girder Property se occorre cambiare esplicitamente la proprietà delle travi longitudinali. Section State non applica automaticamente questa modifica.</w:t>
+      </w:r>
+    </w:p>
+    <w:p>
+      <w:pPr>
+        <w:ind w:left="259" w:hanging="259"/>
+      </w:pPr>
+      <w:r>
+        <w:rPr>
+          <w:b w:val="0"/>
+        </w:rPr>
+      </w:r>
+      <w:r>
+        <w:rPr>
+          <w:b/>
+        </w:rPr>
+        <w:t>5.</w:t>
+      </w:r>
+      <w:r>
+        <w:rPr>
+          <w:b w:val="0"/>
+        </w:rPr>
+        <w:t xml:space="preserve"> Verificare i carichi che rimangono sugli elementi attivi. Applicare gli incrementi voluti, analizzare lo snapshot e costruire le azioni del workflow del verificatore.</w:t>
+      </w:r>
+    </w:p>
+    <w:p>
+      <w:pPr>
+        <w:pStyle w:val="Heading2"/>
+      </w:pPr>
+      <w:r>
+        <w:t>Snapshot indipendente e stage nativo</w:t>
+      </w:r>
+    </w:p>
+    <w:p>
+      <w:r>
+        <w:rPr>
+          <w:b w:val="0"/>
+        </w:rPr>
+        <w:t>Uno snapshot non trasferisce forze, deformazioni, viscosità o tensioni accumulate nella fase precedente. I risultati vanno composti con Bridge Action, Bridge Shrinkage Action, Bridge Phase e Build BridGHe Model secondo il flusso illustrato nei primi capitoli.</w:t>
+      </w:r>
+    </w:p>
+    <w:p>
+      <w:r>
+        <w:rPr>
+          <w:b w:val="0"/>
+        </w:rPr>
+        <w:t>Native Stage è disponibile solo per attivazioni tramite gruppi rappresentabili con proprietà e appoggi invariati, senza link rigidi e con Load Increments espliciti. Gli stage ordinati vanno collegati al modello completo originale. Negli altri casi questa uscita resta vuota; Information ne spiega la ragione.</w:t>
+      </w:r>
+    </w:p>
+    <w:p>
+      <w:pPr>
+        <w:pStyle w:val="Heading2"/>
+      </w:pPr>
+      <w:r>
+        <w:t>Ritiro e controlli</w:t>
+      </w:r>
+    </w:p>
+    <w:p>
+      <w:r>
+        <w:rPr>
+          <w:b w:val="0"/>
+        </w:rPr>
+        <w:t>Day è metadato, non una legge di maturazione o viscosità. Il ritiro usa lo strain incrementale e gli eventuali effetti secondari FEM già descritti nei capitoli 5–8. Il nome di una fase non genera carichi.</w:t>
+      </w:r>
+    </w:p>
+    <w:p>
+      <w:r>
+        <w:rPr>
+          <w:b w:val="0"/>
+        </w:rPr>
+        <w:t>L’audit esteso controlla copertura dell’assegnazione, modifiche degli assi locali, conflitti fra riferimenti degli appoggi, link e differenze geometriche fra i modelli di fase. La connettività geometrica non dimostra la stabilità della matrice di rigidezza.</w:t>
+      </w:r>
+    </w:p>
+    <w:p>
+      <w:r>
+        <w:br w:type="page"/>
+      </w:r>
+    </w:p>
+    <w:p>
+      <w:pPr>
+        <w:pStyle w:val="Heading1"/>
+      </w:pPr>
+      <w:r>
+        <w:t>26  Disporre dettagli e leggere le risposte</w:t>
+      </w:r>
+    </w:p>
+    <w:p>
+      <w:pPr>
+        <w:pStyle w:val="Heading2"/>
+      </w:pPr>
+      <w:r>
+        <w:t>Pioli e irrigidimenti</w:t>
+      </w:r>
+    </w:p>
+    <w:p>
+      <w:r>
+        <w:rPr>
+          <w:b w:val="0"/>
+        </w:rPr>
+      </w:r>
+      <w:r>
+        <w:rPr>
+          <w:b/>
+        </w:rPr>
+        <w:t>Bridge Detail Layout</w:t>
+      </w:r>
+      <w:r>
+        <w:rPr>
+          <w:b w:val="0"/>
+        </w:rPr>
+        <w:t>, esempio 41, usa le definizioni gPC della sezione, dei pioli e degli irrigidimenti. Per G2 su [0,10 m), due pioli per fila ogni 200 mm producono 100 pioli; irrigidimenti ogni 4 m producono sei prismi. Il volume di un piatto è 200×1330×20 mm³.</w:t>
+      </w:r>
+    </w:p>
+    <w:p>
+      <w:r>
+        <w:rPr>
+          <w:b w:val="0"/>
+        </w:rPr>
+        <w:t>Gli intervalli sono semiaperti per evitare file duplicate fra zone adiacenti. Steel Top Offset definisce esplicitamente la quota del lembo superiore rispetto all’asse. Copriferro, numero intero dei pioli e compatibilità geometrica sono controllati. Le geometrie non aggiungono elementi FEM; Details restituisce gli oggetti gPC per le verifiche.</w:t>
+      </w:r>
+    </w:p>
+    <w:p>
+      <w:pPr>
+        <w:pStyle w:val="Heading2"/>
+      </w:pPr>
+      <w:r>
+        <w:t>Frecce e controfreccia</w:t>
+      </w:r>
+    </w:p>
+    <w:p>
+      <w:r>
+        <w:rPr>
+          <w:b w:val="0"/>
+        </w:rPr>
+      </w:r>
+      <w:r>
+        <w:rPr>
+          <w:b/>
+        </w:rPr>
+        <w:t>Bridge Deflection &amp; Camber</w:t>
+      </w:r>
+      <w:r>
+        <w:rPr>
+          <w:b w:val="0"/>
+        </w:rPr>
+        <w:t>, esempio 42, legge spostamenti nodali per trave, caso e step. La relativa sottrae la corda fra gli appoggi deformati della campata. La controfreccia è l’opposto dello spostamento scelto moltiplicato per Camber Factor. Display Scale modifica solo le curve.</w:t>
+      </w:r>
+    </w:p>
+    <w:p>
+      <w:r>
+        <w:rPr>
+          <w:b w:val="0"/>
+        </w:rPr>
+        <w:t>L’esempio usa dati sintetici: a 15 m la freccia assoluta è −28 mm, la relativa −20 mm e la controfreccia +20 mm. Non sono risultati Straus. Con dati reali servono il modello analizzato e la stessa Bridge Geometry.</w:t>
+      </w:r>
+    </w:p>
+    <w:p>
+      <w:pPr>
+        <w:pStyle w:val="Heading2"/>
+      </w:pPr>
+      <w:r>
+        <w:t>Storie per fatica</w:t>
+      </w:r>
+    </w:p>
+    <w:p>
+      <w:r>
+        <w:rPr>
+          <w:b w:val="0"/>
+        </w:rPr>
+      </w:r>
+      <w:r>
+        <w:rPr>
+          <w:b/>
+        </w:rPr>
+        <w:t>Bridge Fatigue History</w:t>
+      </w:r>
+      <w:r>
+        <w:rPr>
+          <w:b w:val="0"/>
+        </w:rPr>
+        <w:t>, esempio 43, riceve valori ordinati o estrae una storia FEM nell’ordine di transito dichiarato. Il rainflow mantiene le mezze escursioni residue. Per la storia 0,10,2,8,0 si ottengono un ciclo di range 10 e uno di range 6. Con esponente 3 e un ciclo di riferimento il range equivalente è la radice cubica di 1216.</w:t>
+      </w:r>
+    </w:p>
+    <w:p>
+      <w:r>
+        <w:rPr>
+          <w:b w:val="0"/>
+        </w:rPr>
+        <w:t>Response Factors trasforma linearmente le sei azioni in una tensione o un flusso nelle unità dichiarate. Nessuna curva S–N, categoria di dettaglio, danno o traffico annuo è scelto automaticamente.</w:t>
+      </w:r>
+    </w:p>
+    <w:p>
+      <w:pPr>
+        <w:pStyle w:val="Heading2"/>
+      </w:pPr>
+      <w:r>
+        <w:t>Mappa delle verifiche</w:t>
+      </w:r>
+    </w:p>
+    <w:p>
+      <w:r>
+        <w:rPr>
+          <w:b w:val="0"/>
+        </w:rPr>
+      </w:r>
+      <w:r>
+        <w:rPr>
+          <w:b/>
+        </w:rPr>
+        <w:t>Bridge Check Map</w:t>
+      </w:r>
+      <w:r>
+        <w:rPr>
+          <w:b w:val="0"/>
+        </w:rPr>
+        <w:t>, esempio 44, abbina risultati gPC, ID asta, stazione e caso. Grigio significa dati numerici assenti, ambra controlli parziali, rosso rapporto sopra 1. Governing conserva fase/caso/stazione e massimi a pari merito. Le stazioni e gli stati limite non forniti restano fuori dalla mappa.</w:t>
+      </w:r>
+    </w:p>
+    <w:p>
+      <w:r>
+        <w:br w:type="page"/>
+      </w:r>
+    </w:p>
+    <w:p>
+      <w:pPr>
+        <w:pStyle w:val="Heading1"/>
+      </w:pPr>
+      <w:r>
+        <w:t>27  Eseguire gli esempi del modello completo</w:t>
+      </w:r>
+    </w:p>
+    <w:p>
+      <w:r>
+        <w:rPr>
+          <w:b w:val="0"/>
+        </w:rPr>
+        <w:t xml:space="preserve">Aprire </w:t>
+      </w:r>
+      <w:r>
+        <w:rPr>
+          <w:b/>
+        </w:rPr>
+        <w:t>example/45-ponte-completo-fasi/45-ponte-completo-fasi.ghx</w:t>
+      </w:r>
+      <w:r>
+        <w:rPr>
+          <w:b w:val="0"/>
+        </w:rPr>
+        <w:t>. Seguire da sinistra a destra: Simple Bridge, controventi, mesh soletta, assegnazione delle travi, appoggi e connessioni, Build Model, audit e tre snapshot.</w:t>
+      </w:r>
+    </w:p>
+    <w:p>
+      <w:r>
+        <w:rPr>
+          <w:b w:val="0"/>
+        </w:rPr>
+        <w:t>Il ponte curvo ha campate 30+40+30 m, tre travi, conci da 12 m, controventi Warren e soletta shell da 250 mm. Le fasi attivano acciaio, primo getto e soletta completa. Non ci sono carichi o risultati: è un esempio di assemblaggio da completare con dati di progetto e analisi.</w:t>
+      </w:r>
+    </w:p>
+    <w:tbl>
+      <w:tblPr>
+        <w:tblW w:type="auto" w:w="0"/>
+        <w:jc w:val="center"/>
+        <w:tblLayout w:type="fixed"/>
+        <w:tblLook w:firstColumn="1" w:firstRow="1" w:lastColumn="0" w:lastRow="0" w:noHBand="0" w:noVBand="1" w:val="04A0"/>
+        <w:tblBorders>
+          <w:top w:val="single" w:sz="4" w:color="D9D9D9"/>
+          <w:left w:val="single" w:sz="4" w:color="D9D9D9"/>
+          <w:bottom w:val="single" w:sz="4" w:color="D9D9D9"/>
+          <w:right w:val="single" w:sz="4" w:color="D9D9D9"/>
+          <w:insideH w:val="single" w:sz="4" w:color="D9D9D9"/>
+          <w:insideV w:val="single" w:sz="4" w:color="D9D9D9"/>
+        </w:tblBorders>
+      </w:tblPr>
+      <w:tblGrid>
+        <w:gridCol w:w="1152"/>
+        <w:gridCol w:w="8842"/>
+      </w:tblGrid>
+      <w:tr>
+        <w:trPr>
+          <w:tblHeader/>
+          <w:cantSplit/>
+        </w:trPr>
+        <w:tc>
+          <w:tcPr>
+            <w:tcW w:type="dxa" w:w="1152"/>
+            <w:vAlign w:val="center"/>
+            <w:tcMar>
+              <w:top w:w="75" w:type="dxa"/>
+              <w:bottom w:w="75" w:type="dxa"/>
+              <w:left w:w="100" w:type="dxa"/>
+              <w:right w:w="100" w:type="dxa"/>
+            </w:tcMar>
+            <w:shd w:fill="24465F"/>
+          </w:tcPr>
+          <w:p>
+            <w:pPr>
+              <w:spacing w:after="0" w:line="247" w:lineRule="auto"/>
+              <w:jc w:val="left"/>
+            </w:pPr>
+            <w:r>
+              <w:rPr>
+                <w:b/>
+                <w:color w:val="FFFFFF"/>
+                <w:sz w:val="20"/>
+              </w:rPr>
+              <w:t>Esempi</w:t>
+            </w:r>
+          </w:p>
+        </w:tc>
+        <w:tc>
+          <w:tcPr>
+            <w:tcW w:type="dxa" w:w="8842"/>
+            <w:vAlign w:val="center"/>
+            <w:tcMar>
+              <w:top w:w="75" w:type="dxa"/>
+              <w:bottom w:w="75" w:type="dxa"/>
+              <w:left w:w="100" w:type="dxa"/>
+              <w:right w:w="100" w:type="dxa"/>
+            </w:tcMar>
+            <w:shd w:fill="24465F"/>
+          </w:tcPr>
+          <w:p>
+            <w:pPr>
+              <w:spacing w:after="0" w:line="247" w:lineRule="auto"/>
+              <w:jc w:val="left"/>
+            </w:pPr>
+            <w:r>
+              <w:rPr>
+                <w:b/>
+                <w:color w:val="FFFFFF"/>
+                <w:sz w:val="20"/>
+              </w:rPr>
+              <w:t>Funzione da provare</w:t>
+            </w:r>
+          </w:p>
+        </w:tc>
+      </w:tr>
+      <w:tr>
+        <w:trPr>
+          <w:cantSplit/>
+        </w:trPr>
+        <w:tc>
+          <w:tcPr>
+            <w:tcW w:type="dxa" w:w="1152"/>
+            <w:vAlign w:val="center"/>
+            <w:tcMar>
+              <w:top w:w="75" w:type="dxa"/>
+              <w:bottom w:w="75" w:type="dxa"/>
+              <w:left w:w="100" w:type="dxa"/>
+              <w:right w:w="100" w:type="dxa"/>
+            </w:tcMar>
+            <w:shd w:fill="FFFFFF"/>
+          </w:tcPr>
+          <w:p>
+            <w:pPr>
+              <w:spacing w:after="0" w:line="247" w:lineRule="auto"/>
+              <w:jc w:val="left"/>
+            </w:pPr>
+            <w:r>
+              <w:rPr>
+                <w:b w:val="0"/>
+                <w:color w:val="000000"/>
+                <w:sz w:val="20"/>
+              </w:rPr>
+              <w:t>33</w:t>
+            </w:r>
+          </w:p>
+        </w:tc>
+        <w:tc>
+          <w:tcPr>
+            <w:tcW w:type="dxa" w:w="8842"/>
+            <w:vAlign w:val="center"/>
+            <w:tcMar>
+              <w:top w:w="75" w:type="dxa"/>
+              <w:bottom w:w="75" w:type="dxa"/>
+              <w:left w:w="100" w:type="dxa"/>
+              <w:right w:w="100" w:type="dxa"/>
+            </w:tcMar>
+            <w:shd w:fill="FFFFFF"/>
+          </w:tcPr>
+          <w:p>
+            <w:pPr>
+              <w:spacing w:after="0" w:line="247" w:lineRule="auto"/>
+              <w:jc w:val="left"/>
+            </w:pPr>
+            <w:r>
+              <w:rPr>
+                <w:b w:val="0"/>
+                <w:color w:val="000000"/>
+                <w:sz w:val="20"/>
+              </w:rPr>
+              <w:t>Distribuzione delle campate e zone vietate</w:t>
+            </w:r>
+          </w:p>
+        </w:tc>
+      </w:tr>
+      <w:tr>
+        <w:trPr>
+          <w:cantSplit/>
+        </w:trPr>
+        <w:tc>
+          <w:tcPr>
+            <w:tcW w:type="dxa" w:w="1152"/>
+            <w:vAlign w:val="center"/>
+            <w:tcMar>
+              <w:top w:w="75" w:type="dxa"/>
+              <w:bottom w:w="75" w:type="dxa"/>
+              <w:left w:w="100" w:type="dxa"/>
+              <w:right w:w="100" w:type="dxa"/>
+            </w:tcMar>
+            <w:shd w:fill="F2F5F7"/>
+          </w:tcPr>
+          <w:p>
+            <w:pPr>
+              <w:spacing w:after="0" w:line="247" w:lineRule="auto"/>
+              <w:jc w:val="left"/>
+            </w:pPr>
+            <w:r>
+              <w:rPr>
+                <w:b w:val="0"/>
+                <w:color w:val="000000"/>
+                <w:sz w:val="20"/>
+              </w:rPr>
+              <w:t>34–35</w:t>
+            </w:r>
+          </w:p>
+        </w:tc>
+        <w:tc>
+          <w:tcPr>
+            <w:tcW w:type="dxa" w:w="8842"/>
+            <w:vAlign w:val="center"/>
+            <w:tcMar>
+              <w:top w:w="75" w:type="dxa"/>
+              <w:bottom w:w="75" w:type="dxa"/>
+              <w:left w:w="100" w:type="dxa"/>
+              <w:right w:w="100" w:type="dxa"/>
+            </w:tcMar>
+            <w:shd w:fill="F2F5F7"/>
+          </w:tcPr>
+          <w:p>
+            <w:pPr>
+              <w:spacing w:after="0" w:line="247" w:lineRule="auto"/>
+              <w:jc w:val="left"/>
+            </w:pPr>
+            <w:r>
+              <w:rPr>
+                <w:b w:val="0"/>
+                <w:color w:val="000000"/>
+                <w:sz w:val="20"/>
+              </w:rPr>
+              <w:t>Sezioni per progressiva e assegnazione dei membri</w:t>
+            </w:r>
+          </w:p>
+        </w:tc>
+      </w:tr>
+      <w:tr>
+        <w:trPr>
+          <w:cantSplit/>
+        </w:trPr>
+        <w:tc>
+          <w:tcPr>
+            <w:tcW w:type="dxa" w:w="1152"/>
+            <w:vAlign w:val="center"/>
+            <w:tcMar>
+              <w:top w:w="75" w:type="dxa"/>
+              <w:bottom w:w="75" w:type="dxa"/>
+              <w:left w:w="100" w:type="dxa"/>
+              <w:right w:w="100" w:type="dxa"/>
+            </w:tcMar>
+            <w:shd w:fill="FFFFFF"/>
+          </w:tcPr>
+          <w:p>
+            <w:pPr>
+              <w:spacing w:after="0" w:line="247" w:lineRule="auto"/>
+              <w:jc w:val="left"/>
+            </w:pPr>
+            <w:r>
+              <w:rPr>
+                <w:b w:val="0"/>
+                <w:color w:val="000000"/>
+                <w:sz w:val="20"/>
+              </w:rPr>
+              <w:t>36–37</w:t>
+            </w:r>
+          </w:p>
+        </w:tc>
+        <w:tc>
+          <w:tcPr>
+            <w:tcW w:type="dxa" w:w="8842"/>
+            <w:vAlign w:val="center"/>
+            <w:tcMar>
+              <w:top w:w="75" w:type="dxa"/>
+              <w:bottom w:w="75" w:type="dxa"/>
+              <w:left w:w="100" w:type="dxa"/>
+              <w:right w:w="100" w:type="dxa"/>
+            </w:tcMar>
+            <w:shd w:fill="FFFFFF"/>
+          </w:tcPr>
+          <w:p>
+            <w:pPr>
+              <w:spacing w:after="0" w:line="247" w:lineRule="auto"/>
+              <w:jc w:val="left"/>
+            </w:pPr>
+            <w:r>
+              <w:rPr>
+                <w:b w:val="0"/>
+                <w:color w:val="000000"/>
+                <w:sz w:val="20"/>
+              </w:rPr>
+              <w:t>Appoggi, link rigidi, aste elastiche e offset</w:t>
+            </w:r>
+          </w:p>
+        </w:tc>
+      </w:tr>
+      <w:tr>
+        <w:trPr>
+          <w:cantSplit/>
+        </w:trPr>
+        <w:tc>
+          <w:tcPr>
+            <w:tcW w:type="dxa" w:w="1152"/>
+            <w:vAlign w:val="center"/>
+            <w:tcMar>
+              <w:top w:w="75" w:type="dxa"/>
+              <w:bottom w:w="75" w:type="dxa"/>
+              <w:left w:w="100" w:type="dxa"/>
+              <w:right w:w="100" w:type="dxa"/>
+            </w:tcMar>
+            <w:shd w:fill="F2F5F7"/>
+          </w:tcPr>
+          <w:p>
+            <w:pPr>
+              <w:spacing w:after="0" w:line="247" w:lineRule="auto"/>
+              <w:jc w:val="left"/>
+            </w:pPr>
+            <w:r>
+              <w:rPr>
+                <w:b w:val="0"/>
+                <w:color w:val="000000"/>
+                <w:sz w:val="20"/>
+              </w:rPr>
+              <w:t>38–39</w:t>
+            </w:r>
+          </w:p>
+        </w:tc>
+        <w:tc>
+          <w:tcPr>
+            <w:tcW w:type="dxa" w:w="8842"/>
+            <w:vAlign w:val="center"/>
+            <w:tcMar>
+              <w:top w:w="75" w:type="dxa"/>
+              <w:bottom w:w="75" w:type="dxa"/>
+              <w:left w:w="100" w:type="dxa"/>
+              <w:right w:w="100" w:type="dxa"/>
+            </w:tcMar>
+            <w:shd w:fill="F2F5F7"/>
+          </w:tcPr>
+          <w:p>
+            <w:pPr>
+              <w:spacing w:after="0" w:line="247" w:lineRule="auto"/>
+              <w:jc w:val="left"/>
+            </w:pPr>
+            <w:r>
+              <w:rPr>
+                <w:b w:val="0"/>
+                <w:color w:val="000000"/>
+                <w:sz w:val="20"/>
+              </w:rPr>
+              <w:t>Controventi e mesh soletta per getti</w:t>
+            </w:r>
+          </w:p>
+        </w:tc>
+      </w:tr>
+      <w:tr>
+        <w:trPr>
+          <w:cantSplit/>
+        </w:trPr>
+        <w:tc>
+          <w:tcPr>
+            <w:tcW w:type="dxa" w:w="1152"/>
+            <w:vAlign w:val="center"/>
+            <w:tcMar>
+              <w:top w:w="75" w:type="dxa"/>
+              <w:bottom w:w="75" w:type="dxa"/>
+              <w:left w:w="100" w:type="dxa"/>
+              <w:right w:w="100" w:type="dxa"/>
+            </w:tcMar>
+            <w:shd w:fill="FFFFFF"/>
+          </w:tcPr>
+          <w:p>
+            <w:pPr>
+              <w:spacing w:after="0" w:line="247" w:lineRule="auto"/>
+              <w:jc w:val="left"/>
+            </w:pPr>
+            <w:r>
+              <w:rPr>
+                <w:b w:val="0"/>
+                <w:color w:val="000000"/>
+                <w:sz w:val="20"/>
+              </w:rPr>
+              <w:t>40–41</w:t>
+            </w:r>
+          </w:p>
+        </w:tc>
+        <w:tc>
+          <w:tcPr>
+            <w:tcW w:type="dxa" w:w="8842"/>
+            <w:vAlign w:val="center"/>
+            <w:tcMar>
+              <w:top w:w="75" w:type="dxa"/>
+              <w:bottom w:w="75" w:type="dxa"/>
+              <w:left w:w="100" w:type="dxa"/>
+              <w:right w:w="100" w:type="dxa"/>
+            </w:tcMar>
+            <w:shd w:fill="FFFFFF"/>
+          </w:tcPr>
+          <w:p>
+            <w:pPr>
+              <w:spacing w:after="0" w:line="247" w:lineRule="auto"/>
+              <w:jc w:val="left"/>
+            </w:pPr>
+            <w:r>
+              <w:rPr>
+                <w:b w:val="0"/>
+                <w:color w:val="000000"/>
+                <w:sz w:val="20"/>
+              </w:rPr>
+              <w:t>Snapshot delle fasi e layout dei dettagli</w:t>
+            </w:r>
+          </w:p>
+        </w:tc>
+      </w:tr>
+      <w:tr>
+        <w:trPr>
+          <w:cantSplit/>
+        </w:trPr>
+        <w:tc>
+          <w:tcPr>
+            <w:tcW w:type="dxa" w:w="1152"/>
+            <w:vAlign w:val="center"/>
+            <w:tcMar>
+              <w:top w:w="75" w:type="dxa"/>
+              <w:bottom w:w="75" w:type="dxa"/>
+              <w:left w:w="100" w:type="dxa"/>
+              <w:right w:w="100" w:type="dxa"/>
+            </w:tcMar>
+            <w:shd w:fill="F2F5F7"/>
+          </w:tcPr>
+          <w:p>
+            <w:pPr>
+              <w:spacing w:after="0" w:line="247" w:lineRule="auto"/>
+              <w:jc w:val="left"/>
+            </w:pPr>
+            <w:r>
+              <w:rPr>
+                <w:b w:val="0"/>
+                <w:color w:val="000000"/>
+                <w:sz w:val="20"/>
+              </w:rPr>
+              <w:t>42–44</w:t>
+            </w:r>
+          </w:p>
+        </w:tc>
+        <w:tc>
+          <w:tcPr>
+            <w:tcW w:type="dxa" w:w="8842"/>
+            <w:vAlign w:val="center"/>
+            <w:tcMar>
+              <w:top w:w="75" w:type="dxa"/>
+              <w:bottom w:w="75" w:type="dxa"/>
+              <w:left w:w="100" w:type="dxa"/>
+              <w:right w:w="100" w:type="dxa"/>
+            </w:tcMar>
+            <w:shd w:fill="F2F5F7"/>
+          </w:tcPr>
+          <w:p>
+            <w:pPr>
+              <w:spacing w:after="0" w:line="247" w:lineRule="auto"/>
+              <w:jc w:val="left"/>
+            </w:pPr>
+            <w:r>
+              <w:rPr>
+                <w:b w:val="0"/>
+                <w:color w:val="000000"/>
+                <w:sz w:val="20"/>
+              </w:rPr>
+              <w:t>Frecce, storie per fatica e mappa delle verifiche</w:t>
+            </w:r>
+          </w:p>
+        </w:tc>
+      </w:tr>
+      <w:tr>
+        <w:trPr>
+          <w:cantSplit/>
+        </w:trPr>
+        <w:tc>
+          <w:tcPr>
+            <w:tcW w:type="dxa" w:w="1152"/>
+            <w:vAlign w:val="center"/>
+            <w:tcMar>
+              <w:top w:w="75" w:type="dxa"/>
+              <w:bottom w:w="75" w:type="dxa"/>
+              <w:left w:w="100" w:type="dxa"/>
+              <w:right w:w="100" w:type="dxa"/>
+            </w:tcMar>
+            <w:shd w:fill="FFFFFF"/>
+          </w:tcPr>
+          <w:p>
+            <w:pPr>
+              <w:spacing w:after="0" w:line="247" w:lineRule="auto"/>
+              <w:jc w:val="left"/>
+            </w:pPr>
+            <w:r>
+              <w:rPr>
+                <w:b w:val="0"/>
+                <w:color w:val="000000"/>
+                <w:sz w:val="20"/>
+              </w:rPr>
+              <w:t>45</w:t>
+            </w:r>
+          </w:p>
+        </w:tc>
+        <w:tc>
+          <w:tcPr>
+            <w:tcW w:type="dxa" w:w="8842"/>
+            <w:vAlign w:val="center"/>
+            <w:tcMar>
+              <w:top w:w="75" w:type="dxa"/>
+              <w:bottom w:w="75" w:type="dxa"/>
+              <w:left w:w="100" w:type="dxa"/>
+              <w:right w:w="100" w:type="dxa"/>
+            </w:tcMar>
+            <w:shd w:fill="FFFFFF"/>
+          </w:tcPr>
+          <w:p>
+            <w:pPr>
+              <w:spacing w:after="0" w:line="247" w:lineRule="auto"/>
+              <w:jc w:val="left"/>
+            </w:pPr>
+            <w:r>
+              <w:rPr>
+                <w:b w:val="0"/>
+                <w:color w:val="000000"/>
+                <w:sz w:val="20"/>
+              </w:rPr>
+              <w:t>Flusso completo fino al modello e alle fasi</w:t>
+            </w:r>
+          </w:p>
+        </w:tc>
+      </w:tr>
+    </w:tbl>
+    <w:p>
+      <w:pPr>
+        <w:spacing w:after="20" w:before="0" w:line="240" w:lineRule="auto"/>
+      </w:pPr>
+      <w:r>
+        <w:rPr>
+          <w:sz w:val="4"/>
+        </w:rPr>
+      </w:r>
+    </w:p>
+    <w:p>
+      <w:pPr>
+        <w:pStyle w:val="Heading2"/>
+      </w:pPr>
+      <w:r>
+        <w:t>Rigenerare e controllare</w:t>
+      </w:r>
+    </w:p>
+    <w:p>
+      <w:pPr>
+        <w:spacing w:after="40" w:line="240" w:lineRule="auto"/>
+      </w:pPr>
+      <w:r>
+        <w:rPr>
+          <w:rFonts w:ascii="Consolas" w:hAnsi="Consolas"/>
+          <w:sz w:val="18"/>
+        </w:rPr>
+        <w:t>dotnet run --project tests/BridGHe.Smoke -c Release -- `</w:t>
+      </w:r>
+    </w:p>
+    <w:p>
+      <w:pPr>
+        <w:spacing w:after="40" w:line="240" w:lineRule="auto"/>
+      </w:pPr>
+      <w:r>
+        <w:rPr>
+          <w:rFonts w:ascii="Consolas" w:hAnsi="Consolas"/>
+          <w:sz w:val="18"/>
+        </w:rPr>
+        <w:t xml:space="preserve">  --bridge-design-examples</w:t>
+      </w:r>
+    </w:p>
+    <w:p>
+      <w:pPr>
+        <w:spacing w:after="40" w:line="240" w:lineRule="auto"/>
+      </w:pPr>
+      <w:r>
+        <w:rPr>
+          <w:rFonts w:ascii="Consolas" w:hAnsi="Consolas"/>
+          <w:sz w:val="18"/>
+        </w:rPr>
+        <w:t>powershell -NoProfile -ExecutionPolicy Bypass `</w:t>
+      </w:r>
+    </w:p>
+    <w:p>
+      <w:pPr>
+        <w:spacing w:after="40" w:line="240" w:lineRule="auto"/>
+      </w:pPr>
+      <w:r>
+        <w:rPr>
+          <w:rFonts w:ascii="Consolas" w:hAnsi="Consolas"/>
+          <w:sz w:val="18"/>
+        </w:rPr>
+        <w:t xml:space="preserve">  -File tools/build.ps1 -Smoke</w:t>
+      </w:r>
+    </w:p>
+    <w:p>
+      <w:r>
+        <w:rPr>
+          <w:b w:val="0"/>
+        </w:rPr>
+        <w:t>Il generatore risolve, salva e riapre tredici GHX; ogni cartella contiene README e validation.json. Il test offline controlla dati, geometria, archivi e risultati noti senza avviare Straus. Fare una copia prima di rigenerare file modificati manualmente.</w:t>
+      </w:r>
+    </w:p>
+    <w:p>
+      <w:pPr>
+        <w:pStyle w:val="Heading2"/>
+      </w:pPr>
+      <w:r>
+        <w:t>Verifica nativa ancora necessaria</w:t>
+      </w:r>
+    </w:p>
+    <w:p>
+      <w:r>
+        <w:rPr>
+          <w:b w:val="0"/>
+        </w:rPr>
+        <w:t>Le nuove chiamate St7SetUCS e St7SetRigidLink provengono dagli include ufficiali Straus R3 installati. L’ultimo tentativo nativo ha restituito St7Init −8, hardware lock non disponibile. Con licenza API eseguire --bridge-bearings-native e --bridge-connections-native. La compilazione e i test GH non sostituiscono queste prove.</w:t>
+      </w:r>
+    </w:p>
     <w:sectPr>
       <w:headerReference w:type="default" r:id="rId9"/>
       <w:footerReference w:type="default" r:id="rId10"/>
@@ -14704,7 +16572,7 @@
       <w:rPr>
         <w:sz w:val="18"/>
       </w:rPr>
-      <w:t xml:space="preserve">19 ottobre 2026   •   </w:t>
+      <w:t xml:space="preserve">20 ottobre 2026   •   </w:t>
     </w:r>
     <w:fldSimple w:instr="PAGE"/>
   </w:p>

</xml_diff>

<commit_message>
docs: update operator guide with licensed native test results
</commit_message>
<xml_diff>
--- a/docs/BridGHe_Guida_operativa.docx
+++ b/docs/BridGHe_Guida_operativa.docx
@@ -9864,7 +9864,7 @@
         <w:rPr>
           <w:b w:val="0"/>
         </w:rPr>
-        <w:t>Stato alla data della guida: cinque scenari preparati e 11 controlli offline superati; la nuova esecuzione nativa resta da effettuare. Sul ponte completo occorrono anche posizionamento trasversale, combinazioni e controlli del campo di validità del verificatore.</w:t>
+        <w:t>Collaudo nativo superato: 5.377 confronti su 80 posizioni. Usare Axes = 1 per mantenere la gravità globale nel percorso inverso. Il tandem include ingresso e uscita: 13 divisioni generano 16 casi. Sul ponte completo restano da verificare ripartizione trasversale e combinazioni di progetto.</w:t>
       </w:r>
     </w:p>
     <w:p>
@@ -11533,7 +11533,7 @@
         <w:rPr>
           <w:b w:val="0"/>
         </w:rPr>
-        <w:t>La Release con gli esempi 33–45 supera i controlli offline. Per i ponti 11–18 si riportano replay già registrati. Questo aggiornamento non include nuove analisi Straus.</w:t>
+        <w:t>Collaudo nativo completato il 20 ottobre 2026. Le nuove analisi riguardano il ponte 19 e i carichi mobili. Per i ponti 11–18 si riportano i replay già registrati.</w:t>
       </w:r>
     </w:p>
     <w:tbl>
@@ -12041,7 +12041,7 @@
                 <w:color w:val="000000"/>
                 <w:sz w:val="20"/>
               </w:rPr>
-              <w:t>15 controlli offline; generazione e riapertura del grafo</w:t>
+              <w:t>4 analisi; 20 controlli; 12.192 valori ricampionati</w:t>
             </w:r>
           </w:p>
         </w:tc>
@@ -12068,7 +12068,7 @@
                 <w:color w:val="000000"/>
                 <w:sz w:val="20"/>
               </w:rPr>
-              <w:t>Nuovo calcolo Straus da eseguire</w:t>
+              <w:t>378 risultati di sezione; nessun errore GH</w:t>
             </w:r>
           </w:p>
         </w:tc>
@@ -12127,7 +12127,7 @@
                 <w:color w:val="000000"/>
                 <w:sz w:val="20"/>
               </w:rPr>
-              <w:t>5 scenari e 11 controlli offline</w:t>
+              <w:t>5 scenari; 80 posizioni; 5.377 confronti analitici</w:t>
             </w:r>
           </w:p>
         </w:tc>
@@ -12154,7 +12154,7 @@
                 <w:color w:val="000000"/>
                 <w:sz w:val="20"/>
               </w:rPr>
-              <w:t>Benchmark nativi da eseguire</w:t>
+              <w:t>Superati con Straus R3</w:t>
             </w:r>
           </w:p>
         </w:tc>
@@ -16538,7 +16538,7 @@
         <w:pStyle w:val="Heading2"/>
       </w:pPr>
       <w:r>
-        <w:t>Verifica nativa ancora necessaria</w:t>
+        <w:t>Verifica nativa completata</w:t>
       </w:r>
     </w:p>
     <w:p>
@@ -16546,7 +16546,7 @@
         <w:rPr>
           <w:b w:val="0"/>
         </w:rPr>
-        <w:t>Le nuove chiamate St7SetUCS e St7SetRigidLink provengono dagli include ufficiali Straus R3 installati. L’ultimo tentativo nativo ha restituito St7Init −8, hardware lock non disponibile. Con licenza API eseguire --bridge-bearings-native e --bridge-connections-native. La compilazione e i test GH non sostituiscono queste prove.</w:t>
+        <w:t>Il 20 ottobre 2026 sono superati --bridge-bearings-native e --bridge-connections-native: UCS, vincoli, molle e link spaziali riletti da Straus R3. Le prove verificano l’esportazione e non avviano il solver. L’esempio 45 resta un modello geometrico senza carichi né nuova analisi strutturale; il precedente blocco della licenza è risolto.</w:t>
       </w:r>
     </w:p>
     <w:sectPr>

</xml_diff>

<commit_message>
docs: add Excel combination workflow guide and example 46
</commit_message>
<xml_diff>
--- a/docs/BridGHe_Guida_operativa.docx
+++ b/docs/BridGHe_Guida_operativa.docx
@@ -16547,6 +16547,186 @@
           <w:b w:val="0"/>
         </w:rPr>
         <w:t>Il 20 ottobre 2026 sono superati --bridge-bearings-native e --bridge-connections-native: UCS, vincoli, molle e link spaziali riletti da Straus R3. Le prove verificano l’esportazione e non avviano il solver. L’esempio 45 resta un modello geometrico senza carichi né nuova analisi strutturale; il precedente blocco della licenza è risolto.</w:t>
+      </w:r>
+    </w:p>
+    <w:p>
+      <w:r>
+        <w:br w:type="page"/>
+      </w:r>
+    </w:p>
+    <w:p>
+      <w:pPr>
+        <w:pStyle w:val="Heading1"/>
+      </w:pPr>
+      <w:r>
+        <w:t>28  Creare e leggere il template Excel delle combinazioni</w:t>
+      </w:r>
+    </w:p>
+    <w:p>
+      <w:r>
+        <w:rPr>
+          <w:b w:val="0"/>
+        </w:rPr>
+      </w:r>
+      <w:r>
+        <w:rPr>
+          <w:b/>
+        </w:rPr>
+        <w:t>Bridge Combination Excel</w:t>
+      </w:r>
+      <w:r>
+        <w:rPr>
+          <w:b w:val="0"/>
+        </w:rPr>
+        <w:t>, in BridGHe / 04-Definitions, ricava le intestazioni dalle azioni delle fasi. Collegare gli stessi Models e Phases del Build. Ogni azione conserva il proprio modello e caso sorgente: l’ordine della lista Models non definisce i nomi delle colonne.</w:t>
+      </w:r>
+    </w:p>
+    <w:p>
+      <w:pPr>
+        <w:ind w:left="259" w:hanging="259"/>
+      </w:pPr>
+      <w:r>
+        <w:rPr>
+          <w:b w:val="0"/>
+        </w:rPr>
+      </w:r>
+      <w:r>
+        <w:rPr>
+          <w:b/>
+        </w:rPr>
+        <w:t>1.</w:t>
+      </w:r>
+      <w:r>
+        <w:rPr>
+          <w:b w:val="0"/>
+        </w:rPr>
+        <w:t xml:space="preserve"> Impostare File su un percorso .xlsx. Un nome relativo viene risolto nella cartella del GH salvato; per un documento non salvato usare un percorso assoluto.</w:t>
+      </w:r>
+    </w:p>
+    <w:p>
+      <w:pPr>
+        <w:ind w:left="259" w:hanging="259"/>
+      </w:pPr>
+      <w:r>
+        <w:rPr>
+          <w:b w:val="0"/>
+        </w:rPr>
+      </w:r>
+      <w:r>
+        <w:rPr>
+          <w:b/>
+        </w:rPr>
+        <w:t>2.</w:t>
+      </w:r>
+      <w:r>
+        <w:rPr>
+          <w:b w:val="0"/>
+        </w:rPr>
+        <w:t xml:space="preserve"> Con Mode = 0 premere Run. Il componente crea Combinations e Actions; Rows controlla le righe vuote, con default 20. Un file esistente viene sostituito solo con Overwrite = True esplicito, dopo aver chiuso Excel.</w:t>
+      </w:r>
+    </w:p>
+    <w:p>
+      <w:pPr>
+        <w:ind w:left="259" w:hanging="259"/>
+      </w:pPr>
+      <w:r>
+        <w:rPr>
+          <w:b w:val="0"/>
+        </w:rPr>
+      </w:r>
+      <w:r>
+        <w:rPr>
+          <w:b/>
+        </w:rPr>
+        <w:t>3.</w:t>
+      </w:r>
+      <w:r>
+        <w:rPr>
+          <w:b w:val="0"/>
+        </w:rPr>
+        <w:t xml:space="preserve"> In Combinations inserire un nome univoco in colonna A e tutti i coefficienti della riga. Usare 0 per le azioni inattive; le righe completamente vuote sono ignorate. Non aggiungere prefissi alle intestazioni.</w:t>
+      </w:r>
+    </w:p>
+    <w:p>
+      <w:pPr>
+        <w:ind w:left="259" w:hanging="259"/>
+      </w:pPr>
+      <w:r>
+        <w:rPr>
+          <w:b w:val="0"/>
+        </w:rPr>
+      </w:r>
+      <w:r>
+        <w:rPr>
+          <w:b/>
+        </w:rPr>
+        <w:t>4.</w:t>
+      </w:r>
+      <w:r>
+        <w:rPr>
+          <w:b w:val="0"/>
+        </w:rPr>
+        <w:t xml:space="preserve"> Salvare Excel, impostare Mode = 1 e premere Run. Collegare Table a Combinations di Build BridGHe Model e premere Run anche sul Build. Ripetere i due Run dopo ogni modifica ai coefficienti.</w:t>
+      </w:r>
+    </w:p>
+    <w:p>
+      <w:pPr>
+        <w:pStyle w:val="Heading2"/>
+      </w:pPr>
+      <w:r>
+        <w:t>Associazioni e controlli</w:t>
+      </w:r>
+    </w:p>
+    <w:p>
+      <w:r>
+        <w:rPr>
+          <w:b w:val="0"/>
+        </w:rPr>
+        <w:t>Actions documenta fase, modello, caso, comportamento, strain adimensionale e selezione delle aste; [] significa tutte le aste. Conservare il foglio invariato. La lettura confronta questi dati con le fasi correnti e rifiuta intestazioni errate, duplicati e coefficienti mancanti o non finiti. È ammesso riordinare le colonne di Combinations. Se cambiano le associazioni, generare un nuovo template e trasferire consapevolmente i coefficienti.</w:t>
+      </w:r>
+    </w:p>
+    <w:p>
+      <w:r>
+        <w:rPr>
+          <w:b w:val="0"/>
+        </w:rPr>
+        <w:t>Le formule numeriche usano il risultato salvato da Excel: ricalcolare e salvare prima di Read. Il plugin non esegue le formule e segnala l’uso dei valori salvati. La riapertura del GH non legge o scrive file; un errore di lettura svuota Table. Il template può precedere l’analisi se i casi sono già definiti: la mancanza dei risultati viene segnalata.</w:t>
+      </w:r>
+    </w:p>
+    <w:p>
+      <w:pPr>
+        <w:pStyle w:val="Heading2"/>
+      </w:pPr>
+      <w:r>
+        <w:t>Esempio 46</w:t>
+      </w:r>
+    </w:p>
+    <w:p>
+      <w:r>
+        <w:rPr>
+          <w:b w:val="0"/>
+        </w:rPr>
+        <w:t xml:space="preserve">Aprire </w:t>
+      </w:r>
+      <w:r>
+        <w:rPr>
+          <w:b/>
+        </w:rPr>
+        <w:t>example/46-combinazioni-excel/46-combinazioni-excel.ghx</w:t>
+      </w:r>
+      <w:r>
+        <w:rPr>
+          <w:b w:val="0"/>
+        </w:rPr>
+        <w:t>. Le tre fasi contengono G1, G2, Q e RITIRO, mentre tutti i casi sorgente si chiamano G. Combinations.xlsx contiene due righe DEMO; Template.xlsx è vuoto. Un coefficiente RITIRO moltiplica insieme il contributo FEM e la deformazione primaria. I campioni su due aste sono sintetici e non richiedono Straus.</w:t>
+      </w:r>
+    </w:p>
+    <w:p>
+      <w:r>
+        <w:rPr>
+          <w:b w:val="0"/>
+        </w:rPr>
+        <w:t>Non vengono assegnati coefficienti normativi. I nomi come SLU_01 sono etichette e non selezionano lo stato limite: Super Element Check usa attualmente Rare. Il generatore automatico delle combinazioni è previsto come attività successiva.</w:t>
       </w:r>
     </w:p>
     <w:sectPr>

</xml_diff>

<commit_message>
docs: explain stud and stiffener checks and the model workflow
</commit_message>
<xml_diff>
--- a/docs/BridGHe_Guida_operativa.docx
+++ b/docs/BridGHe_Guida_operativa.docx
@@ -16727,6 +16727,1839 @@
           <w:b w:val="0"/>
         </w:rPr>
         <w:t>Non vengono assegnati coefficienti normativi. I nomi come SLU_01 sono etichette e non selezionano lo stato limite: Super Element Check usa attualmente Rare. Il generatore automatico delle combinazioni è previsto come attività successiva.</w:t>
+      </w:r>
+    </w:p>
+    <w:p>
+      <w:r>
+        <w:br w:type="page"/>
+      </w:r>
+    </w:p>
+    <w:p>
+      <w:pPr>
+        <w:pStyle w:val="Heading1"/>
+      </w:pPr>
+      <w:r>
+        <w:t>29  Impostare pioli e irrigidimenti</w:t>
+      </w:r>
+    </w:p>
+    <w:p>
+      <w:r>
+        <w:rPr>
+          <w:b w:val="0"/>
+        </w:rPr>
+        <w:t>L’</w:t>
+      </w:r>
+      <w:r>
+        <w:rPr>
+          <w:b/>
+        </w:rPr>
+        <w:t>esempio 47</w:t>
+      </w:r>
+      <w:r>
+        <w:rPr>
+          <w:b w:val="0"/>
+        </w:rPr>
+        <w:t xml:space="preserve"> contiene due definizioni: 47-pioli-irrigidimenti-verifiche.ghx per imparare il calcolo locale e 47-integrazione-modello.ghx per collegarlo ai risultati Straus del superelemento. I file sono in example/47-pioli-irrigidimenti-verifiche; il README descrive tutti gli input, i limiti e i test.</w:t>
+      </w:r>
+    </w:p>
+    <w:p>
+      <w:pPr>
+        <w:pStyle w:val="Heading2"/>
+      </w:pPr>
+      <w:r>
+        <w:t>Distinguere il disegno dal calcolo</w:t>
+      </w:r>
+    </w:p>
+    <w:p>
+      <w:r>
+        <w:rPr>
+          <w:b w:val="0"/>
+        </w:rPr>
+        <w:t>Bridge Detail Layout disegna pioli e piatti su una geometria Simple Bridge. Non aggiunge rigidezza o elementi FEM. Le stesse definizioni Bridge Studs, Bridge Intermediate Stiffener e Bridge Support Stiffener alimentano il verificatore GPC. Gli intermedi contribuiscono all’idoneità dei pannelli d’anima; gli irrigidimenti d’appoggio ricevono anche una reazione compressiva esplicitamente assegnata.</w:t>
+      </w:r>
+    </w:p>
+    <w:tbl>
+      <w:tblPr>
+        <w:tblW w:type="auto" w:w="0"/>
+        <w:jc w:val="center"/>
+        <w:tblLayout w:type="fixed"/>
+        <w:tblLook w:firstColumn="1" w:firstRow="1" w:lastColumn="0" w:lastRow="0" w:noHBand="0" w:noVBand="1" w:val="04A0"/>
+        <w:tblBorders>
+          <w:top w:val="single" w:sz="4" w:color="D9D9D9"/>
+          <w:left w:val="single" w:sz="4" w:color="D9D9D9"/>
+          <w:bottom w:val="single" w:sz="4" w:color="D9D9D9"/>
+          <w:right w:val="single" w:sz="4" w:color="D9D9D9"/>
+          <w:insideH w:val="single" w:sz="4" w:color="D9D9D9"/>
+          <w:insideV w:val="single" w:sz="4" w:color="D9D9D9"/>
+        </w:tblBorders>
+      </w:tblPr>
+      <w:tblGrid>
+        <w:gridCol w:w="3816"/>
+        <w:gridCol w:w="6178"/>
+      </w:tblGrid>
+      <w:tr>
+        <w:trPr>
+          <w:tblHeader/>
+          <w:cantSplit/>
+        </w:trPr>
+        <w:tc>
+          <w:tcPr>
+            <w:tcW w:type="dxa" w:w="3816"/>
+            <w:vAlign w:val="center"/>
+            <w:tcMar>
+              <w:top w:w="75" w:type="dxa"/>
+              <w:bottom w:w="75" w:type="dxa"/>
+              <w:left w:w="100" w:type="dxa"/>
+              <w:right w:w="100" w:type="dxa"/>
+            </w:tcMar>
+            <w:shd w:fill="24465F"/>
+          </w:tcPr>
+          <w:p>
+            <w:pPr>
+              <w:spacing w:after="0" w:line="247" w:lineRule="auto"/>
+              <w:jc w:val="left"/>
+            </w:pPr>
+            <w:r>
+              <w:rPr>
+                <w:b/>
+                <w:color w:val="FFFFFF"/>
+                <w:sz w:val="20"/>
+              </w:rPr>
+              <w:t>Dato del benchmark locale</w:t>
+            </w:r>
+          </w:p>
+        </w:tc>
+        <w:tc>
+          <w:tcPr>
+            <w:tcW w:type="dxa" w:w="6178"/>
+            <w:vAlign w:val="center"/>
+            <w:tcMar>
+              <w:top w:w="75" w:type="dxa"/>
+              <w:bottom w:w="75" w:type="dxa"/>
+              <w:left w:w="100" w:type="dxa"/>
+              <w:right w:w="100" w:type="dxa"/>
+            </w:tcMar>
+            <w:shd w:fill="24465F"/>
+          </w:tcPr>
+          <w:p>
+            <w:pPr>
+              <w:spacing w:after="0" w:line="247" w:lineRule="auto"/>
+              <w:jc w:val="left"/>
+            </w:pPr>
+            <w:r>
+              <w:rPr>
+                <w:b/>
+                <w:color w:val="FFFFFF"/>
+                <w:sz w:val="20"/>
+              </w:rPr>
+              <w:t>Valore</w:t>
+            </w:r>
+          </w:p>
+        </w:tc>
+      </w:tr>
+      <w:tr>
+        <w:trPr>
+          <w:cantSplit/>
+        </w:trPr>
+        <w:tc>
+          <w:tcPr>
+            <w:tcW w:type="dxa" w:w="3816"/>
+            <w:vAlign w:val="center"/>
+            <w:tcMar>
+              <w:top w:w="75" w:type="dxa"/>
+              <w:bottom w:w="75" w:type="dxa"/>
+              <w:left w:w="100" w:type="dxa"/>
+              <w:right w:w="100" w:type="dxa"/>
+            </w:tcMar>
+            <w:shd w:fill="FFFFFF"/>
+          </w:tcPr>
+          <w:p>
+            <w:pPr>
+              <w:spacing w:after="0" w:line="247" w:lineRule="auto"/>
+              <w:jc w:val="left"/>
+            </w:pPr>
+            <w:r>
+              <w:rPr>
+                <w:b w:val="0"/>
+                <w:color w:val="000000"/>
+                <w:sz w:val="20"/>
+              </w:rPr>
+              <w:t>Ponte / zona del dettaglio</w:t>
+            </w:r>
+          </w:p>
+        </w:tc>
+        <w:tc>
+          <w:tcPr>
+            <w:tcW w:type="dxa" w:w="6178"/>
+            <w:vAlign w:val="center"/>
+            <w:tcMar>
+              <w:top w:w="75" w:type="dxa"/>
+              <w:bottom w:w="75" w:type="dxa"/>
+              <w:left w:w="100" w:type="dxa"/>
+              <w:right w:w="100" w:type="dxa"/>
+            </w:tcMar>
+            <w:shd w:fill="FFFFFF"/>
+          </w:tcPr>
+          <w:p>
+            <w:pPr>
+              <w:spacing w:after="0" w:line="247" w:lineRule="auto"/>
+              <w:jc w:val="left"/>
+            </w:pPr>
+            <w:r>
+              <w:rPr>
+                <w:b w:val="0"/>
+                <w:color w:val="000000"/>
+                <w:sz w:val="20"/>
+              </w:rPr>
+              <w:t>3 travi; campate 30+40+30 m; G2 tra 26 e 34 m</w:t>
+            </w:r>
+          </w:p>
+        </w:tc>
+      </w:tr>
+      <w:tr>
+        <w:trPr>
+          <w:cantSplit/>
+        </w:trPr>
+        <w:tc>
+          <w:tcPr>
+            <w:tcW w:type="dxa" w:w="3816"/>
+            <w:vAlign w:val="center"/>
+            <w:tcMar>
+              <w:top w:w="75" w:type="dxa"/>
+              <w:bottom w:w="75" w:type="dxa"/>
+              <w:left w:w="100" w:type="dxa"/>
+              <w:right w:w="100" w:type="dxa"/>
+            </w:tcMar>
+            <w:shd w:fill="F2F5F7"/>
+          </w:tcPr>
+          <w:p>
+            <w:pPr>
+              <w:spacing w:after="0" w:line="247" w:lineRule="auto"/>
+              <w:jc w:val="left"/>
+            </w:pPr>
+            <w:r>
+              <w:rPr>
+                <w:b w:val="0"/>
+                <w:color w:val="000000"/>
+                <w:sz w:val="20"/>
+              </w:rPr>
+              <w:t>Sezione ad H / soletta efficace</w:t>
+            </w:r>
+          </w:p>
+        </w:tc>
+        <w:tc>
+          <w:tcPr>
+            <w:tcW w:type="dxa" w:w="6178"/>
+            <w:vAlign w:val="center"/>
+            <w:tcMar>
+              <w:top w:w="75" w:type="dxa"/>
+              <w:bottom w:w="75" w:type="dxa"/>
+              <w:left w:w="100" w:type="dxa"/>
+              <w:right w:w="100" w:type="dxa"/>
+            </w:tcMar>
+            <w:shd w:fill="F2F5F7"/>
+          </w:tcPr>
+          <w:p>
+            <w:pPr>
+              <w:spacing w:after="0" w:line="247" w:lineRule="auto"/>
+              <w:jc w:val="left"/>
+            </w:pPr>
+            <w:r>
+              <w:rPr>
+                <w:b w:val="0"/>
+                <w:color w:val="000000"/>
+                <w:sz w:val="20"/>
+              </w:rPr>
+              <w:t>Anima 1330×16; ali 450×30 e 600×40; soletta 2200×250 mm</w:t>
+            </w:r>
+          </w:p>
+        </w:tc>
+      </w:tr>
+      <w:tr>
+        <w:trPr>
+          <w:cantSplit/>
+        </w:trPr>
+        <w:tc>
+          <w:tcPr>
+            <w:tcW w:type="dxa" w:w="3816"/>
+            <w:vAlign w:val="center"/>
+            <w:tcMar>
+              <w:top w:w="75" w:type="dxa"/>
+              <w:bottom w:w="75" w:type="dxa"/>
+              <w:left w:w="100" w:type="dxa"/>
+              <w:right w:w="100" w:type="dxa"/>
+            </w:tcMar>
+            <w:shd w:fill="FFFFFF"/>
+          </w:tcPr>
+          <w:p>
+            <w:pPr>
+              <w:spacing w:after="0" w:line="247" w:lineRule="auto"/>
+              <w:jc w:val="left"/>
+            </w:pPr>
+            <w:r>
+              <w:rPr>
+                <w:b w:val="0"/>
+                <w:color w:val="000000"/>
+                <w:sz w:val="20"/>
+              </w:rPr>
+              <w:t>Materiali / armatura longitudinale</w:t>
+            </w:r>
+          </w:p>
+        </w:tc>
+        <w:tc>
+          <w:tcPr>
+            <w:tcW w:type="dxa" w:w="6178"/>
+            <w:vAlign w:val="center"/>
+            <w:tcMar>
+              <w:top w:w="75" w:type="dxa"/>
+              <w:bottom w:w="75" w:type="dxa"/>
+              <w:left w:w="100" w:type="dxa"/>
+              <w:right w:w="100" w:type="dxa"/>
+            </w:tcMar>
+            <w:shd w:fill="FFFFFF"/>
+          </w:tcPr>
+          <w:p>
+            <w:pPr>
+              <w:spacing w:after="0" w:line="247" w:lineRule="auto"/>
+              <w:jc w:val="left"/>
+            </w:pPr>
+            <w:r>
+              <w:rPr>
+                <w:b w:val="0"/>
+                <w:color w:val="000000"/>
+                <w:sz w:val="20"/>
+              </w:rPr>
+              <w:t>S355, C30, B450; due file Ø16/150, asse a 40 mm</w:t>
+            </w:r>
+          </w:p>
+        </w:tc>
+      </w:tr>
+      <w:tr>
+        <w:trPr>
+          <w:cantSplit/>
+        </w:trPr>
+        <w:tc>
+          <w:tcPr>
+            <w:tcW w:type="dxa" w:w="3816"/>
+            <w:vAlign w:val="center"/>
+            <w:tcMar>
+              <w:top w:w="75" w:type="dxa"/>
+              <w:bottom w:w="75" w:type="dxa"/>
+              <w:left w:w="100" w:type="dxa"/>
+              <w:right w:w="100" w:type="dxa"/>
+            </w:tcMar>
+            <w:shd w:fill="F2F5F7"/>
+          </w:tcPr>
+          <w:p>
+            <w:pPr>
+              <w:spacing w:after="0" w:line="247" w:lineRule="auto"/>
+              <w:jc w:val="left"/>
+            </w:pPr>
+            <w:r>
+              <w:rPr>
+                <w:b w:val="0"/>
+                <w:color w:val="000000"/>
+                <w:sz w:val="20"/>
+              </w:rPr>
+              <w:t>Pioli</w:t>
+            </w:r>
+          </w:p>
+        </w:tc>
+        <w:tc>
+          <w:tcPr>
+            <w:tcW w:type="dxa" w:w="6178"/>
+            <w:vAlign w:val="center"/>
+            <w:tcMar>
+              <w:top w:w="75" w:type="dxa"/>
+              <w:bottom w:w="75" w:type="dxa"/>
+              <w:left w:w="100" w:type="dxa"/>
+              <w:right w:w="100" w:type="dxa"/>
+            </w:tcMar>
+            <w:shd w:fill="F2F5F7"/>
+          </w:tcPr>
+          <w:p>
+            <w:pPr>
+              <w:spacing w:after="0" w:line="247" w:lineRule="auto"/>
+              <w:jc w:val="left"/>
+            </w:pPr>
+            <w:r>
+              <w:rPr>
+                <w:b w:val="0"/>
+                <w:color w:val="000000"/>
+                <w:sz w:val="20"/>
+              </w:rPr>
+              <w:t>2 per fila, Ø22 H180; passo 200 mm, trasversale 150 mm</w:t>
+            </w:r>
+          </w:p>
+        </w:tc>
+      </w:tr>
+      <w:tr>
+        <w:trPr>
+          <w:cantSplit/>
+        </w:trPr>
+        <w:tc>
+          <w:tcPr>
+            <w:tcW w:type="dxa" w:w="3816"/>
+            <w:vAlign w:val="center"/>
+            <w:tcMar>
+              <w:top w:w="75" w:type="dxa"/>
+              <w:bottom w:w="75" w:type="dxa"/>
+              <w:left w:w="100" w:type="dxa"/>
+              <w:right w:w="100" w:type="dxa"/>
+            </w:tcMar>
+            <w:shd w:fill="FFFFFF"/>
+          </w:tcPr>
+          <w:p>
+            <w:pPr>
+              <w:spacing w:after="0" w:line="247" w:lineRule="auto"/>
+              <w:jc w:val="left"/>
+            </w:pPr>
+            <w:r>
+              <w:rPr>
+                <w:b w:val="0"/>
+                <w:color w:val="000000"/>
+                <w:sz w:val="20"/>
+              </w:rPr>
+              <w:t>Irrigidimenti intermedi</w:t>
+            </w:r>
+          </w:p>
+        </w:tc>
+        <w:tc>
+          <w:tcPr>
+            <w:tcW w:type="dxa" w:w="6178"/>
+            <w:vAlign w:val="center"/>
+            <w:tcMar>
+              <w:top w:w="75" w:type="dxa"/>
+              <w:bottom w:w="75" w:type="dxa"/>
+              <w:left w:w="100" w:type="dxa"/>
+              <w:right w:w="100" w:type="dxa"/>
+            </w:tcMar>
+            <w:shd w:fill="FFFFFF"/>
+          </w:tcPr>
+          <w:p>
+            <w:pPr>
+              <w:spacing w:after="0" w:line="247" w:lineRule="auto"/>
+              <w:jc w:val="left"/>
+            </w:pPr>
+            <w:r>
+              <w:rPr>
+                <w:b w:val="0"/>
+                <w:color w:val="000000"/>
+                <w:sz w:val="20"/>
+              </w:rPr>
+              <w:t>Coppia 200×20 mm; pannelli 2 m; N aggiuntivo 100 kN</w:t>
+            </w:r>
+          </w:p>
+        </w:tc>
+      </w:tr>
+      <w:tr>
+        <w:trPr>
+          <w:cantSplit/>
+        </w:trPr>
+        <w:tc>
+          <w:tcPr>
+            <w:tcW w:type="dxa" w:w="3816"/>
+            <w:vAlign w:val="center"/>
+            <w:tcMar>
+              <w:top w:w="75" w:type="dxa"/>
+              <w:bottom w:w="75" w:type="dxa"/>
+              <w:left w:w="100" w:type="dxa"/>
+              <w:right w:w="100" w:type="dxa"/>
+            </w:tcMar>
+            <w:shd w:fill="F2F5F7"/>
+          </w:tcPr>
+          <w:p>
+            <w:pPr>
+              <w:spacing w:after="0" w:line="247" w:lineRule="auto"/>
+              <w:jc w:val="left"/>
+            </w:pPr>
+            <w:r>
+              <w:rPr>
+                <w:b w:val="0"/>
+                <w:color w:val="000000"/>
+                <w:sz w:val="20"/>
+              </w:rPr>
+              <w:t>Irrigidimento d’appoggio interno</w:t>
+            </w:r>
+          </w:p>
+        </w:tc>
+        <w:tc>
+          <w:tcPr>
+            <w:tcW w:type="dxa" w:w="6178"/>
+            <w:vAlign w:val="center"/>
+            <w:tcMar>
+              <w:top w:w="75" w:type="dxa"/>
+              <w:bottom w:w="75" w:type="dxa"/>
+              <w:left w:w="100" w:type="dxa"/>
+              <w:right w:w="100" w:type="dxa"/>
+            </w:tcMar>
+            <w:shd w:fill="F2F5F7"/>
+          </w:tcPr>
+          <w:p>
+            <w:pPr>
+              <w:spacing w:after="0" w:line="247" w:lineRule="auto"/>
+              <w:jc w:val="left"/>
+            </w:pPr>
+            <w:r>
+              <w:rPr>
+                <w:b w:val="0"/>
+                <w:color w:val="000000"/>
+                <w:sz w:val="20"/>
+              </w:rPr>
+              <w:t>Coppia 200×25 mm; R=900 kN; impronta 400×600 mm</w:t>
+            </w:r>
+          </w:p>
+        </w:tc>
+      </w:tr>
+      <w:tr>
+        <w:trPr>
+          <w:cantSplit/>
+        </w:trPr>
+        <w:tc>
+          <w:tcPr>
+            <w:tcW w:type="dxa" w:w="3816"/>
+            <w:vAlign w:val="center"/>
+            <w:tcMar>
+              <w:top w:w="75" w:type="dxa"/>
+              <w:bottom w:w="75" w:type="dxa"/>
+              <w:left w:w="100" w:type="dxa"/>
+              <w:right w:w="100" w:type="dxa"/>
+            </w:tcMar>
+            <w:shd w:fill="FFFFFF"/>
+          </w:tcPr>
+          <w:p>
+            <w:pPr>
+              <w:spacing w:after="0" w:line="247" w:lineRule="auto"/>
+              <w:jc w:val="left"/>
+            </w:pPr>
+            <w:r>
+              <w:rPr>
+                <w:b w:val="0"/>
+                <w:color w:val="000000"/>
+                <w:sz w:val="20"/>
+              </w:rPr>
+              <w:t>Saldature / eccentricità</w:t>
+            </w:r>
+          </w:p>
+        </w:tc>
+        <w:tc>
+          <w:tcPr>
+            <w:tcW w:type="dxa" w:w="6178"/>
+            <w:vAlign w:val="center"/>
+            <w:tcMar>
+              <w:top w:w="75" w:type="dxa"/>
+              <w:bottom w:w="75" w:type="dxa"/>
+              <w:left w:w="100" w:type="dxa"/>
+              <w:right w:w="100" w:type="dxa"/>
+            </w:tcMar>
+            <w:shd w:fill="FFFFFF"/>
+          </w:tcPr>
+          <w:p>
+            <w:pPr>
+              <w:spacing w:after="0" w:line="247" w:lineRule="auto"/>
+              <w:jc w:val="left"/>
+            </w:pPr>
+            <w:r>
+              <w:rPr>
+                <w:b w:val="0"/>
+                <w:color w:val="000000"/>
+                <w:sz w:val="20"/>
+              </w:rPr>
+              <w:t>Gola 6 mm intermedi, 10 mm appoggio; eccentricità nulle</w:t>
+            </w:r>
+          </w:p>
+        </w:tc>
+      </w:tr>
+    </w:tbl>
+    <w:p>
+      <w:pPr>
+        <w:spacing w:after="20" w:before="0" w:line="240" w:lineRule="auto"/>
+      </w:pPr>
+      <w:r>
+        <w:rPr>
+          <w:sz w:val="4"/>
+        </w:rPr>
+      </w:r>
+    </w:p>
+    <w:p>
+      <w:pPr>
+        <w:ind w:left="259" w:hanging="259"/>
+      </w:pPr>
+      <w:r>
+        <w:rPr>
+          <w:b w:val="0"/>
+        </w:rPr>
+      </w:r>
+      <w:r>
+        <w:rPr>
+          <w:b/>
+        </w:rPr>
+        <w:t>1.</w:t>
+      </w:r>
+      <w:r>
+        <w:rPr>
+          <w:b w:val="0"/>
+        </w:rPr>
+        <w:t xml:space="preserve"> Aprire il primo GHX. I pannelli gialli collegati agli input sono modificabili. Attivare la preview di Simple Bridge per vedere l’intero ponte; Layout mostra il dettaglio G2.</w:t>
+      </w:r>
+    </w:p>
+    <w:p>
+      <w:pPr>
+        <w:ind w:left="259" w:hanging="259"/>
+      </w:pPr>
+      <w:r>
+        <w:rPr>
+          <w:b w:val="0"/>
+        </w:rPr>
+      </w:r>
+      <w:r>
+        <w:rPr>
+          <w:b/>
+        </w:rPr>
+        <w:t>2.</w:t>
+      </w:r>
+      <w:r>
+        <w:rPr>
+          <w:b w:val="0"/>
+        </w:rPr>
+        <w:t xml:space="preserve"> Controllare le quote: asse trave −1500 mm e Steel Top Offset=1250 mm portano la faccia superiore dell’acciaio a −250 mm. I pioli terminano a −70 mm; restano 70 mm fino all’estradosso.</w:t>
+      </w:r>
+    </w:p>
+    <w:p>
+      <w:pPr>
+        <w:ind w:left="259" w:hanging="259"/>
+      </w:pPr>
+      <w:r>
+        <w:rPr>
+          <w:b w:val="0"/>
+        </w:rPr>
+      </w:r>
+      <w:r>
+        <w:rPr>
+          <w:b/>
+        </w:rPr>
+        <w:t>3.</w:t>
+      </w:r>
+      <w:r>
+        <w:rPr>
+          <w:b w:val="0"/>
+        </w:rPr>
+        <w:t xml:space="preserve"> Leggere le quantità: 40 file da due pioli nell’intervallo [26,34) m; due coppie intermedie a 28 e 32 m e una coppia d’appoggio a 30 m. In totale 80 pioli e 6 piatti.</w:t>
+      </w:r>
+    </w:p>
+    <w:p>
+      <w:r>
+        <w:rPr>
+          <w:b w:val="0"/>
+        </w:rPr>
+        <w:t>Width è lo sbalzo di ciascun piatto, non la larghezza della coppia. Le stazioni del layout non aggiornano automaticamente gli input delle definizioni originali: se si modifica la disposizione, riallineare i pannelli di verifica. Details di Layout è una lista mista di definizioni: selezionare tipo e stazione corretti, senza passarla interamente a Section Check.</w:t>
+      </w:r>
+    </w:p>
+    <w:p>
+      <w:r>
+        <w:br w:type="page"/>
+      </w:r>
+    </w:p>
+    <w:p>
+      <w:pPr>
+        <w:pStyle w:val="Heading1"/>
+      </w:pPr>
+      <w:r>
+        <w:t>30  Leggere i risultati e confrontare i dettagli</w:t>
+      </w:r>
+    </w:p>
+    <w:p>
+      <w:r>
+        <w:rPr>
+          <w:b w:val="0"/>
+        </w:rPr>
+        <w:t>Il benchmark assegna tre incrementi di taglio: 300 kN su acciaio, 200 kN sul misto lento con Phi=2, 800 kN sul misto istantaneo con Phi=0; segue ritiro −200 microstrain con Phi=2. Gli incrementi meccanici hanno N=M=T=0. Sono azioni locali dimostrative, non sollecitazioni ricavate dal ponte della preview.</w:t>
+      </w:r>
+    </w:p>
+    <w:p>
+      <w:r>
+        <w:rPr>
+          <w:b w:val="0"/>
+        </w:rPr>
+        <w:t>Il taglio finale è 1300 kN. Il flusso di connessione è 611.137 N/mm, pari a 611.137 kN/m: 103.484 dalla fase lenta e 507.653 da quella istantanea. La fase acciaio e il ritiro uniforme non aggiungono qui flusso. Gli effetti di estremità e le azioni secondarie da vincolo richiedono dati specifici.</w:t>
+      </w:r>
+    </w:p>
+    <w:p>
+      <w:pPr>
+        <w:pStyle w:val="Heading2"/>
+      </w:pPr>
+      <w:r>
+        <w:t>Pioli</w:t>
+      </w:r>
+    </w:p>
+    <w:p>
+      <w:r>
+        <w:rPr>
+          <w:b w:val="0"/>
+        </w:rPr>
+        <w:t>Per la H dell’esempio, PEd si ottiene moltiplicando il valore assoluto del flusso per il passo e dividendo per i due pioli della fila; dividere poi per 1000 per passare da N a kN. La resistenza GPC del singolo piolo è 109.478 kN. Il controllo indipendente del ramo acciaio è descritto nel README.</w:t>
+      </w:r>
+    </w:p>
+    <w:tbl>
+      <w:tblPr>
+        <w:tblW w:type="auto" w:w="0"/>
+        <w:jc w:val="center"/>
+        <w:tblLayout w:type="fixed"/>
+        <w:tblLook w:firstColumn="1" w:firstRow="1" w:lastColumn="0" w:lastRow="0" w:noHBand="0" w:noVBand="1" w:val="04A0"/>
+        <w:tblBorders>
+          <w:top w:val="single" w:sz="4" w:color="D9D9D9"/>
+          <w:left w:val="single" w:sz="4" w:color="D9D9D9"/>
+          <w:bottom w:val="single" w:sz="4" w:color="D9D9D9"/>
+          <w:right w:val="single" w:sz="4" w:color="D9D9D9"/>
+          <w:insideH w:val="single" w:sz="4" w:color="D9D9D9"/>
+          <w:insideV w:val="single" w:sz="4" w:color="D9D9D9"/>
+        </w:tblBorders>
+      </w:tblPr>
+      <w:tblGrid>
+        <w:gridCol w:w="3082"/>
+        <w:gridCol w:w="1728"/>
+        <w:gridCol w:w="1728"/>
+        <w:gridCol w:w="1728"/>
+        <w:gridCol w:w="1728"/>
+      </w:tblGrid>
+      <w:tr>
+        <w:trPr>
+          <w:tblHeader/>
+          <w:cantSplit/>
+        </w:trPr>
+        <w:tc>
+          <w:tcPr>
+            <w:tcW w:type="dxa" w:w="3082"/>
+            <w:vAlign w:val="center"/>
+            <w:tcMar>
+              <w:top w:w="75" w:type="dxa"/>
+              <w:bottom w:w="75" w:type="dxa"/>
+              <w:left w:w="100" w:type="dxa"/>
+              <w:right w:w="100" w:type="dxa"/>
+            </w:tcMar>
+            <w:shd w:fill="24465F"/>
+          </w:tcPr>
+          <w:p>
+            <w:pPr>
+              <w:spacing w:after="0" w:line="247" w:lineRule="auto"/>
+              <w:jc w:val="left"/>
+            </w:pPr>
+            <w:r>
+              <w:rPr>
+                <w:b/>
+                <w:color w:val="FFFFFF"/>
+                <w:sz w:val="20"/>
+              </w:rPr>
+              <w:t>Caso</w:t>
+            </w:r>
+          </w:p>
+        </w:tc>
+        <w:tc>
+          <w:tcPr>
+            <w:tcW w:type="dxa" w:w="1728"/>
+            <w:vAlign w:val="center"/>
+            <w:tcMar>
+              <w:top w:w="75" w:type="dxa"/>
+              <w:bottom w:w="75" w:type="dxa"/>
+              <w:left w:w="100" w:type="dxa"/>
+              <w:right w:w="100" w:type="dxa"/>
+            </w:tcMar>
+            <w:shd w:fill="24465F"/>
+          </w:tcPr>
+          <w:p>
+            <w:pPr>
+              <w:spacing w:after="0" w:line="247" w:lineRule="auto"/>
+              <w:jc w:val="center"/>
+            </w:pPr>
+            <w:r>
+              <w:rPr>
+                <w:b/>
+                <w:color w:val="FFFFFF"/>
+                <w:sz w:val="20"/>
+              </w:rPr>
+              <w:t>Passo mm</w:t>
+            </w:r>
+          </w:p>
+        </w:tc>
+        <w:tc>
+          <w:tcPr>
+            <w:tcW w:type="dxa" w:w="1728"/>
+            <w:vAlign w:val="center"/>
+            <w:tcMar>
+              <w:top w:w="75" w:type="dxa"/>
+              <w:bottom w:w="75" w:type="dxa"/>
+              <w:left w:w="100" w:type="dxa"/>
+              <w:right w:w="100" w:type="dxa"/>
+            </w:tcMar>
+            <w:shd w:fill="24465F"/>
+          </w:tcPr>
+          <w:p>
+            <w:pPr>
+              <w:spacing w:after="0" w:line="247" w:lineRule="auto"/>
+              <w:jc w:val="center"/>
+            </w:pPr>
+            <w:r>
+              <w:rPr>
+                <w:b/>
+                <w:color w:val="FFFFFF"/>
+                <w:sz w:val="20"/>
+              </w:rPr>
+              <w:t>PEd kN</w:t>
+            </w:r>
+          </w:p>
+        </w:tc>
+        <w:tc>
+          <w:tcPr>
+            <w:tcW w:type="dxa" w:w="1728"/>
+            <w:vAlign w:val="center"/>
+            <w:tcMar>
+              <w:top w:w="75" w:type="dxa"/>
+              <w:bottom w:w="75" w:type="dxa"/>
+              <w:left w:w="100" w:type="dxa"/>
+              <w:right w:w="100" w:type="dxa"/>
+            </w:tcMar>
+            <w:shd w:fill="24465F"/>
+          </w:tcPr>
+          <w:p>
+            <w:pPr>
+              <w:spacing w:after="0" w:line="247" w:lineRule="auto"/>
+              <w:jc w:val="center"/>
+            </w:pPr>
+            <w:r>
+              <w:rPr>
+                <w:b/>
+                <w:color w:val="FFFFFF"/>
+                <w:sz w:val="20"/>
+              </w:rPr>
+              <w:t>PRd kN</w:t>
+            </w:r>
+          </w:p>
+        </w:tc>
+        <w:tc>
+          <w:tcPr>
+            <w:tcW w:type="dxa" w:w="1728"/>
+            <w:vAlign w:val="center"/>
+            <w:tcMar>
+              <w:top w:w="75" w:type="dxa"/>
+              <w:bottom w:w="75" w:type="dxa"/>
+              <w:left w:w="100" w:type="dxa"/>
+              <w:right w:w="100" w:type="dxa"/>
+            </w:tcMar>
+            <w:shd w:fill="24465F"/>
+          </w:tcPr>
+          <w:p>
+            <w:pPr>
+              <w:spacing w:after="0" w:line="247" w:lineRule="auto"/>
+              <w:jc w:val="center"/>
+            </w:pPr>
+            <w:r>
+              <w:rPr>
+                <w:b/>
+                <w:color w:val="FFFFFF"/>
+                <w:sz w:val="20"/>
+              </w:rPr>
+              <w:t>Eta</w:t>
+            </w:r>
+          </w:p>
+        </w:tc>
+      </w:tr>
+      <w:tr>
+        <w:trPr>
+          <w:cantSplit/>
+        </w:trPr>
+        <w:tc>
+          <w:tcPr>
+            <w:tcW w:type="dxa" w:w="3082"/>
+            <w:vAlign w:val="center"/>
+            <w:tcMar>
+              <w:top w:w="75" w:type="dxa"/>
+              <w:bottom w:w="75" w:type="dxa"/>
+              <w:left w:w="100" w:type="dxa"/>
+              <w:right w:w="100" w:type="dxa"/>
+            </w:tcMar>
+            <w:shd w:fill="FFFFFF"/>
+          </w:tcPr>
+          <w:p>
+            <w:pPr>
+              <w:spacing w:after="0" w:line="247" w:lineRule="auto"/>
+              <w:jc w:val="left"/>
+            </w:pPr>
+            <w:r>
+              <w:rPr>
+                <w:b w:val="0"/>
+                <w:color w:val="000000"/>
+                <w:sz w:val="20"/>
+              </w:rPr>
+              <w:t>A base</w:t>
+            </w:r>
+          </w:p>
+        </w:tc>
+        <w:tc>
+          <w:tcPr>
+            <w:tcW w:type="dxa" w:w="1728"/>
+            <w:vAlign w:val="center"/>
+            <w:tcMar>
+              <w:top w:w="75" w:type="dxa"/>
+              <w:bottom w:w="75" w:type="dxa"/>
+              <w:left w:w="100" w:type="dxa"/>
+              <w:right w:w="100" w:type="dxa"/>
+            </w:tcMar>
+            <w:shd w:fill="FFFFFF"/>
+          </w:tcPr>
+          <w:p>
+            <w:pPr>
+              <w:spacing w:after="0" w:line="247" w:lineRule="auto"/>
+              <w:jc w:val="center"/>
+            </w:pPr>
+            <w:r>
+              <w:rPr>
+                <w:b w:val="0"/>
+                <w:color w:val="000000"/>
+                <w:sz w:val="20"/>
+              </w:rPr>
+              <w:t>200</w:t>
+            </w:r>
+          </w:p>
+        </w:tc>
+        <w:tc>
+          <w:tcPr>
+            <w:tcW w:type="dxa" w:w="1728"/>
+            <w:vAlign w:val="center"/>
+            <w:tcMar>
+              <w:top w:w="75" w:type="dxa"/>
+              <w:bottom w:w="75" w:type="dxa"/>
+              <w:left w:w="100" w:type="dxa"/>
+              <w:right w:w="100" w:type="dxa"/>
+            </w:tcMar>
+            <w:shd w:fill="FFFFFF"/>
+          </w:tcPr>
+          <w:p>
+            <w:pPr>
+              <w:spacing w:after="0" w:line="247" w:lineRule="auto"/>
+              <w:jc w:val="center"/>
+            </w:pPr>
+            <w:r>
+              <w:rPr>
+                <w:b w:val="0"/>
+                <w:color w:val="000000"/>
+                <w:sz w:val="20"/>
+              </w:rPr>
+              <w:t>61.114</w:t>
+            </w:r>
+          </w:p>
+        </w:tc>
+        <w:tc>
+          <w:tcPr>
+            <w:tcW w:type="dxa" w:w="1728"/>
+            <w:vAlign w:val="center"/>
+            <w:tcMar>
+              <w:top w:w="75" w:type="dxa"/>
+              <w:bottom w:w="75" w:type="dxa"/>
+              <w:left w:w="100" w:type="dxa"/>
+              <w:right w:w="100" w:type="dxa"/>
+            </w:tcMar>
+            <w:shd w:fill="FFFFFF"/>
+          </w:tcPr>
+          <w:p>
+            <w:pPr>
+              <w:spacing w:after="0" w:line="247" w:lineRule="auto"/>
+              <w:jc w:val="center"/>
+            </w:pPr>
+            <w:r>
+              <w:rPr>
+                <w:b w:val="0"/>
+                <w:color w:val="000000"/>
+                <w:sz w:val="20"/>
+              </w:rPr>
+              <w:t>109.478</w:t>
+            </w:r>
+          </w:p>
+        </w:tc>
+        <w:tc>
+          <w:tcPr>
+            <w:tcW w:type="dxa" w:w="1728"/>
+            <w:vAlign w:val="center"/>
+            <w:tcMar>
+              <w:top w:w="75" w:type="dxa"/>
+              <w:bottom w:w="75" w:type="dxa"/>
+              <w:left w:w="100" w:type="dxa"/>
+              <w:right w:w="100" w:type="dxa"/>
+            </w:tcMar>
+            <w:shd w:fill="FFFFFF"/>
+          </w:tcPr>
+          <w:p>
+            <w:pPr>
+              <w:spacing w:after="0" w:line="247" w:lineRule="auto"/>
+              <w:jc w:val="center"/>
+            </w:pPr>
+            <w:r>
+              <w:rPr>
+                <w:b w:val="0"/>
+                <w:color w:val="000000"/>
+                <w:sz w:val="20"/>
+              </w:rPr>
+              <w:t>0.558</w:t>
+            </w:r>
+          </w:p>
+        </w:tc>
+      </w:tr>
+      <w:tr>
+        <w:trPr>
+          <w:cantSplit/>
+        </w:trPr>
+        <w:tc>
+          <w:tcPr>
+            <w:tcW w:type="dxa" w:w="3082"/>
+            <w:vAlign w:val="center"/>
+            <w:tcMar>
+              <w:top w:w="75" w:type="dxa"/>
+              <w:bottom w:w="75" w:type="dxa"/>
+              <w:left w:w="100" w:type="dxa"/>
+              <w:right w:w="100" w:type="dxa"/>
+            </w:tcMar>
+            <w:shd w:fill="F2F5F7"/>
+          </w:tcPr>
+          <w:p>
+            <w:pPr>
+              <w:spacing w:after="0" w:line="247" w:lineRule="auto"/>
+              <w:jc w:val="left"/>
+            </w:pPr>
+            <w:r>
+              <w:rPr>
+                <w:b w:val="0"/>
+                <w:color w:val="000000"/>
+                <w:sz w:val="20"/>
+              </w:rPr>
+              <w:t>B passo doppio</w:t>
+            </w:r>
+          </w:p>
+        </w:tc>
+        <w:tc>
+          <w:tcPr>
+            <w:tcW w:type="dxa" w:w="1728"/>
+            <w:vAlign w:val="center"/>
+            <w:tcMar>
+              <w:top w:w="75" w:type="dxa"/>
+              <w:bottom w:w="75" w:type="dxa"/>
+              <w:left w:w="100" w:type="dxa"/>
+              <w:right w:w="100" w:type="dxa"/>
+            </w:tcMar>
+            <w:shd w:fill="F2F5F7"/>
+          </w:tcPr>
+          <w:p>
+            <w:pPr>
+              <w:spacing w:after="0" w:line="247" w:lineRule="auto"/>
+              <w:jc w:val="center"/>
+            </w:pPr>
+            <w:r>
+              <w:rPr>
+                <w:b w:val="0"/>
+                <w:color w:val="000000"/>
+                <w:sz w:val="20"/>
+              </w:rPr>
+              <w:t>400</w:t>
+            </w:r>
+          </w:p>
+        </w:tc>
+        <w:tc>
+          <w:tcPr>
+            <w:tcW w:type="dxa" w:w="1728"/>
+            <w:vAlign w:val="center"/>
+            <w:tcMar>
+              <w:top w:w="75" w:type="dxa"/>
+              <w:bottom w:w="75" w:type="dxa"/>
+              <w:left w:w="100" w:type="dxa"/>
+              <w:right w:w="100" w:type="dxa"/>
+            </w:tcMar>
+            <w:shd w:fill="F2F5F7"/>
+          </w:tcPr>
+          <w:p>
+            <w:pPr>
+              <w:spacing w:after="0" w:line="247" w:lineRule="auto"/>
+              <w:jc w:val="center"/>
+            </w:pPr>
+            <w:r>
+              <w:rPr>
+                <w:b w:val="0"/>
+                <w:color w:val="000000"/>
+                <w:sz w:val="20"/>
+              </w:rPr>
+              <w:t>122.227</w:t>
+            </w:r>
+          </w:p>
+        </w:tc>
+        <w:tc>
+          <w:tcPr>
+            <w:tcW w:type="dxa" w:w="1728"/>
+            <w:vAlign w:val="center"/>
+            <w:tcMar>
+              <w:top w:w="75" w:type="dxa"/>
+              <w:bottom w:w="75" w:type="dxa"/>
+              <w:left w:w="100" w:type="dxa"/>
+              <w:right w:w="100" w:type="dxa"/>
+            </w:tcMar>
+            <w:shd w:fill="F2F5F7"/>
+          </w:tcPr>
+          <w:p>
+            <w:pPr>
+              <w:spacing w:after="0" w:line="247" w:lineRule="auto"/>
+              <w:jc w:val="center"/>
+            </w:pPr>
+            <w:r>
+              <w:rPr>
+                <w:b w:val="0"/>
+                <w:color w:val="000000"/>
+                <w:sz w:val="20"/>
+              </w:rPr>
+              <w:t>109.478</w:t>
+            </w:r>
+          </w:p>
+        </w:tc>
+        <w:tc>
+          <w:tcPr>
+            <w:tcW w:type="dxa" w:w="1728"/>
+            <w:vAlign w:val="center"/>
+            <w:tcMar>
+              <w:top w:w="75" w:type="dxa"/>
+              <w:bottom w:w="75" w:type="dxa"/>
+              <w:left w:w="100" w:type="dxa"/>
+              <w:right w:w="100" w:type="dxa"/>
+            </w:tcMar>
+            <w:shd w:fill="F2F5F7"/>
+          </w:tcPr>
+          <w:p>
+            <w:pPr>
+              <w:spacing w:after="0" w:line="247" w:lineRule="auto"/>
+              <w:jc w:val="center"/>
+            </w:pPr>
+            <w:r>
+              <w:rPr>
+                <w:b w:val="0"/>
+                <w:color w:val="000000"/>
+                <w:sz w:val="20"/>
+              </w:rPr>
+              <w:t>1.116</w:t>
+            </w:r>
+          </w:p>
+        </w:tc>
+      </w:tr>
+    </w:tbl>
+    <w:p>
+      <w:pPr>
+        <w:spacing w:after="20" w:before="0" w:line="240" w:lineRule="auto"/>
+      </w:pPr>
+      <w:r>
+        <w:rPr>
+          <w:sz w:val="4"/>
+        </w:rPr>
+      </w:r>
+    </w:p>
+    <w:p>
+      <w:r>
+        <w:rPr>
+          <w:b w:val="0"/>
+        </w:rPr>
+        <w:t>B mantiene q e PRd, raddoppia PEd e dimezza qRd. Il controllo resistente del piolo non passa. RepeatedActionDetail=True riguarda il dettaglio per azioni ripetute: non verifica la fatica. Il file non attiva le verifiche dell’armatura trasversale della soletta e del suo ancoraggio.</w:t>
+      </w:r>
+    </w:p>
+    <w:p>
+      <w:pPr>
+        <w:pStyle w:val="Heading2"/>
+      </w:pPr>
+      <w:r>
+        <w:t>Irrigidimenti</w:t>
+      </w:r>
+    </w:p>
+    <w:tbl>
+      <w:tblPr>
+        <w:tblW w:type="auto" w:w="0"/>
+        <w:jc w:val="center"/>
+        <w:tblLayout w:type="fixed"/>
+        <w:tblLook w:firstColumn="1" w:firstRow="1" w:lastColumn="0" w:lastRow="0" w:noHBand="0" w:noVBand="1" w:val="04A0"/>
+        <w:tblBorders>
+          <w:top w:val="single" w:sz="4" w:color="D9D9D9"/>
+          <w:left w:val="single" w:sz="4" w:color="D9D9D9"/>
+          <w:bottom w:val="single" w:sz="4" w:color="D9D9D9"/>
+          <w:right w:val="single" w:sz="4" w:color="D9D9D9"/>
+          <w:insideH w:val="single" w:sz="4" w:color="D9D9D9"/>
+          <w:insideV w:val="single" w:sz="4" w:color="D9D9D9"/>
+        </w:tblBorders>
+      </w:tblPr>
+      <w:tblGrid>
+        <w:gridCol w:w="6538"/>
+        <w:gridCol w:w="1728"/>
+        <w:gridCol w:w="1728"/>
+      </w:tblGrid>
+      <w:tr>
+        <w:trPr>
+          <w:tblHeader/>
+          <w:cantSplit/>
+        </w:trPr>
+        <w:tc>
+          <w:tcPr>
+            <w:tcW w:type="dxa" w:w="6538"/>
+            <w:vAlign w:val="center"/>
+            <w:tcMar>
+              <w:top w:w="75" w:type="dxa"/>
+              <w:bottom w:w="75" w:type="dxa"/>
+              <w:left w:w="100" w:type="dxa"/>
+              <w:right w:w="100" w:type="dxa"/>
+            </w:tcMar>
+            <w:shd w:fill="24465F"/>
+          </w:tcPr>
+          <w:p>
+            <w:pPr>
+              <w:spacing w:after="0" w:line="247" w:lineRule="auto"/>
+              <w:jc w:val="left"/>
+            </w:pPr>
+            <w:r>
+              <w:rPr>
+                <w:b/>
+                <w:color w:val="FFFFFF"/>
+                <w:sz w:val="20"/>
+              </w:rPr>
+              <w:t>Controllo e variante</w:t>
+            </w:r>
+          </w:p>
+        </w:tc>
+        <w:tc>
+          <w:tcPr>
+            <w:tcW w:type="dxa" w:w="1728"/>
+            <w:vAlign w:val="center"/>
+            <w:tcMar>
+              <w:top w:w="75" w:type="dxa"/>
+              <w:bottom w:w="75" w:type="dxa"/>
+              <w:left w:w="100" w:type="dxa"/>
+              <w:right w:w="100" w:type="dxa"/>
+            </w:tcMar>
+            <w:shd w:fill="24465F"/>
+          </w:tcPr>
+          <w:p>
+            <w:pPr>
+              <w:spacing w:after="0" w:line="247" w:lineRule="auto"/>
+              <w:jc w:val="center"/>
+            </w:pPr>
+            <w:r>
+              <w:rPr>
+                <w:b/>
+                <w:color w:val="FFFFFF"/>
+                <w:sz w:val="20"/>
+              </w:rPr>
+              <w:t>Base A</w:t>
+            </w:r>
+          </w:p>
+        </w:tc>
+        <w:tc>
+          <w:tcPr>
+            <w:tcW w:type="dxa" w:w="1728"/>
+            <w:vAlign w:val="center"/>
+            <w:tcMar>
+              <w:top w:w="75" w:type="dxa"/>
+              <w:bottom w:w="75" w:type="dxa"/>
+              <w:left w:w="100" w:type="dxa"/>
+              <w:right w:w="100" w:type="dxa"/>
+            </w:tcMar>
+            <w:shd w:fill="24465F"/>
+          </w:tcPr>
+          <w:p>
+            <w:pPr>
+              <w:spacing w:after="0" w:line="247" w:lineRule="auto"/>
+              <w:jc w:val="center"/>
+            </w:pPr>
+            <w:r>
+              <w:rPr>
+                <w:b/>
+                <w:color w:val="FFFFFF"/>
+                <w:sz w:val="20"/>
+              </w:rPr>
+              <w:t>Variante</w:t>
+            </w:r>
+          </w:p>
+        </w:tc>
+      </w:tr>
+      <w:tr>
+        <w:trPr>
+          <w:cantSplit/>
+        </w:trPr>
+        <w:tc>
+          <w:tcPr>
+            <w:tcW w:type="dxa" w:w="6538"/>
+            <w:vAlign w:val="center"/>
+            <w:tcMar>
+              <w:top w:w="75" w:type="dxa"/>
+              <w:bottom w:w="75" w:type="dxa"/>
+              <w:left w:w="100" w:type="dxa"/>
+              <w:right w:w="100" w:type="dxa"/>
+            </w:tcMar>
+            <w:shd w:fill="FFFFFF"/>
+          </w:tcPr>
+          <w:p>
+            <w:pPr>
+              <w:spacing w:after="0" w:line="247" w:lineRule="auto"/>
+              <w:jc w:val="left"/>
+            </w:pPr>
+            <w:r>
+              <w:rPr>
+                <w:b w:val="0"/>
+                <w:color w:val="000000"/>
+                <w:sz w:val="20"/>
+              </w:rPr>
+              <w:t>C, intermedio 8 mm: rigidezza torsionale</w:t>
+            </w:r>
+          </w:p>
+        </w:tc>
+        <w:tc>
+          <w:tcPr>
+            <w:tcW w:type="dxa" w:w="1728"/>
+            <w:vAlign w:val="center"/>
+            <w:tcMar>
+              <w:top w:w="75" w:type="dxa"/>
+              <w:bottom w:w="75" w:type="dxa"/>
+              <w:left w:w="100" w:type="dxa"/>
+              <w:right w:w="100" w:type="dxa"/>
+            </w:tcMar>
+            <w:shd w:fill="FFFFFF"/>
+          </w:tcPr>
+          <w:p>
+            <w:pPr>
+              <w:spacing w:after="0" w:line="247" w:lineRule="auto"/>
+              <w:jc w:val="center"/>
+            </w:pPr>
+            <w:r>
+              <w:rPr>
+                <w:b w:val="0"/>
+                <w:color w:val="000000"/>
+                <w:sz w:val="20"/>
+              </w:rPr>
+              <w:t>0.96</w:t>
+            </w:r>
+          </w:p>
+        </w:tc>
+        <w:tc>
+          <w:tcPr>
+            <w:tcW w:type="dxa" w:w="1728"/>
+            <w:vAlign w:val="center"/>
+            <w:tcMar>
+              <w:top w:w="75" w:type="dxa"/>
+              <w:bottom w:w="75" w:type="dxa"/>
+              <w:left w:w="100" w:type="dxa"/>
+              <w:right w:w="100" w:type="dxa"/>
+            </w:tcMar>
+            <w:shd w:fill="FFFFFF"/>
+          </w:tcPr>
+          <w:p>
+            <w:pPr>
+              <w:spacing w:after="0" w:line="247" w:lineRule="auto"/>
+              <w:jc w:val="center"/>
+            </w:pPr>
+            <w:r>
+              <w:rPr>
+                <w:b w:val="0"/>
+                <w:color w:val="000000"/>
+                <w:sz w:val="20"/>
+              </w:rPr>
+              <w:t>5.75</w:t>
+            </w:r>
+          </w:p>
+        </w:tc>
+      </w:tr>
+      <w:tr>
+        <w:trPr>
+          <w:cantSplit/>
+        </w:trPr>
+        <w:tc>
+          <w:tcPr>
+            <w:tcW w:type="dxa" w:w="6538"/>
+            <w:vAlign w:val="center"/>
+            <w:tcMar>
+              <w:top w:w="75" w:type="dxa"/>
+              <w:bottom w:w="75" w:type="dxa"/>
+              <w:left w:w="100" w:type="dxa"/>
+              <w:right w:w="100" w:type="dxa"/>
+            </w:tcMar>
+            <w:shd w:fill="F2F5F7"/>
+          </w:tcPr>
+          <w:p>
+            <w:pPr>
+              <w:spacing w:after="0" w:line="247" w:lineRule="auto"/>
+              <w:jc w:val="left"/>
+            </w:pPr>
+            <w:r>
+              <w:rPr>
+                <w:b w:val="0"/>
+                <w:color w:val="000000"/>
+                <w:sz w:val="20"/>
+              </w:rPr>
+              <w:t>C, intermedio 8 mm: piatti entro classe 3</w:t>
+            </w:r>
+          </w:p>
+        </w:tc>
+        <w:tc>
+          <w:tcPr>
+            <w:tcW w:type="dxa" w:w="1728"/>
+            <w:vAlign w:val="center"/>
+            <w:tcMar>
+              <w:top w:w="75" w:type="dxa"/>
+              <w:bottom w:w="75" w:type="dxa"/>
+              <w:left w:w="100" w:type="dxa"/>
+              <w:right w:w="100" w:type="dxa"/>
+            </w:tcMar>
+            <w:shd w:fill="F2F5F7"/>
+          </w:tcPr>
+          <w:p>
+            <w:pPr>
+              <w:spacing w:after="0" w:line="247" w:lineRule="auto"/>
+              <w:jc w:val="center"/>
+            </w:pPr>
+            <w:r>
+              <w:rPr>
+                <w:b w:val="0"/>
+                <w:color w:val="000000"/>
+                <w:sz w:val="20"/>
+              </w:rPr>
+              <w:t>0.88</w:t>
+            </w:r>
+          </w:p>
+        </w:tc>
+        <w:tc>
+          <w:tcPr>
+            <w:tcW w:type="dxa" w:w="1728"/>
+            <w:vAlign w:val="center"/>
+            <w:tcMar>
+              <w:top w:w="75" w:type="dxa"/>
+              <w:bottom w:w="75" w:type="dxa"/>
+              <w:left w:w="100" w:type="dxa"/>
+              <w:right w:w="100" w:type="dxa"/>
+            </w:tcMar>
+            <w:shd w:fill="F2F5F7"/>
+          </w:tcPr>
+          <w:p>
+            <w:pPr>
+              <w:spacing w:after="0" w:line="247" w:lineRule="auto"/>
+              <w:jc w:val="center"/>
+            </w:pPr>
+            <w:r>
+              <w:rPr>
+                <w:b w:val="0"/>
+                <w:color w:val="000000"/>
+                <w:sz w:val="20"/>
+              </w:rPr>
+              <w:t>2.19</w:t>
+            </w:r>
+          </w:p>
+        </w:tc>
+      </w:tr>
+      <w:tr>
+        <w:trPr>
+          <w:cantSplit/>
+        </w:trPr>
+        <w:tc>
+          <w:tcPr>
+            <w:tcW w:type="dxa" w:w="6538"/>
+            <w:vAlign w:val="center"/>
+            <w:tcMar>
+              <w:top w:w="75" w:type="dxa"/>
+              <w:bottom w:w="75" w:type="dxa"/>
+              <w:left w:w="100" w:type="dxa"/>
+              <w:right w:w="100" w:type="dxa"/>
+            </w:tcMar>
+            <w:shd w:fill="FFFFFF"/>
+          </w:tcPr>
+          <w:p>
+            <w:pPr>
+              <w:spacing w:after="0" w:line="247" w:lineRule="auto"/>
+              <w:jc w:val="left"/>
+            </w:pPr>
+            <w:r>
+              <w:rPr>
+                <w:b w:val="0"/>
+                <w:color w:val="000000"/>
+                <w:sz w:val="20"/>
+              </w:rPr>
+              <w:t>D, R=3000 kN: saldature alle flange</w:t>
+            </w:r>
+          </w:p>
+        </w:tc>
+        <w:tc>
+          <w:tcPr>
+            <w:tcW w:type="dxa" w:w="1728"/>
+            <w:vAlign w:val="center"/>
+            <w:tcMar>
+              <w:top w:w="75" w:type="dxa"/>
+              <w:bottom w:w="75" w:type="dxa"/>
+              <w:left w:w="100" w:type="dxa"/>
+              <w:right w:w="100" w:type="dxa"/>
+            </w:tcMar>
+            <w:shd w:fill="FFFFFF"/>
+          </w:tcPr>
+          <w:p>
+            <w:pPr>
+              <w:spacing w:after="0" w:line="247" w:lineRule="auto"/>
+              <w:jc w:val="center"/>
+            </w:pPr>
+            <w:r>
+              <w:rPr>
+                <w:b w:val="0"/>
+                <w:color w:val="000000"/>
+                <w:sz w:val="20"/>
+              </w:rPr>
+              <w:t>0.42</w:t>
+            </w:r>
+          </w:p>
+        </w:tc>
+        <w:tc>
+          <w:tcPr>
+            <w:tcW w:type="dxa" w:w="1728"/>
+            <w:vAlign w:val="center"/>
+            <w:tcMar>
+              <w:top w:w="75" w:type="dxa"/>
+              <w:bottom w:w="75" w:type="dxa"/>
+              <w:left w:w="100" w:type="dxa"/>
+              <w:right w:w="100" w:type="dxa"/>
+            </w:tcMar>
+            <w:shd w:fill="FFFFFF"/>
+          </w:tcPr>
+          <w:p>
+            <w:pPr>
+              <w:spacing w:after="0" w:line="247" w:lineRule="auto"/>
+              <w:jc w:val="center"/>
+            </w:pPr>
+            <w:r>
+              <w:rPr>
+                <w:b w:val="0"/>
+                <w:color w:val="000000"/>
+                <w:sz w:val="20"/>
+              </w:rPr>
+              <w:t>1.41</w:t>
+            </w:r>
+          </w:p>
+        </w:tc>
+      </w:tr>
+      <w:tr>
+        <w:trPr>
+          <w:cantSplit/>
+        </w:trPr>
+        <w:tc>
+          <w:tcPr>
+            <w:tcW w:type="dxa" w:w="6538"/>
+            <w:vAlign w:val="center"/>
+            <w:tcMar>
+              <w:top w:w="75" w:type="dxa"/>
+              <w:bottom w:w="75" w:type="dxa"/>
+              <w:left w:w="100" w:type="dxa"/>
+              <w:right w:w="100" w:type="dxa"/>
+            </w:tcMar>
+            <w:shd w:fill="F2F5F7"/>
+          </w:tcPr>
+          <w:p>
+            <w:pPr>
+              <w:spacing w:after="0" w:line="247" w:lineRule="auto"/>
+              <w:jc w:val="left"/>
+            </w:pPr>
+            <w:r>
+              <w:rPr>
+                <w:b w:val="0"/>
+                <w:color w:val="000000"/>
+                <w:sz w:val="20"/>
+              </w:rPr>
+              <w:t>D, R=3000 kN: contatto piatti/flangia</w:t>
+            </w:r>
+          </w:p>
+        </w:tc>
+        <w:tc>
+          <w:tcPr>
+            <w:tcW w:type="dxa" w:w="1728"/>
+            <w:vAlign w:val="center"/>
+            <w:tcMar>
+              <w:top w:w="75" w:type="dxa"/>
+              <w:bottom w:w="75" w:type="dxa"/>
+              <w:left w:w="100" w:type="dxa"/>
+              <w:right w:w="100" w:type="dxa"/>
+            </w:tcMar>
+            <w:shd w:fill="F2F5F7"/>
+          </w:tcPr>
+          <w:p>
+            <w:pPr>
+              <w:spacing w:after="0" w:line="247" w:lineRule="auto"/>
+              <w:jc w:val="center"/>
+            </w:pPr>
+            <w:r>
+              <w:rPr>
+                <w:b w:val="0"/>
+                <w:color w:val="000000"/>
+                <w:sz w:val="20"/>
+              </w:rPr>
+              <w:t>0.32</w:t>
+            </w:r>
+          </w:p>
+        </w:tc>
+        <w:tc>
+          <w:tcPr>
+            <w:tcW w:type="dxa" w:w="1728"/>
+            <w:vAlign w:val="center"/>
+            <w:tcMar>
+              <w:top w:w="75" w:type="dxa"/>
+              <w:bottom w:w="75" w:type="dxa"/>
+              <w:left w:w="100" w:type="dxa"/>
+              <w:right w:w="100" w:type="dxa"/>
+            </w:tcMar>
+            <w:shd w:fill="F2F5F7"/>
+          </w:tcPr>
+          <w:p>
+            <w:pPr>
+              <w:spacing w:after="0" w:line="247" w:lineRule="auto"/>
+              <w:jc w:val="center"/>
+            </w:pPr>
+            <w:r>
+              <w:rPr>
+                <w:b w:val="0"/>
+                <w:color w:val="000000"/>
+                <w:sz w:val="20"/>
+              </w:rPr>
+              <w:t>1.07</w:t>
+            </w:r>
+          </w:p>
+        </w:tc>
+      </w:tr>
+    </w:tbl>
+    <w:p>
+      <w:pPr>
+        <w:spacing w:after="20" w:before="0" w:line="240" w:lineRule="auto"/>
+      </w:pPr>
+      <w:r>
+        <w:rPr>
+          <w:sz w:val="4"/>
+        </w:rPr>
+      </w:r>
+    </w:p>
+    <w:p>
+      <w:r>
+        <w:rPr>
+          <w:b w:val="0"/>
+        </w:rPr>
+        <w:t>I valori sono rapporti domanda/limite GPC. Il piatto da 8 mm perde l’idoneità e il beneficio dei pannelli irrigiditi. La reazione maggiore rende critici collegamento e contatto. La preview resta quella di A finché non si collegano le definizioni alternative anche a Layout.</w:t>
+      </w:r>
+    </w:p>
+    <w:p>
+      <w:r>
+        <w:rPr>
+          <w:b w:val="0"/>
+        </w:rPr>
+        <w:t>Leggere insieme Check, Demand, Resistance, Units, Ratio, Status e Notes. NaN/Da verificare non significa utilizzo nullo. Non verificato è un esito strutturale e non richiede un componente rosso. Restano visibili i warning su trazione del CLS e ritiro; apparecchio d’appoggio, piastra di ripartizione e dettagli con intagli non sono verificati da questo esempio.</w:t>
+      </w:r>
+    </w:p>
+    <w:p>
+      <w:r>
+        <w:rPr>
+          <w:b w:val="0"/>
+        </w:rPr>
+        <w:t>Ultimate seleziona i controlli GPC; le azioni devono essere già combinate. I coefficienti del file sono dati di prova espliciti, non una scelta normativa automatica. Le formule e le note documentano il codice locale, non attestano la completezza normativa di una verifica del ponte.</w:t>
+      </w:r>
+    </w:p>
+    <w:p>
+      <w:r>
+        <w:br w:type="page"/>
+      </w:r>
+    </w:p>
+    <w:p>
+      <w:pPr>
+        <w:pStyle w:val="Heading1"/>
+      </w:pPr>
+      <w:r>
+        <w:t>31  Collegare i dettagli al modello calcolato</w:t>
+      </w:r>
+    </w:p>
+    <w:p>
+      <w:r>
+        <w:rPr>
+          <w:b w:val="0"/>
+        </w:rPr>
+      </w:r>
+      <w:r>
+        <w:rPr>
+          <w:b/>
+        </w:rPr>
+        <w:t>47-integrazione-modello.ghx</w:t>
+      </w:r>
+      <w:r>
+        <w:rPr>
+          <w:b w:val="0"/>
+        </w:rPr>
+        <w:t xml:space="preserve"> riutilizza risultati Straus dell’esempio 19 REV003, memorizzati nel file: beam 36 di G2, tra 27.5 e 30 m. La sezione è H2000 con soletta efficace 3000×250 mm e n0=7, n infinito=18, n ritiro=12. Non è la sezione del benchmark locale e non deve riprodurne gli stessi valori.</w:t>
+      </w:r>
+    </w:p>
+    <w:p>
+      <w:pPr>
+        <w:ind w:left="259" w:hanging="259"/>
+      </w:pPr>
+      <w:r>
+        <w:rPr>
+          <w:b w:val="0"/>
+        </w:rPr>
+      </w:r>
+      <w:r>
+        <w:rPr>
+          <w:b/>
+        </w:rPr>
+        <w:t>1.</w:t>
+      </w:r>
+      <w:r>
+        <w:rPr>
+          <w:b w:val="0"/>
+        </w:rPr>
+        <w:t xml:space="preserve"> Collegare modelli con risultati, Bridge Phase e tabella delle combinazioni a Build BridGHe Model. Usare Calculation=0, Cumulative, e premere Run.</w:t>
+      </w:r>
+    </w:p>
+    <w:p>
+      <w:pPr>
+        <w:ind w:left="259" w:hanging="259"/>
+      </w:pPr>
+      <w:r>
+        <w:rPr>
+          <w:b w:val="0"/>
+        </w:rPr>
+      </w:r>
+      <w:r>
+        <w:rPr>
+          <w:b/>
+        </w:rPr>
+        <w:t>2.</w:t>
+      </w:r>
+      <w:r>
+        <w:rPr>
+          <w:b w:val="0"/>
+        </w:rPr>
+        <w:t xml:space="preserve"> Collegare il modello assemblato a Super Element Filter e selezionare G2. Passare le aste a Composite beam con la proprietà fisica mista. Le aste devono provenire dal modello assemblato, con le sollecitazioni.</w:t>
+      </w:r>
+    </w:p>
+    <w:p>
+      <w:pPr>
+        <w:ind w:left="259" w:hanging="259"/>
+      </w:pPr>
+      <w:r>
+        <w:rPr>
+          <w:b w:val="0"/>
+        </w:rPr>
+      </w:r>
+      <w:r>
+        <w:rPr>
+          <w:b/>
+        </w:rPr>
+        <w:t>3.</w:t>
+      </w:r>
+      <w:r>
+        <w:rPr>
+          <w:b w:val="0"/>
+        </w:rPr>
+        <w:t xml:space="preserve"> Collegare lo stesso modello e i Composite beam a Super Element Check e premere Run. Ripetere i Run dopo variazioni alle fasi o alle combinazioni.</w:t>
+      </w:r>
+    </w:p>
+    <w:p>
+      <w:pPr>
+        <w:ind w:left="259" w:hanging="259"/>
+      </w:pPr>
+      <w:r>
+        <w:rPr>
+          <w:b w:val="0"/>
+        </w:rPr>
+      </w:r>
+      <w:r>
+        <w:rPr>
+          <w:b/>
+        </w:rPr>
+        <w:t>4.</w:t>
+      </w:r>
+      <w:r>
+        <w:rPr>
+          <w:b w:val="0"/>
+        </w:rPr>
+        <w:t xml:space="preserve"> Portare Tension Check, prima uscita del checker, a Section result di Bridge Detail Check. Questo oggetto contiene anche geometria, materiali e storia delle azioni. Non usare Tau b, attualmente NaN, né la sola lista delle forze.</w:t>
+      </w:r>
+    </w:p>
+    <w:p>
+      <w:pPr>
+        <w:ind w:left="259" w:hanging="259"/>
+      </w:pPr>
+      <w:r>
+        <w:rPr>
+          <w:b w:val="0"/>
+        </w:rPr>
+      </w:r>
+      <w:r>
+        <w:rPr>
+          <w:b/>
+        </w:rPr>
+        <w:t>5.</w:t>
+      </w:r>
+      <w:r>
+        <w:rPr>
+          <w:b w:val="0"/>
+        </w:rPr>
+        <w:t xml:space="preserve"> Collegare le definizioni di pioli, intermedi e appoggio ai rispettivi ingressi di Detail Check. Il risultato alimenta Bridge Stud Results, Bridge Verification Results e Bridge Check Summary.</w:t>
+      </w:r>
+    </w:p>
+    <w:p>
+      <w:pPr>
+        <w:pStyle w:val="Heading2"/>
+      </w:pPr>
+      <w:r>
+        <w:t>Stazioni e combinazioni</w:t>
+      </w:r>
+    </w:p>
+    <w:p>
+      <w:r>
+        <w:rPr>
+          <w:b w:val="0"/>
+        </w:rPr>
+        <w:t>Conservare i rami {indice beam; indice stazione}; gli item del ramo corrispondono alle combinazioni. Per dettagli diversi lungo il ponte selezionare zone e definizioni mantenendo queste associazioni. Un Flatten indiscriminato può perdere l’identità della sezione o abbinare una reazione al risultato sbagliato.</w:t>
+      </w:r>
+    </w:p>
+    <w:p>
+      <w:pPr>
+        <w:pStyle w:val="Heading2"/>
+      </w:pPr>
+      <w:r>
+        <w:t>Stato limite e reazioni</w:t>
+      </w:r>
+    </w:p>
+    <w:p>
+      <w:r>
+        <w:rPr>
+          <w:b w:val="0"/>
+        </w:rPr>
+        <w:t>Super Element Check usa attualmente SLE rara. Per i controlli SLU degli irrigidimenti, collegare Bridge Analysis Options con LimitState=Ultimate al Detail Check e usare azioni effettivamente combinate allo SLU. Cambiare l’opzione non applica fattori e non modifica le azioni FEM. Nel file integrato DEMO ha fattori unitari: Ultimate mostra il funzionamento dei controlli, senza qualificare la combinazione come normativa.</w:t>
+      </w:r>
+    </w:p>
+    <w:p>
+      <w:r>
+        <w:rPr>
+          <w:b w:val="0"/>
+        </w:rPr>
+        <w:t>ReactionKN=900 kN è un dato dimostrativo indipendente, non la reazione estratta dal ponte. Bridge Bearing Envelope può aiutare a leggere le reazioni del modello analizzato, ma vanno controllati caso/combinazione, assi, segno e unità: N nei risultati N–mm, kN nell’irrigidimento. GPC usa R come inviluppo assegnato costante nella storia del calcolo locale.</w:t>
+      </w:r>
+    </w:p>
+    <w:p>
+      <w:pPr>
+        <w:pStyle w:val="Heading2"/>
+      </w:pPr>
+      <w:r>
+        <w:t>Limite attuale del flusso</w:t>
+      </w:r>
+    </w:p>
+    <w:p>
+      <w:r>
+        <w:rPr>
+          <w:b w:val="0"/>
+        </w:rPr>
+        <w:t>LinearHistory calcola lo storico N–Mx e non implementa taglio, pioli e irrigidimenti; Detail Check lo rifiuta. Cumulative va scelto per la sua ipotesi di calcolo, non per aggirare l’errore. L’adattatore dei superelementi copre una H simmetrica con soletta e N–Mx–Vy; torsione e flessione deviata richiedono strumenti ulteriori.</w:t>
+      </w:r>
+    </w:p>
+    <w:p>
+      <w:r>
+        <w:rPr>
+          <w:b w:val="0"/>
+        </w:rPr>
+        <w:t>Entrambi i file sono verificati mediante soluzione, salvataggio e riapertura in Rhino 8. Il secondo conserva percorsi dell’albero, azioni e strain per ogni stazione. I report validation.json e validation-modello.json distinguono la verifica locale dalla nuova analisi globale: solverInvoked=false.</w:t>
       </w:r>
     </w:p>
     <w:sectPr>

</xml_diff>

<commit_message>
docs: document planar check assumptions and audited example workflows
</commit_message>
<xml_diff>
--- a/docs/BridGHe_Guida_operativa.docx
+++ b/docs/BridGHe_Guida_operativa.docx
@@ -7774,7 +7774,7 @@
         <w:rPr>
           <w:b w:val="0"/>
         </w:rPr>
-        <w:t>Il checker H gestisce il campo di azioni implementato e rifiuta componenti fuori campo, fra cui torsione e flessione sull’asse minore. Le azioni FEM non supportate non vengono azzerate per ottenere un esito. Per travi laterali, ponti curvi o azioni eccentriche occorrono verifiche dedicate.</w:t>
+        <w:t>Il checker H verifica nel piano N–Mx–Vy. Torsione T, momento sull’asse debole M2 e taglio trasversale V1 sono trascurati nelle verifiche di sezione e dei dettagli; restano nei risultati FEM e nei grafici delle sollecitazioni. L’ipotesi accompagna i risultati e compare nel report. Gli effetti esclusi e le loro interazioni non sono verificati.</w:t>
       </w:r>
     </w:p>
     <w:p>
@@ -11315,7 +11315,7 @@
                 <w:color w:val="000000"/>
                 <w:sz w:val="20"/>
               </w:rPr>
-              <w:t>Errore per torsione o asse minore</w:t>
+              <w:t>T, M2 e V1 esclusi dalle verifiche</w:t>
             </w:r>
           </w:p>
         </w:tc>
@@ -11342,7 +11342,7 @@
                 <w:color w:val="000000"/>
                 <w:sz w:val="20"/>
               </w:rPr>
-              <w:t>Azioni fuori dal campo del checker H</w:t>
+              <w:t>Ipotesi di verifica nel piano N–Mx–Vy</w:t>
             </w:r>
           </w:p>
         </w:tc>
@@ -11369,7 +11369,7 @@
                 <w:color w:val="000000"/>
                 <w:sz w:val="20"/>
               </w:rPr>
-              <w:t>Mantenere le azioni FEM e verificarle con un metodo dedicato</w:t>
+              <w:t>Leggere l’ipotesi nel report; verificare separatamente gli effetti esclusi</w:t>
             </w:r>
           </w:p>
         </w:tc>

</xml_diff>

<commit_message>
docs: explain modular bridge geometry fabrication segments and phase wiring
</commit_message>
<xml_diff>
--- a/docs/BridGHe_Guida_operativa.docx
+++ b/docs/BridGHe_Guida_operativa.docx
@@ -819,6 +819,178 @@
           </w:p>
         </w:tc>
       </w:tr>
+      <w:tr>
+        <w:trPr>
+          <w:cantSplit/>
+        </w:trPr>
+        <w:tc>
+          <w:tcPr>
+            <w:tcW w:type="dxa" w:w="1440"/>
+            <w:vAlign w:val="center"/>
+            <w:tcMar>
+              <w:top w:w="75" w:type="dxa"/>
+              <w:bottom w:w="75" w:type="dxa"/>
+              <w:left w:w="100" w:type="dxa"/>
+              <w:right w:w="100" w:type="dxa"/>
+            </w:tcMar>
+            <w:shd w:fill="F2F5F7"/>
+          </w:tcPr>
+          <w:p>
+            <w:pPr>
+              <w:spacing w:after="0" w:line="247" w:lineRule="auto"/>
+              <w:jc w:val="center"/>
+            </w:pPr>
+            <w:r>
+              <w:rPr>
+                <w:b w:val="0"/>
+                <w:color w:val="000000"/>
+                <w:sz w:val="20"/>
+              </w:rPr>
+              <w:t>28–31</w:t>
+            </w:r>
+          </w:p>
+        </w:tc>
+        <w:tc>
+          <w:tcPr>
+            <w:tcW w:type="dxa" w:w="7416"/>
+            <w:vAlign w:val="center"/>
+            <w:tcMar>
+              <w:top w:w="75" w:type="dxa"/>
+              <w:bottom w:w="75" w:type="dxa"/>
+              <w:left w:w="100" w:type="dxa"/>
+              <w:right w:w="100" w:type="dxa"/>
+            </w:tcMar>
+            <w:shd w:fill="F2F5F7"/>
+          </w:tcPr>
+          <w:p>
+            <w:pPr>
+              <w:spacing w:after="0" w:line="247" w:lineRule="auto"/>
+              <w:jc w:val="left"/>
+            </w:pPr>
+            <w:r>
+              <w:rPr>
+                <w:b w:val="0"/>
+                <w:color w:val="000000"/>
+                <w:sz w:val="20"/>
+              </w:rPr>
+              <w:t>Excel, pioli, irrigidimenti e integrazione dei risultati</w:t>
+            </w:r>
+          </w:p>
+        </w:tc>
+        <w:tc>
+          <w:tcPr>
+            <w:tcW w:type="dxa" w:w="1138"/>
+            <w:vAlign w:val="center"/>
+            <w:tcMar>
+              <w:top w:w="75" w:type="dxa"/>
+              <w:bottom w:w="75" w:type="dxa"/>
+              <w:left w:w="100" w:type="dxa"/>
+              <w:right w:w="100" w:type="dxa"/>
+            </w:tcMar>
+            <w:shd w:fill="F2F5F7"/>
+          </w:tcPr>
+          <w:p>
+            <w:pPr>
+              <w:spacing w:after="0" w:line="247" w:lineRule="auto"/>
+              <w:jc w:val="center"/>
+            </w:pPr>
+            <w:r>
+              <w:rPr>
+                <w:b w:val="0"/>
+                <w:color w:val="000000"/>
+                <w:sz w:val="20"/>
+              </w:rPr>
+              <w:t>29–32</w:t>
+            </w:r>
+          </w:p>
+        </w:tc>
+      </w:tr>
+      <w:tr>
+        <w:trPr>
+          <w:cantSplit/>
+        </w:trPr>
+        <w:tc>
+          <w:tcPr>
+            <w:tcW w:type="dxa" w:w="1440"/>
+            <w:vAlign w:val="center"/>
+            <w:tcMar>
+              <w:top w:w="75" w:type="dxa"/>
+              <w:bottom w:w="75" w:type="dxa"/>
+              <w:left w:w="100" w:type="dxa"/>
+              <w:right w:w="100" w:type="dxa"/>
+            </w:tcMar>
+            <w:shd w:fill="FFFFFF"/>
+          </w:tcPr>
+          <w:p>
+            <w:pPr>
+              <w:spacing w:after="0" w:line="247" w:lineRule="auto"/>
+              <w:jc w:val="center"/>
+            </w:pPr>
+            <w:r>
+              <w:rPr>
+                <w:b w:val="0"/>
+                <w:color w:val="000000"/>
+                <w:sz w:val="20"/>
+              </w:rPr>
+              <w:t>32–34</w:t>
+            </w:r>
+          </w:p>
+        </w:tc>
+        <w:tc>
+          <w:tcPr>
+            <w:tcW w:type="dxa" w:w="7416"/>
+            <w:vAlign w:val="center"/>
+            <w:tcMar>
+              <w:top w:w="75" w:type="dxa"/>
+              <w:bottom w:w="75" w:type="dxa"/>
+              <w:left w:w="100" w:type="dxa"/>
+              <w:right w:w="100" w:type="dxa"/>
+            </w:tcMar>
+            <w:shd w:fill="FFFFFF"/>
+          </w:tcPr>
+          <w:p>
+            <w:pPr>
+              <w:spacing w:after="0" w:line="247" w:lineRule="auto"/>
+              <w:jc w:val="left"/>
+            </w:pPr>
+            <w:r>
+              <w:rPr>
+                <w:b w:val="0"/>
+                <w:color w:val="000000"/>
+                <w:sz w:val="20"/>
+              </w:rPr>
+              <w:t>Geometria modulare, conci in Excel e mesh per le fasi</w:t>
+            </w:r>
+          </w:p>
+        </w:tc>
+        <w:tc>
+          <w:tcPr>
+            <w:tcW w:type="dxa" w:w="1138"/>
+            <w:vAlign w:val="center"/>
+            <w:tcMar>
+              <w:top w:w="75" w:type="dxa"/>
+              <w:bottom w:w="75" w:type="dxa"/>
+              <w:left w:w="100" w:type="dxa"/>
+              <w:right w:w="100" w:type="dxa"/>
+            </w:tcMar>
+            <w:shd w:fill="FFFFFF"/>
+          </w:tcPr>
+          <w:p>
+            <w:pPr>
+              <w:spacing w:after="0" w:line="247" w:lineRule="auto"/>
+              <w:jc w:val="center"/>
+            </w:pPr>
+            <w:r>
+              <w:rPr>
+                <w:b w:val="0"/>
+                <w:color w:val="000000"/>
+                <w:sz w:val="20"/>
+              </w:rPr>
+              <w:t>33–35</w:t>
+            </w:r>
+          </w:p>
+        </w:tc>
+      </w:tr>
     </w:tbl>
     <w:p>
       <w:pPr>
@@ -846,15 +1018,7 @@
         <w:rPr>
           <w:b w:val="0"/>
         </w:rPr>
-        <w:t xml:space="preserve"> 20 ottobre 2026, workflow REV003, Simple Bridge e strumenti di modellazione 33–45. Le interfacce precedenti di Build BridGHe Model non sono compatibili con il workflow corrente. La guida distingue controlli offline e analisi Straus.</w:t>
-      </w:r>
-    </w:p>
-    <w:p>
-      <w:r>
-        <w:rPr>
-          <w:b w:val="0"/>
-        </w:rPr>
-        <w:t>Il percorso produce controlli di sezione nel campo implementato. L’esempio usa azioni e coefficienti didattici; le verifiche di ponte ancora necessarie sono indicate nei capitoli 10, 11 e 14.</w:t>
+        <w:t xml:space="preserve"> 26 ottobre 2026. I capitoli 32–34 descrivono il flusso geometrico modulare e l’Excel dei conci prima della mesh. Il 50 REV002 collega il graticcio alle quattro fasi. I controlli offline e le analisi Straus sono distinti.</w:t>
       </w:r>
     </w:p>
     <w:p>
@@ -14884,7 +15048,7 @@
         <w:rPr>
           <w:b w:val="0"/>
         </w:rPr>
-        <w:t xml:space="preserve"> Selezionare un solo ramo e collegarlo a Support Stations di Simple Bridge Solid o Truss. Aumentare il franco per includere l’ingombro delle fondazioni.</w:t>
+        <w:t xml:space="preserve"> Selezionare un solo ramo e collegarlo a Support Stations di Bridge Support Lines, insieme al tracciato. Aumentare il franco per includere l’ingombro delle fondazioni.</w:t>
       </w:r>
     </w:p>
     <w:p>
@@ -14900,15 +15064,15 @@
         <w:pStyle w:val="Heading2"/>
       </w:pPr>
       <w:r>
-        <w:t>Simple Bridge e conci</w:t>
-      </w:r>
-    </w:p>
-    <w:p>
-      <w:r>
-        <w:rPr>
-          <w:b w:val="0"/>
-        </w:rPr>
-        <w:t>Gli esempi 29–32 mostrano traversi pieni o reticolari su ponti rettilinei e curvi. Definire tracciato alla quota superiore dell’impalcato, offsets trasversali, quote degli assi, larghezza, spessore e pendenza trasversale. Le unità sono mm. Bridge Segments definisce giunti comuni o diversi per trave, indipendenti dalle pile.</w:t>
+        <w:t>Flusso modulare e conci</w:t>
+      </w:r>
+    </w:p>
+    <w:p>
+      <w:r>
+        <w:rPr>
+          <w:b w:val="0"/>
+        </w:rPr>
+        <w:t>Gli esempi 29–32 separano Bridge Support Lines, Girder Axes, Slab Layout, Fabrication Segments e Solid o Truss Diaphragms. Bridge Geometry Assembly riunisce le definizioni; Bridge Grillage Mesh le discretizza usando Mesh Settings. Le unità sono mm. Il capitolo 32 descrive il percorso completo, compreso l’Excel dei conci prima della mesh.</w:t>
       </w:r>
     </w:p>
     <w:p>
@@ -14963,13 +15127,25 @@
         <w:rPr>
           <w:b/>
         </w:rPr>
-        <w:t>Bridge Member Assignment</w:t>
-      </w:r>
-      <w:r>
-        <w:rPr>
-          <w:b w:val="0"/>
-        </w:rPr>
-        <w:t xml:space="preserve"> trasforma la geometria in aste con proprietà, assi locali e gruppi. Le proprietà sono abbinate a Families: −1 vale per tutte; 0 trave longitudinale, 1 traverso pieno, 2/3 correnti, 4/5 montanti e diagonali dei traversi, 6 controventi longitudinali, 7 montanti dei controventi.</w:t>
+        <w:t>Bridge FEM Members</w:t>
+      </w:r>
+      <w:r>
+        <w:rPr>
+          <w:b w:val="0"/>
+        </w:rPr>
+        <w:t xml:space="preserve"> trasforma la geometria in aste con proprietà, assi locali e gruppi. Ogni </w:t>
+      </w:r>
+      <w:r>
+        <w:rPr>
+          <w:b/>
+        </w:rPr>
+        <w:t>Bridge Family Property</w:t>
+      </w:r>
+      <w:r>
+        <w:rPr>
+          <w:b w:val="0"/>
+        </w:rPr>
+        <w:t xml:space="preserve"> abbina una proprietà a una famiglia selezionata per nome. All steel families esclude la soletta; DeckTransverse la seleziona esplicitamente. Section Rules riceve le sezioni dei conci o le regole per progressiva.</w:t>
       </w:r>
     </w:p>
     <w:p>
@@ -15421,13 +15597,37 @@
         <w:rPr>
           <w:b/>
         </w:rPr>
-        <w:t>Bridge Connections</w:t>
-      </w:r>
-      <w:r>
-        <w:rPr>
-          <w:b w:val="0"/>
-        </w:rPr>
-        <w:t xml:space="preserve"> mostra i tre modi disponibili. Mode 0 produce link rigidi spaziali nativi Straus; Mode 1 aste deformabili con proprietà Beam/Truss esplicita; Mode 2 copie di travi con offset locali X/Y. In quest’ultimo caso i risultati precedenti vengono cancellati.</w:t>
+        <w:t>Bridge Rigid Links</w:t>
+      </w:r>
+      <w:r>
+        <w:rPr>
+          <w:b w:val="0"/>
+        </w:rPr>
+        <w:t xml:space="preserve"> produce link rigidi spaziali nativi Straus. </w:t>
+      </w:r>
+      <w:r>
+        <w:rPr>
+          <w:b/>
+        </w:rPr>
+        <w:t>Bridge Connection Beams</w:t>
+      </w:r>
+      <w:r>
+        <w:rPr>
+          <w:b w:val="0"/>
+        </w:rPr>
+        <w:t xml:space="preserve"> crea aste deformabili con proprietà Beam/Truss esplicita. </w:t>
+      </w:r>
+      <w:r>
+        <w:rPr>
+          <w:b/>
+        </w:rPr>
+        <w:t>Bridge Beam Offsets</w:t>
+      </w:r>
+      <w:r>
+        <w:rPr>
+          <w:b w:val="0"/>
+        </w:rPr>
+        <w:t xml:space="preserve"> modifica copie delle travi con offset locali X/Y, cancellando i risultati precedenti. Ogni operazione ha un componente distinto.</w:t>
       </w:r>
     </w:p>
     <w:p>
@@ -15531,7 +15731,7 @@
         <w:rPr>
           <w:b w:val="0"/>
         </w:rPr>
-        <w:t xml:space="preserve"> Usare la nuova uscita BG per Member Assignment. Collegare Plates a Build Model e Connection Lines a Bridge Connections scegliendo la meccanica del collegamento.</w:t>
+        <w:t xml:space="preserve"> Usare la nuova uscita BG per Bridge FEM Members. Collegare Plates a Build Model e Connection Lines a Bridge Rigid Links oppure Bridge Connection Beams, secondo la meccanica voluta.</w:t>
       </w:r>
     </w:p>
     <w:p>
@@ -15955,7 +16155,7 @@
         <w:rPr>
           <w:b w:val="0"/>
         </w:rPr>
-        <w:t>. Seguire da sinistra a destra: Simple Bridge, controventi, mesh soletta, assegnazione delle travi, appoggi e connessioni, Build Model, audit e tre snapshot.</w:t>
+        <w:t>. Seguire da sinistra a destra: definizioni geometriche, Geometry Assembly, Grillage Mesh, controventi, mesh soletta, FEM Members, appoggi e connessioni, Build Model, audit e tre snapshot.</w:t>
       </w:r>
     </w:p>
     <w:p>
@@ -16775,7 +16975,7 @@
         <w:rPr>
           <w:b w:val="0"/>
         </w:rPr>
-        <w:t>Bridge Detail Layout disegna pioli e piatti su una geometria Simple Bridge. Non aggiunge rigidezza o elementi FEM. Le stesse definizioni Bridge Studs, Bridge Intermediate Stiffener e Bridge Support Stiffener alimentano il verificatore GPC. Gli intermedi contribuiscono all’idoneità dei pannelli d’anima; gli irrigidimenti d’appoggio ricevono anche una reazione compressiva esplicitamente assegnata.</w:t>
+        <w:t>Bridge Detail Layout disegna pioli e piatti sulla geometria prodotta da Bridge Grillage Mesh. Non aggiunge rigidezza o elementi FEM. Le stesse definizioni Bridge Studs, Bridge Intermediate Stiffener e Bridge Support Stiffener alimentano il verificatore GPC. Gli intermedi contribuiscono all’idoneità dei pannelli d’anima; gli irrigidimenti d’appoggio ricevono anche una reazione compressiva esplicitamente assegnata.</w:t>
       </w:r>
     </w:p>
     <w:tbl>
@@ -17300,7 +17500,7 @@
         <w:rPr>
           <w:b w:val="0"/>
         </w:rPr>
-        <w:t xml:space="preserve"> Aprire il primo GHX. I pannelli gialli collegati agli input sono modificabili. Attivare la preview di Simple Bridge per vedere l’intero ponte; Layout mostra il dettaglio G2.</w:t>
+        <w:t xml:space="preserve"> Aprire il primo GHX. I pannelli gialli collegati agli input sono modificabili. Attivare la preview di Bridge Grillage Mesh per vedere l’intero ponte; Layout mostra il dettaglio G2.</w:t>
       </w:r>
     </w:p>
     <w:p>
@@ -18562,6 +18762,513 @@
         <w:t>Entrambi i file sono verificati mediante soluzione, salvataggio e riapertura in Rhino 8. Il secondo conserva percorsi dell’albero, azioni e strain per ogni stazione. I report validation.json e validation-modello.json distinguono la verifica locale dalla nuova analisi globale: solverInvoked=false.</w:t>
       </w:r>
     </w:p>
+    <w:p>
+      <w:r>
+        <w:br w:type="page"/>
+      </w:r>
+    </w:p>
+    <w:p>
+      <w:pPr>
+        <w:pStyle w:val="Heading1"/>
+      </w:pPr>
+      <w:r>
+        <w:t>32  Costruire il ponte con definizioni separate</w:t>
+      </w:r>
+    </w:p>
+    <w:p>
+      <w:r>
+        <w:rPr>
+          <w:b w:val="0"/>
+        </w:rPr>
+        <w:t>Il flusso geometrico aggiornato usa componenti con una responsabilità precisa. Aprire gli esempi 29–32 per iniziare e il 50 REV002 per il percorso fino alle verifiche. La curva rappresenta il riferimento superiore dell’impalcato; progressive e dimensioni sono in mm.</w:t>
+      </w:r>
+    </w:p>
+    <w:p>
+      <w:pPr>
+        <w:ind w:left="259" w:hanging="259"/>
+      </w:pPr>
+      <w:r>
+        <w:rPr>
+          <w:b w:val="0"/>
+        </w:rPr>
+      </w:r>
+      <w:r>
+        <w:rPr>
+          <w:b/>
+        </w:rPr>
+        <w:t>1.</w:t>
+      </w:r>
+      <w:r>
+        <w:rPr>
+          <w:b w:val="0"/>
+        </w:rPr>
+        <w:t xml:space="preserve"> Collegare la curva a Bridge Support Lines. Support Stations contiene le distanze degli appoggi lungo la curva; vuoto significa entrambi gli estremi. Skew Angles accetta un valore comune o un angolo per appoggio. Il componente posiziona gli appoggi; i vincoli FEM si assegnano dopo.</w:t>
+      </w:r>
+    </w:p>
+    <w:p>
+      <w:pPr>
+        <w:ind w:left="259" w:hanging="259"/>
+      </w:pPr>
+      <w:r>
+        <w:rPr>
+          <w:b w:val="0"/>
+        </w:rPr>
+      </w:r>
+      <w:r>
+        <w:rPr>
+          <w:b/>
+        </w:rPr>
+        <w:t>2.</w:t>
+      </w:r>
+      <w:r>
+        <w:rPr>
+          <w:b w:val="0"/>
+        </w:rPr>
+        <w:t xml:space="preserve"> In Bridge Girder Axes impostare Transverse Offsets crescenti, positivi verso sinistra guardando lungo il tracciato. Axis Levels è una quota negativa rispetto al piano superiore: un valore comune oppure uno per trave. Bridge Regular Girders genera offsets simmetrici da numero e interasse.</w:t>
+      </w:r>
+    </w:p>
+    <w:p>
+      <w:pPr>
+        <w:ind w:left="259" w:hanging="259"/>
+      </w:pPr>
+      <w:r>
+        <w:rPr>
+          <w:b w:val="0"/>
+        </w:rPr>
+      </w:r>
+      <w:r>
+        <w:rPr>
+          <w:b/>
+        </w:rPr>
+        <w:t>3.</w:t>
+      </w:r>
+      <w:r>
+        <w:rPr>
+          <w:b w:val="0"/>
+        </w:rPr>
+        <w:t xml:space="preserve"> Bridge Slab Layout definisce larghezze sinistra/destra, spessore e pendenza trasversale. Una pendenza costante richiede un solo valore; un profilo variabile richiede anche le progressive. Slab Axis Level vuoto colloca gli assi trasversali a metà spessore.</w:t>
+      </w:r>
+    </w:p>
+    <w:p>
+      <w:pPr>
+        <w:ind w:left="259" w:hanging="259"/>
+      </w:pPr>
+      <w:r>
+        <w:rPr>
+          <w:b w:val="0"/>
+        </w:rPr>
+      </w:r>
+      <w:r>
+        <w:rPr>
+          <w:b/>
+        </w:rPr>
+        <w:t>4.</w:t>
+      </w:r>
+      <w:r>
+        <w:rPr>
+          <w:b w:val="0"/>
+        </w:rPr>
+        <w:t xml:space="preserve"> Scegliere Bridge Solid Diaphragms oppure Bridge Truss Diaphragms. Stations esplicite sostituisce il passo automatico; At Supports include le linee di appoggio. Il reticolare aggiunge altezza, pannelli, schema X/V/Warren e collegamento degli incroci.</w:t>
+      </w:r>
+    </w:p>
+    <w:p>
+      <w:pPr>
+        <w:ind w:left="259" w:hanging="259"/>
+      </w:pPr>
+      <w:r>
+        <w:rPr>
+          <w:b w:val="0"/>
+        </w:rPr>
+      </w:r>
+      <w:r>
+        <w:rPr>
+          <w:b/>
+        </w:rPr>
+        <w:t>5.</w:t>
+      </w:r>
+      <w:r>
+        <w:rPr>
+          <w:b w:val="0"/>
+        </w:rPr>
+        <w:t xml:space="preserve"> Preparare i conci come descritto nel capitolo successivo. Collegare tracciato, appoggi, travi, soletta, conci e diaframmi a Bridge Geometry Assembly. L’uscita è una definizione geometrica, ancora senza mesh né proprietà FEM.</w:t>
+      </w:r>
+    </w:p>
+    <w:p>
+      <w:pPr>
+        <w:pStyle w:val="Heading2"/>
+      </w:pPr>
+      <w:r>
+        <w:t>Helper facoltativi</w:t>
+      </w:r>
+    </w:p>
+    <w:p>
+      <w:r>
+        <w:rPr>
+          <w:b w:val="0"/>
+        </w:rPr>
+        <w:t>Bridge Support Stations ordina le distanze, accorpa duplicati entro la tolleranza e può aggiungere appoggi agli estremi o creare campate uguali. Bridge Span Stations e Alignment Curve servono invece a generare un tracciato rettilineo o circolare da campate note. Una curva Rhino può entrare direttamente nei componenti di definizione, senza ricostruire prima le luci.</w:t>
+      </w:r>
+    </w:p>
+    <w:p>
+      <w:r>
+        <w:br w:type="page"/>
+      </w:r>
+    </w:p>
+    <w:p>
+      <w:pPr>
+        <w:pStyle w:val="Heading1"/>
+      </w:pPr>
+      <w:r>
+        <w:t>33  Definire i conci e compilare le sezioni in Excel</w:t>
+      </w:r>
+    </w:p>
+    <w:p>
+      <w:r>
+        <w:rPr>
+          <w:b w:val="0"/>
+        </w:rPr>
+        <w:t>Un concio è una porzione fisica della trave; non coincide necessariamente con una campata o con un elemento FEM. Il suo ID G2-C3 significa terzo concio della seconda trave. Il numero dei conci è disponibile prima della mesh.</w:t>
+      </w:r>
+    </w:p>
+    <w:p>
+      <w:pPr>
+        <w:ind w:left="259" w:hanging="259"/>
+      </w:pPr>
+      <w:r>
+        <w:rPr>
+          <w:b w:val="0"/>
+        </w:rPr>
+      </w:r>
+      <w:r>
+        <w:rPr>
+          <w:b/>
+        </w:rPr>
+        <w:t>1.</w:t>
+      </w:r>
+      <w:r>
+        <w:rPr>
+          <w:b w:val="0"/>
+        </w:rPr>
+        <w:t xml:space="preserve"> Creare uno o più Bridge Joint Stations: Joint Stations contiene le progressive, Girder IDs seleziona le travi interessate. Girder IDs vuoto applica i giunti a tutte le travi. Unire le uscite nell’ingresso Joint Sets di Bridge Fabrication Segments.</w:t>
+      </w:r>
+    </w:p>
+    <w:p>
+      <w:pPr>
+        <w:ind w:left="259" w:hanging="259"/>
+      </w:pPr>
+      <w:r>
+        <w:rPr>
+          <w:b w:val="0"/>
+        </w:rPr>
+      </w:r>
+      <w:r>
+        <w:rPr>
+          <w:b/>
+        </w:rPr>
+        <w:t>2.</w:t>
+      </w:r>
+      <w:r>
+        <w:rPr>
+          <w:b w:val="0"/>
+        </w:rPr>
+        <w:t xml:space="preserve"> Collegare anche Alignment e Girder Axes. Se una trave non ha giunti espliciti, Maximum Segment Length la suddivide in parti uguali non più lunghe del valore assegnato. Zero genera un solo concio. Le progressive esplicite sostituiscono questa suddivisione per la trave interessata.</w:t>
+      </w:r>
+    </w:p>
+    <w:p>
+      <w:pPr>
+        <w:ind w:left="259" w:hanging="259"/>
+      </w:pPr>
+      <w:r>
+        <w:rPr>
+          <w:b w:val="0"/>
+        </w:rPr>
+      </w:r>
+      <w:r>
+        <w:rPr>
+          <w:b/>
+        </w:rPr>
+        <w:t>3.</w:t>
+      </w:r>
+      <w:r>
+        <w:rPr>
+          <w:b w:val="0"/>
+        </w:rPr>
+        <w:t xml:space="preserve"> Leggere Segment Count, Segment IDs, Start Stations, End Stations e Segment Lengths. Collegare Fabrication Plan a Bridge Section Excel Template e premere Run. Il file esistente è protetto, salvo Overwrite esplicitamente abilitato.</w:t>
+      </w:r>
+    </w:p>
+    <w:p>
+      <w:pPr>
+        <w:ind w:left="259" w:hanging="259"/>
+      </w:pPr>
+      <w:r>
+        <w:rPr>
+          <w:b w:val="0"/>
+        </w:rPr>
+      </w:r>
+      <w:r>
+        <w:rPr>
+          <w:b/>
+        </w:rPr>
+        <w:t>4.</w:t>
+      </w:r>
+      <w:r>
+        <w:rPr>
+          <w:b w:val="0"/>
+        </w:rPr>
+        <w:t xml:space="preserve"> Compilare le dimensioni delle sezioni nel foglio Sezioni. Non alterare l’associazione ID/progressive. L’asterisco eredita la dimensione della proprietà base; una cella vuota è un errore. Ricalcolare le formule in Excel e salvare.</w:t>
+      </w:r>
+    </w:p>
+    <w:p>
+      <w:pPr>
+        <w:ind w:left="259" w:hanging="259"/>
+      </w:pPr>
+      <w:r>
+        <w:rPr>
+          <w:b w:val="0"/>
+        </w:rPr>
+      </w:r>
+      <w:r>
+        <w:rPr>
+          <w:b/>
+        </w:rPr>
+        <w:t>5.</w:t>
+      </w:r>
+      <w:r>
+        <w:rPr>
+          <w:b w:val="0"/>
+        </w:rPr>
+        <w:t xml:space="preserve"> Usare Bridge Read Section Excel con lo stesso piano e lo stesso percorso. Premere Run e collegare Section Table a Bridge Segment Sections, insieme a Fabrication Plan e Base Property. Il lettore conserva la tabella importata e non rilegge il disco a ogni soluzione GH.</w:t>
+      </w:r>
+    </w:p>
+    <w:p>
+      <w:pPr>
+        <w:ind w:left="259" w:hanging="259"/>
+      </w:pPr>
+      <w:r>
+        <w:rPr>
+          <w:b w:val="0"/>
+        </w:rPr>
+      </w:r>
+      <w:r>
+        <w:rPr>
+          <w:b/>
+        </w:rPr>
+        <w:t>6.</w:t>
+      </w:r>
+      <w:r>
+        <w:rPr>
+          <w:b w:val="0"/>
+        </w:rPr>
+        <w:t xml:space="preserve"> Dopo una modifica ai giunti, creare o riallineare consapevolmente la tabella. Il lettore rifiuta ID o intervalli obsoleti; una semplice modifica della mesh lascia invece validi i conci e le sezioni.</w:t>
+      </w:r>
+    </w:p>
+    <w:p>
+      <w:pPr>
+        <w:pStyle w:val="Heading2"/>
+      </w:pPr>
+      <w:r>
+        <w:t>Quote e proprietà</w:t>
+      </w:r>
+    </w:p>
+    <w:p>
+      <w:r>
+        <w:rPr>
+          <w:b w:val="0"/>
+        </w:rPr>
+        <w:t>Top Offsets espone la distanza fra baricentro e ala superiore. La modifica dell’altezza di una sezione non sposta automaticamente gli assi della carpenteria: aggiornare Axis Levels o applicare offset espliciti coerenti. Le proprietà omogeneizzate delle fasi non devono spostare i nodi tra un’analisi e l’altra.</w:t>
+      </w:r>
+    </w:p>
+    <w:p>
+      <w:r>
+        <w:rPr>
+          <w:b w:val="0"/>
+        </w:rPr>
+        <w:t>Bridge Joint Tree e Crossfall Table sono helper per importare alberi già organizzati. Per l’inserimento manuale preferire Joint Stations e le liste esplicite della soletta.</w:t>
+      </w:r>
+    </w:p>
+    <w:p>
+      <w:r>
+        <w:br w:type="page"/>
+      </w:r>
+    </w:p>
+    <w:p>
+      <w:pPr>
+        <w:pStyle w:val="Heading1"/>
+      </w:pPr>
+      <w:r>
+        <w:t>34  Generare la mesh e collegarla alle fasi</w:t>
+      </w:r>
+    </w:p>
+    <w:p>
+      <w:pPr>
+        <w:ind w:left="259" w:hanging="259"/>
+      </w:pPr>
+      <w:r>
+        <w:rPr>
+          <w:b w:val="0"/>
+        </w:rPr>
+      </w:r>
+      <w:r>
+        <w:rPr>
+          <w:b/>
+        </w:rPr>
+        <w:t>1.</w:t>
+      </w:r>
+      <w:r>
+        <w:rPr>
+          <w:b w:val="0"/>
+        </w:rPr>
+        <w:t xml:space="preserve"> Bridge Mesh Settings controlla Maximum Element Length, Chord Tolerance e la discretizzazione trasversale della soletta. Slab Beam Spacing=0 usa tutte le stazioni raffinate; Slab Beam Stations permette progressive esplicite.</w:t>
+      </w:r>
+    </w:p>
+    <w:p>
+      <w:pPr>
+        <w:ind w:left="259" w:hanging="259"/>
+      </w:pPr>
+      <w:r>
+        <w:rPr>
+          <w:b w:val="0"/>
+        </w:rPr>
+      </w:r>
+      <w:r>
+        <w:rPr>
+          <w:b/>
+        </w:rPr>
+        <w:t>2.</w:t>
+      </w:r>
+      <w:r>
+        <w:rPr>
+          <w:b w:val="0"/>
+        </w:rPr>
+        <w:t xml:space="preserve"> Collegare Bridge Definition e Mesh Settings a Bridge Grillage Mesh. Un solo motore spezza le travi agli attacchi della soletta, ai conci, ai diaframmi e agli appoggi, conservando gli ID dei conci. Usare Bridge Geometry per la carpenteria e Grillage Geometry quando occorrono anche le aste della soletta.</w:t>
+      </w:r>
+    </w:p>
+    <w:p>
+      <w:pPr>
+        <w:ind w:left="259" w:hanging="259"/>
+      </w:pPr>
+      <w:r>
+        <w:rPr>
+          <w:b w:val="0"/>
+        </w:rPr>
+      </w:r>
+      <w:r>
+        <w:rPr>
+          <w:b/>
+        </w:rPr>
+        <w:t>3.</w:t>
+      </w:r>
+      <w:r>
+        <w:rPr>
+          <w:b w:val="0"/>
+        </w:rPr>
+        <w:t xml:space="preserve"> Bridge Family Property associa una proprietà a una famiglia scelta per nome. Collegare le definizioni a Bridge FEM Members insieme alle Section Rules. All steel families esclude la soletta. Verificare che Unassigned sia vuoto prima di costruire il modello.</w:t>
+      </w:r>
+    </w:p>
+    <w:p>
+      <w:pPr>
+        <w:ind w:left="259" w:hanging="259"/>
+      </w:pPr>
+      <w:r>
+        <w:rPr>
+          <w:b w:val="0"/>
+        </w:rPr>
+      </w:r>
+      <w:r>
+        <w:rPr>
+          <w:b/>
+        </w:rPr>
+        <w:t>4.</w:t>
+      </w:r>
+      <w:r>
+        <w:rPr>
+          <w:b w:val="0"/>
+        </w:rPr>
+        <w:t xml:space="preserve"> Assegnare Bridge Bearings ai punti di appoggio. Collegare Deck Connections a Bridge Rigid Links per vincoli cinematici nativi, oppure a Bridge Connection Beams per una rigidezza esplicita. Bridge Beam Offsets tratta separatamente gli offset locali. Non duplicare la stessa connessione con più rappresentazioni.</w:t>
+      </w:r>
+    </w:p>
+    <w:p>
+      <w:pPr>
+        <w:ind w:left="259" w:hanging="259"/>
+      </w:pPr>
+      <w:r>
+        <w:rPr>
+          <w:b w:val="0"/>
+        </w:rPr>
+      </w:r>
+      <w:r>
+        <w:rPr>
+          <w:b/>
+        </w:rPr>
+        <w:t>5.</w:t>
+      </w:r>
+      <w:r>
+        <w:rPr>
+          <w:b w:val="0"/>
+        </w:rPr>
+        <w:t xml:space="preserve"> Nel 50, costruire M0 in acciaio e poi le varianti n infinito, n0 e n ritiro sulla stessa geometria. Il REV002 classifica le aste sotto Dead e applica stati fessurato/non fessurato ai due modelli meccanici. Il ritiro resta non fessurato, per l’ipotesi dichiarata nell’esempio.</w:t>
+      </w:r>
+    </w:p>
+    <w:p>
+      <w:pPr>
+        <w:ind w:left="259" w:hanging="259"/>
+      </w:pPr>
+      <w:r>
+        <w:rPr>
+          <w:b w:val="0"/>
+        </w:rPr>
+      </w:r>
+      <w:r>
+        <w:rPr>
+          <w:b/>
+        </w:rPr>
+        <w:t>6.</w:t>
+      </w:r>
+      <w:r>
+        <w:rPr>
+          <w:b w:val="0"/>
+        </w:rPr>
+        <w:t xml:space="preserve"> Condividere i riferimenti dei casi fra Bridge Action e Bridge Analysis Cases. Quest’ultimo riceve il modello prima dell’analisi e verifica i nomi; la sua uscita va in Analysis Results di Straus. Così i casi richiesti dal verificatore vengono restituiti anche se si selezionano ulteriori combinazioni.</w:t>
+      </w:r>
+    </w:p>
+    <w:p>
+      <w:pPr>
+        <w:ind w:left="259" w:hanging="259"/>
+      </w:pPr>
+      <w:r>
+        <w:rPr>
+          <w:b w:val="0"/>
+        </w:rPr>
+      </w:r>
+      <w:r>
+        <w:rPr>
+          <w:b/>
+        </w:rPr>
+        <w:t>7.</w:t>
+      </w:r>
+      <w:r>
+        <w:rPr>
+          <w:b w:val="0"/>
+        </w:rPr>
+        <w:t xml:space="preserve"> Dopo le analisi, eseguire Build BridGHe Model, Super Element Check e i controlli dei dettagli. Controllare risultati, grafici e input del report. La verifica delle travi principali mantiene l’ipotesi N–Mx–Vy; T, M2 e V1 non entrano nelle verifiche di sezione.</w:t>
+      </w:r>
+    </w:p>
+    <w:p>
+      <w:pPr>
+        <w:pStyle w:val="Heading2"/>
+      </w:pPr>
+      <w:r>
+        <w:t>Controlli e documenti di prova</w:t>
+      </w:r>
+    </w:p>
+    <w:p>
+      <w:r>
+        <w:rPr>
+          <w:b w:val="0"/>
+        </w:rPr>
+        <w:t>La migrazione confronta geometria, appoggi, conci e collegamenti dei file salvati. I benchmark nativi distinguono esportazione, soluzione FEM e controlli di sezione. Consultare docs/FLUSSO-MODULARE.md e i report di validazione per l’elenco delle prove effettivamente eseguite; la riapertura di un GHX non costituisce una verifica strutturale completa.</w:t>
+      </w:r>
+    </w:p>
     <w:sectPr>
       <w:headerReference w:type="default" r:id="rId9"/>
       <w:footerReference w:type="default" r:id="rId10"/>
@@ -18585,7 +19292,7 @@
       <w:rPr>
         <w:sz w:val="18"/>
       </w:rPr>
-      <w:t xml:space="preserve">20 ottobre 2026   •   </w:t>
+      <w:t xml:space="preserve">26 ottobre 2026   •   </w:t>
     </w:r>
     <w:fldSimple w:instr="PAGE"/>
   </w:p>

</xml_diff>